<commit_message>
work on conference paper
</commit_message>
<xml_diff>
--- a/knowledgebase/conference_papers/wip/Тези_Українець_ІТОНТ.docx
+++ b/knowledgebase/conference_papers/wip/Тези_Українець_ІТОНТ.docx
@@ -671,63 +671,15 @@
           <w:szCs w:val="24"/>
           <w:lang w:val="uk-UA" w:eastAsia="en-US"/>
         </w:rPr>
-        <w:t xml:space="preserve">Під навігацією в широкому сенсі розуміють слідування рухомого об’єкта заданій траєкторії </w:t>
-      </w:r>
-      <w:r>
-        <w:rPr>
-          <w:rFonts w:ascii="Times New Roman CYR" w:hAnsi="Times New Roman CYR" w:cs="Times New Roman CYR"/>
-          <w:szCs w:val="24"/>
-          <w:lang w:val="uk-UA" w:eastAsia="en-US"/>
-        </w:rPr>
-        <w:t>в відповідності з визначеною пр</w:t>
-      </w:r>
-      <w:r>
-        <w:rPr>
-          <w:rFonts w:ascii="Times New Roman CYR" w:hAnsi="Times New Roman CYR" w:cs="Times New Roman CYR"/>
-          <w:szCs w:val="24"/>
-          <w:lang w:val="uk-UA" w:eastAsia="en-US"/>
-        </w:rPr>
-        <w:t>ограмою руху. Ефективність</w:t>
-      </w:r>
-      <w:r>
-        <w:rPr>
-          <w:rFonts w:ascii="Times New Roman CYR" w:hAnsi="Times New Roman CYR" w:cs="Times New Roman CYR"/>
-          <w:szCs w:val="24"/>
-          <w:lang w:val="uk-UA" w:eastAsia="en-US"/>
-        </w:rPr>
-        <w:t xml:space="preserve"> виконання завдань покладених на безпілотне повітряне судно (БПС) </w:t>
-      </w:r>
-      <w:r>
-        <w:rPr>
-          <w:rFonts w:ascii="Times New Roman CYR" w:hAnsi="Times New Roman CYR" w:cs="Times New Roman CYR"/>
-          <w:szCs w:val="24"/>
-          <w:lang w:val="uk-UA" w:eastAsia="en-US"/>
-        </w:rPr>
-        <w:t xml:space="preserve">повною мірою залежить від </w:t>
-      </w:r>
-      <w:r>
-        <w:rPr>
-          <w:rFonts w:ascii="Times New Roman CYR" w:hAnsi="Times New Roman CYR" w:cs="Times New Roman CYR"/>
-          <w:szCs w:val="24"/>
-          <w:lang w:val="uk-UA" w:eastAsia="en-US"/>
-        </w:rPr>
-        <w:t>навігаційного забезпечення, яке</w:t>
-      </w:r>
-      <w:r>
-        <w:rPr>
-          <w:rFonts w:ascii="Times New Roman CYR" w:hAnsi="Times New Roman CYR" w:cs="Times New Roman CYR"/>
-          <w:szCs w:val="24"/>
-          <w:lang w:val="uk-UA" w:eastAsia="en-US"/>
-        </w:rPr>
-        <w:t xml:space="preserve"> в загальному випадку</w:t>
-      </w:r>
-      <w:r>
-        <w:rPr>
-          <w:rFonts w:ascii="Times New Roman CYR" w:hAnsi="Times New Roman CYR" w:cs="Times New Roman CYR"/>
-          <w:szCs w:val="24"/>
-          <w:lang w:val="uk-UA" w:eastAsia="en-US"/>
-        </w:rPr>
-        <w:t xml:space="preserve"> вирішує два </w:t>
+        <w:t>Наразі безпілотні повітряні судна</w:t>
+      </w:r>
+      <w:r>
+        <w:rPr>
+          <w:rFonts w:ascii="Times New Roman CYR" w:hAnsi="Times New Roman CYR" w:cs="Times New Roman CYR"/>
+          <w:szCs w:val="24"/>
+          <w:lang w:val="uk-UA" w:eastAsia="en-US"/>
+        </w:rPr>
+        <w:t xml:space="preserve"> (БПС) у складі безпілотних авіаційних комплексів (</w:t>
       </w:r>
       <w:proofErr w:type="spellStart"/>
       <w:r>
@@ -736,7 +688,7 @@
           <w:szCs w:val="24"/>
           <w:lang w:val="uk-UA" w:eastAsia="en-US"/>
         </w:rPr>
-        <w:t>підзавдання</w:t>
+        <w:t>БпАК</w:t>
       </w:r>
       <w:proofErr w:type="spellEnd"/>
       <w:r>
@@ -745,34 +697,146 @@
           <w:szCs w:val="24"/>
           <w:lang w:val="uk-UA" w:eastAsia="en-US"/>
         </w:rPr>
-        <w:t xml:space="preserve">: </w:t>
-      </w:r>
-      <w:r>
-        <w:rPr>
-          <w:rFonts w:ascii="Times New Roman CYR" w:hAnsi="Times New Roman CYR" w:cs="Times New Roman CYR"/>
-          <w:szCs w:val="24"/>
-          <w:lang w:val="uk-UA" w:eastAsia="en-US"/>
-        </w:rPr>
-        <w:t xml:space="preserve">планування маршруту руху та контроль його дотримання. </w:t>
-      </w:r>
-      <w:r>
-        <w:rPr>
-          <w:rFonts w:ascii="Times New Roman CYR" w:hAnsi="Times New Roman CYR" w:cs="Times New Roman CYR"/>
-          <w:szCs w:val="24"/>
-          <w:lang w:val="uk-UA" w:eastAsia="en-US"/>
-        </w:rPr>
-        <w:t xml:space="preserve">Планування маршруту руху є важливим етапом, так як від його результатів </w:t>
-      </w:r>
-      <w:r>
-        <w:rPr>
-          <w:rFonts w:ascii="Times New Roman CYR" w:hAnsi="Times New Roman CYR" w:cs="Times New Roman CYR"/>
-          <w:szCs w:val="24"/>
-          <w:lang w:val="uk-UA" w:eastAsia="en-US"/>
-        </w:rPr>
-        <w:t xml:space="preserve">напряму залежить результат виконання завдання. </w:t>
-      </w:r>
-      <w:bookmarkStart w:id="0" w:name="_GoBack"/>
-      <w:bookmarkEnd w:id="0"/>
+        <w:t>)</w:t>
+      </w:r>
+      <w:r>
+        <w:rPr>
+          <w:rFonts w:ascii="Times New Roman CYR" w:hAnsi="Times New Roman CYR" w:cs="Times New Roman CYR"/>
+          <w:szCs w:val="24"/>
+          <w:lang w:val="uk-UA" w:eastAsia="en-US"/>
+        </w:rPr>
+        <w:t xml:space="preserve"> широко застосовуються для </w:t>
+      </w:r>
+      <w:r>
+        <w:rPr>
+          <w:rFonts w:ascii="Times New Roman CYR" w:hAnsi="Times New Roman CYR" w:cs="Times New Roman CYR"/>
+          <w:szCs w:val="24"/>
+          <w:lang w:val="uk-UA" w:eastAsia="en-US"/>
+        </w:rPr>
+        <w:t>дистанційного зондування, моніторингу, координації дій, доставки вантажів</w:t>
+      </w:r>
+      <w:r>
+        <w:rPr>
+          <w:rFonts w:ascii="Times New Roman CYR" w:hAnsi="Times New Roman CYR" w:cs="Times New Roman CYR"/>
+          <w:szCs w:val="24"/>
+          <w:lang w:val="uk-UA" w:eastAsia="en-US"/>
+        </w:rPr>
+        <w:t xml:space="preserve">. </w:t>
+      </w:r>
+      <w:r>
+        <w:rPr>
+          <w:rFonts w:ascii="Times New Roman CYR" w:hAnsi="Times New Roman CYR" w:cs="Times New Roman CYR"/>
+          <w:szCs w:val="24"/>
+          <w:lang w:val="uk-UA" w:eastAsia="en-US"/>
+        </w:rPr>
+        <w:t xml:space="preserve">Їхні можливості дозволяють зменшувати </w:t>
+      </w:r>
+      <w:r>
+        <w:rPr>
+          <w:rFonts w:ascii="Times New Roman CYR" w:hAnsi="Times New Roman CYR" w:cs="Times New Roman CYR"/>
+          <w:szCs w:val="24"/>
+          <w:lang w:val="uk-UA" w:eastAsia="en-US"/>
+        </w:rPr>
+        <w:t xml:space="preserve">ризики, </w:t>
+      </w:r>
+      <w:r>
+        <w:rPr>
+          <w:rFonts w:ascii="Times New Roman CYR" w:hAnsi="Times New Roman CYR" w:cs="Times New Roman CYR"/>
+          <w:szCs w:val="24"/>
+          <w:lang w:val="uk-UA" w:eastAsia="en-US"/>
+        </w:rPr>
+        <w:t>оптимізувати</w:t>
+      </w:r>
+      <w:r>
+        <w:rPr>
+          <w:rFonts w:ascii="Times New Roman CYR" w:hAnsi="Times New Roman CYR" w:cs="Times New Roman CYR"/>
+          <w:szCs w:val="24"/>
+          <w:lang w:val="uk-UA" w:eastAsia="en-US"/>
+        </w:rPr>
+        <w:t xml:space="preserve"> використання ресурсів </w:t>
+      </w:r>
+      <w:r>
+        <w:rPr>
+          <w:rFonts w:ascii="Times New Roman CYR" w:hAnsi="Times New Roman CYR" w:cs="Times New Roman CYR"/>
+          <w:szCs w:val="24"/>
+          <w:lang w:val="uk-UA" w:eastAsia="en-US"/>
+        </w:rPr>
+        <w:t xml:space="preserve">та підвищувати </w:t>
+      </w:r>
+      <w:r>
+        <w:rPr>
+          <w:rFonts w:ascii="Times New Roman CYR" w:hAnsi="Times New Roman CYR" w:cs="Times New Roman CYR"/>
+          <w:szCs w:val="24"/>
+          <w:lang w:val="uk-UA" w:eastAsia="en-US"/>
+        </w:rPr>
+        <w:t xml:space="preserve">ефективність виконання завдань. </w:t>
+      </w:r>
+      <w:r>
+        <w:rPr>
+          <w:lang w:val="uk-UA"/>
+        </w:rPr>
+        <w:t xml:space="preserve">Завдяки </w:t>
+      </w:r>
+      <w:r>
+        <w:rPr>
+          <w:lang w:val="uk-UA"/>
+        </w:rPr>
+        <w:t>цьому,</w:t>
+      </w:r>
+      <w:r>
+        <w:rPr>
+          <w:lang w:val="uk-UA"/>
+        </w:rPr>
+        <w:t xml:space="preserve"> БПС є ефективними та доцільними для застосування в несприятливих умовах</w:t>
+      </w:r>
+      <w:r>
+        <w:rPr>
+          <w:lang w:val="uk-UA"/>
+        </w:rPr>
+        <w:t xml:space="preserve"> </w:t>
+      </w:r>
+      <w:r>
+        <w:rPr>
+          <w:lang w:val="en-US"/>
+        </w:rPr>
+        <w:t>[</w:t>
+      </w:r>
+      <w:r>
+        <w:rPr>
+          <w:lang w:val="uk-UA"/>
+        </w:rPr>
+        <w:t>моя стаття</w:t>
+      </w:r>
+      <w:r>
+        <w:rPr>
+          <w:lang w:val="uk-UA"/>
+        </w:rPr>
+        <w:t xml:space="preserve"> 1</w:t>
+      </w:r>
+      <w:r>
+        <w:rPr>
+          <w:lang w:val="en-US"/>
+        </w:rPr>
+        <w:t>]</w:t>
+      </w:r>
+      <w:r>
+        <w:rPr>
+          <w:lang w:val="uk-UA"/>
+        </w:rPr>
+        <w:t>, які мають місце під час ліквідацій наслідків</w:t>
+      </w:r>
+      <w:r>
+        <w:rPr>
+          <w:lang w:val="uk-UA"/>
+        </w:rPr>
+        <w:t xml:space="preserve"> надзвичайних ситуацій, </w:t>
+      </w:r>
+      <w:r>
+        <w:rPr>
+          <w:lang w:val="uk-UA"/>
+        </w:rPr>
+        <w:t>природніх лих техногенних катастроф тощо.</w:t>
+      </w:r>
     </w:p>
     <w:p>
       <w:pPr>
@@ -781,28 +845,353 @@
         <w:jc w:val="both"/>
         <w:rPr>
           <w:rFonts w:ascii="Times New Roman CYR" w:hAnsi="Times New Roman CYR" w:cs="Times New Roman CYR"/>
-          <w:color w:val="000000"/>
-          <w:szCs w:val="24"/>
-          <w:lang w:val="uk-UA" w:eastAsia="en-US"/>
-        </w:rPr>
-      </w:pPr>
-      <w:r>
-        <w:rPr>
-          <w:rFonts w:ascii="Times New Roman CYR" w:hAnsi="Times New Roman CYR" w:cs="Times New Roman CYR"/>
-          <w:b/>
-          <w:bCs/>
-          <w:szCs w:val="24"/>
-          <w:lang w:val="uk-UA" w:eastAsia="en-US"/>
-        </w:rPr>
-        <w:t>Мета роботи</w:t>
-      </w:r>
-      <w:r>
-        <w:rPr>
-          <w:rFonts w:ascii="Times New Roman CYR" w:hAnsi="Times New Roman CYR" w:cs="Times New Roman CYR"/>
-          <w:szCs w:val="24"/>
-          <w:lang w:val="uk-UA" w:eastAsia="en-US"/>
-        </w:rPr>
-        <w:t xml:space="preserve">. </w:t>
+          <w:szCs w:val="24"/>
+          <w:lang w:val="en-US" w:eastAsia="en-US"/>
+        </w:rPr>
+      </w:pPr>
+      <w:r>
+        <w:rPr>
+          <w:rFonts w:ascii="Times New Roman CYR" w:hAnsi="Times New Roman CYR" w:cs="Times New Roman CYR"/>
+          <w:szCs w:val="24"/>
+          <w:lang w:val="uk-UA" w:eastAsia="en-US"/>
+        </w:rPr>
+        <w:t>Ефективність</w:t>
+      </w:r>
+      <w:r>
+        <w:rPr>
+          <w:rFonts w:ascii="Times New Roman CYR" w:hAnsi="Times New Roman CYR" w:cs="Times New Roman CYR"/>
+          <w:szCs w:val="24"/>
+          <w:lang w:val="uk-UA" w:eastAsia="en-US"/>
+        </w:rPr>
+        <w:t xml:space="preserve"> виконання завдань покладених на </w:t>
+      </w:r>
+      <w:r>
+        <w:rPr>
+          <w:rFonts w:ascii="Times New Roman CYR" w:hAnsi="Times New Roman CYR" w:cs="Times New Roman CYR"/>
+          <w:szCs w:val="24"/>
+          <w:lang w:val="uk-UA" w:eastAsia="en-US"/>
+        </w:rPr>
+        <w:t>БПС</w:t>
+      </w:r>
+      <w:r>
+        <w:rPr>
+          <w:rFonts w:ascii="Times New Roman CYR" w:hAnsi="Times New Roman CYR" w:cs="Times New Roman CYR"/>
+          <w:szCs w:val="24"/>
+          <w:lang w:val="uk-UA" w:eastAsia="en-US"/>
+        </w:rPr>
+        <w:t xml:space="preserve"> </w:t>
+      </w:r>
+      <w:r>
+        <w:rPr>
+          <w:rFonts w:ascii="Times New Roman CYR" w:hAnsi="Times New Roman CYR" w:cs="Times New Roman CYR"/>
+          <w:szCs w:val="24"/>
+          <w:lang w:val="uk-UA" w:eastAsia="en-US"/>
+        </w:rPr>
+        <w:t xml:space="preserve">залежить від </w:t>
+      </w:r>
+      <w:r>
+        <w:rPr>
+          <w:rFonts w:ascii="Times New Roman CYR" w:hAnsi="Times New Roman CYR" w:cs="Times New Roman CYR"/>
+          <w:szCs w:val="24"/>
+          <w:lang w:val="uk-UA" w:eastAsia="en-US"/>
+        </w:rPr>
+        <w:t>навігаційного забезпечення, яке</w:t>
+      </w:r>
+      <w:r>
+        <w:rPr>
+          <w:rFonts w:ascii="Times New Roman CYR" w:hAnsi="Times New Roman CYR" w:cs="Times New Roman CYR"/>
+          <w:szCs w:val="24"/>
+          <w:lang w:val="uk-UA" w:eastAsia="en-US"/>
+        </w:rPr>
+        <w:t xml:space="preserve"> в загальному випадку</w:t>
+      </w:r>
+      <w:r>
+        <w:rPr>
+          <w:rFonts w:ascii="Times New Roman CYR" w:hAnsi="Times New Roman CYR" w:cs="Times New Roman CYR"/>
+          <w:szCs w:val="24"/>
+          <w:lang w:val="uk-UA" w:eastAsia="en-US"/>
+        </w:rPr>
+        <w:t xml:space="preserve"> вирішує два </w:t>
+      </w:r>
+      <w:proofErr w:type="spellStart"/>
+      <w:r>
+        <w:rPr>
+          <w:rFonts w:ascii="Times New Roman CYR" w:hAnsi="Times New Roman CYR" w:cs="Times New Roman CYR"/>
+          <w:szCs w:val="24"/>
+          <w:lang w:val="uk-UA" w:eastAsia="en-US"/>
+        </w:rPr>
+        <w:t>підзавдання</w:t>
+      </w:r>
+      <w:proofErr w:type="spellEnd"/>
+      <w:r>
+        <w:rPr>
+          <w:rFonts w:ascii="Times New Roman CYR" w:hAnsi="Times New Roman CYR" w:cs="Times New Roman CYR"/>
+          <w:szCs w:val="24"/>
+          <w:lang w:val="uk-UA" w:eastAsia="en-US"/>
+        </w:rPr>
+        <w:t xml:space="preserve">: </w:t>
+      </w:r>
+      <w:r>
+        <w:rPr>
+          <w:rFonts w:ascii="Times New Roman CYR" w:hAnsi="Times New Roman CYR" w:cs="Times New Roman CYR"/>
+          <w:szCs w:val="24"/>
+          <w:lang w:val="uk-UA" w:eastAsia="en-US"/>
+        </w:rPr>
+        <w:t xml:space="preserve">планування маршруту руху та контроль його дотримання. </w:t>
+      </w:r>
+      <w:r>
+        <w:rPr>
+          <w:rFonts w:ascii="Times New Roman CYR" w:hAnsi="Times New Roman CYR" w:cs="Times New Roman CYR"/>
+          <w:szCs w:val="24"/>
+          <w:lang w:val="uk-UA" w:eastAsia="en-US"/>
+        </w:rPr>
+        <w:t xml:space="preserve">Планування маршруту руху є важливим етапом, так як від його результатів </w:t>
+      </w:r>
+      <w:r>
+        <w:rPr>
+          <w:rFonts w:ascii="Times New Roman CYR" w:hAnsi="Times New Roman CYR" w:cs="Times New Roman CYR"/>
+          <w:szCs w:val="24"/>
+          <w:lang w:val="uk-UA" w:eastAsia="en-US"/>
+        </w:rPr>
+        <w:t>прямо</w:t>
+      </w:r>
+      <w:r>
+        <w:rPr>
+          <w:rFonts w:ascii="Times New Roman CYR" w:hAnsi="Times New Roman CYR" w:cs="Times New Roman CYR"/>
+          <w:szCs w:val="24"/>
+          <w:lang w:val="uk-UA" w:eastAsia="en-US"/>
+        </w:rPr>
+        <w:t xml:space="preserve"> залежить результат виконання завдання. </w:t>
+      </w:r>
+      <w:r>
+        <w:rPr>
+          <w:rFonts w:ascii="Times New Roman CYR" w:hAnsi="Times New Roman CYR" w:cs="Times New Roman CYR"/>
+          <w:szCs w:val="24"/>
+          <w:lang w:val="uk-UA" w:eastAsia="en-US"/>
+        </w:rPr>
+        <w:t xml:space="preserve">Одним з найбільш поширених </w:t>
+      </w:r>
+      <w:r>
+        <w:rPr>
+          <w:rFonts w:ascii="Times New Roman CYR" w:hAnsi="Times New Roman CYR" w:cs="Times New Roman CYR"/>
+          <w:szCs w:val="24"/>
+          <w:lang w:val="uk-UA" w:eastAsia="en-US"/>
+        </w:rPr>
+        <w:lastRenderedPageBreak/>
+        <w:t xml:space="preserve">підходів до планування маршруту руху БПС в складі </w:t>
+      </w:r>
+      <w:proofErr w:type="spellStart"/>
+      <w:r>
+        <w:rPr>
+          <w:rFonts w:ascii="Times New Roman CYR" w:hAnsi="Times New Roman CYR" w:cs="Times New Roman CYR"/>
+          <w:szCs w:val="24"/>
+          <w:lang w:val="uk-UA" w:eastAsia="en-US"/>
+        </w:rPr>
+        <w:t>БпАК</w:t>
+      </w:r>
+      <w:proofErr w:type="spellEnd"/>
+      <w:r>
+        <w:rPr>
+          <w:rFonts w:ascii="Times New Roman CYR" w:hAnsi="Times New Roman CYR" w:cs="Times New Roman CYR"/>
+          <w:szCs w:val="24"/>
+          <w:lang w:val="uk-UA" w:eastAsia="en-US"/>
+        </w:rPr>
+        <w:t xml:space="preserve"> є ручна побудова маршруту</w:t>
+      </w:r>
+      <w:r>
+        <w:rPr>
+          <w:rFonts w:ascii="Times New Roman CYR" w:hAnsi="Times New Roman CYR" w:cs="Times New Roman CYR"/>
+          <w:szCs w:val="24"/>
+          <w:lang w:val="uk-UA" w:eastAsia="en-US"/>
+        </w:rPr>
+        <w:t xml:space="preserve"> в програмному забезпеченні наземної станції</w:t>
+      </w:r>
+      <w:r>
+        <w:rPr>
+          <w:rFonts w:ascii="Times New Roman CYR" w:hAnsi="Times New Roman CYR" w:cs="Times New Roman CYR"/>
+          <w:szCs w:val="24"/>
+          <w:lang w:val="uk-UA" w:eastAsia="en-US"/>
+        </w:rPr>
+        <w:t xml:space="preserve"> на основі </w:t>
+      </w:r>
+      <w:r>
+        <w:rPr>
+          <w:rFonts w:ascii="Times New Roman CYR" w:hAnsi="Times New Roman CYR" w:cs="Times New Roman CYR"/>
+          <w:szCs w:val="24"/>
+          <w:lang w:val="uk-UA" w:eastAsia="en-US"/>
+        </w:rPr>
+        <w:t xml:space="preserve">знань та досвіду оператора. </w:t>
+      </w:r>
+      <w:r>
+        <w:rPr>
+          <w:rFonts w:ascii="Times New Roman CYR" w:hAnsi="Times New Roman CYR" w:cs="Times New Roman CYR"/>
+          <w:szCs w:val="24"/>
+          <w:lang w:val="uk-UA" w:eastAsia="en-US"/>
+        </w:rPr>
+        <w:t xml:space="preserve">Проте такий підхід вимагає врахування </w:t>
+      </w:r>
+      <w:r>
+        <w:rPr>
+          <w:rFonts w:ascii="Times New Roman CYR" w:hAnsi="Times New Roman CYR" w:cs="Times New Roman CYR"/>
+          <w:szCs w:val="24"/>
+          <w:lang w:val="uk-UA" w:eastAsia="en-US"/>
+        </w:rPr>
+        <w:t xml:space="preserve">оператором </w:t>
+      </w:r>
+      <w:r>
+        <w:rPr>
+          <w:rFonts w:ascii="Times New Roman CYR" w:hAnsi="Times New Roman CYR" w:cs="Times New Roman CYR"/>
+          <w:szCs w:val="24"/>
+          <w:lang w:val="uk-UA" w:eastAsia="en-US"/>
+        </w:rPr>
+        <w:t xml:space="preserve">великої кількості </w:t>
+      </w:r>
+      <w:r>
+        <w:rPr>
+          <w:rFonts w:ascii="Times New Roman CYR" w:hAnsi="Times New Roman CYR" w:cs="Times New Roman CYR"/>
+          <w:szCs w:val="24"/>
+          <w:lang w:val="uk-UA" w:eastAsia="en-US"/>
+        </w:rPr>
+        <w:t xml:space="preserve">даних та умов, що робить результати планування вразливими до помилок та недоліків. </w:t>
+      </w:r>
+      <w:r>
+        <w:rPr>
+          <w:rFonts w:ascii="Times New Roman CYR" w:hAnsi="Times New Roman CYR" w:cs="Times New Roman CYR"/>
+          <w:szCs w:val="24"/>
+          <w:lang w:val="uk-UA" w:eastAsia="en-US"/>
+        </w:rPr>
+        <w:t>В умовах критичних ситуацій помил</w:t>
+      </w:r>
+      <w:r>
+        <w:rPr>
+          <w:rFonts w:ascii="Times New Roman CYR" w:hAnsi="Times New Roman CYR" w:cs="Times New Roman CYR"/>
+          <w:szCs w:val="24"/>
+          <w:lang w:val="uk-UA" w:eastAsia="en-US"/>
+        </w:rPr>
+        <w:t xml:space="preserve">ки, допущені під час планування, </w:t>
+      </w:r>
+      <w:r>
+        <w:rPr>
+          <w:rFonts w:ascii="Times New Roman CYR" w:hAnsi="Times New Roman CYR" w:cs="Times New Roman CYR"/>
+          <w:szCs w:val="24"/>
+          <w:lang w:val="uk-UA" w:eastAsia="en-US"/>
+        </w:rPr>
+        <w:t>підвищують ризик</w:t>
+      </w:r>
+      <w:r>
+        <w:rPr>
+          <w:rFonts w:ascii="Times New Roman CYR" w:hAnsi="Times New Roman CYR" w:cs="Times New Roman CYR"/>
+          <w:szCs w:val="24"/>
+          <w:lang w:val="uk-UA" w:eastAsia="en-US"/>
+        </w:rPr>
+        <w:t>и</w:t>
+      </w:r>
+      <w:r>
+        <w:rPr>
+          <w:rFonts w:ascii="Times New Roman CYR" w:hAnsi="Times New Roman CYR" w:cs="Times New Roman CYR"/>
+          <w:szCs w:val="24"/>
+          <w:lang w:val="uk-UA" w:eastAsia="en-US"/>
+        </w:rPr>
+        <w:t xml:space="preserve"> для життя та здоров’я людей, </w:t>
+      </w:r>
+      <w:r>
+        <w:rPr>
+          <w:rFonts w:ascii="Times New Roman CYR" w:hAnsi="Times New Roman CYR" w:cs="Times New Roman CYR"/>
+          <w:szCs w:val="24"/>
+          <w:lang w:val="uk-UA" w:eastAsia="en-US"/>
+        </w:rPr>
+        <w:t>втрати матеріальних ресурсів. Крім того, ручне планува</w:t>
+      </w:r>
+      <w:r>
+        <w:rPr>
+          <w:rFonts w:ascii="Times New Roman CYR" w:hAnsi="Times New Roman CYR" w:cs="Times New Roman CYR"/>
+          <w:szCs w:val="24"/>
+          <w:lang w:val="uk-UA" w:eastAsia="en-US"/>
+        </w:rPr>
+        <w:t>ння маршруту вимагає більше</w:t>
+      </w:r>
+      <w:r>
+        <w:rPr>
+          <w:rFonts w:ascii="Times New Roman CYR" w:hAnsi="Times New Roman CYR" w:cs="Times New Roman CYR"/>
+          <w:szCs w:val="24"/>
+          <w:lang w:val="uk-UA" w:eastAsia="en-US"/>
+        </w:rPr>
+        <w:t xml:space="preserve"> часу </w:t>
+      </w:r>
+      <w:r>
+        <w:rPr>
+          <w:rFonts w:ascii="Times New Roman CYR" w:hAnsi="Times New Roman CYR" w:cs="Times New Roman CYR"/>
+          <w:szCs w:val="24"/>
+          <w:lang w:val="uk-UA" w:eastAsia="en-US"/>
+        </w:rPr>
+        <w:t>на виконання, що негативно впливає на загальний час виконання завдання. Звідси має місце протиріччя</w:t>
+      </w:r>
+      <w:r>
+        <w:rPr>
+          <w:rFonts w:ascii="Times New Roman CYR" w:hAnsi="Times New Roman CYR" w:cs="Times New Roman CYR"/>
+          <w:szCs w:val="24"/>
+          <w:lang w:val="uk-UA" w:eastAsia="en-US"/>
+        </w:rPr>
+        <w:t xml:space="preserve"> між наявними засобами планування маршруту руху </w:t>
+      </w:r>
+      <w:r>
+        <w:rPr>
+          <w:rFonts w:ascii="Times New Roman CYR" w:hAnsi="Times New Roman CYR" w:cs="Times New Roman CYR"/>
+          <w:szCs w:val="24"/>
+          <w:lang w:val="uk-UA" w:eastAsia="en-US"/>
+        </w:rPr>
+        <w:t>та вимогами до ефективності виконання завдань</w:t>
+      </w:r>
+      <w:r>
+        <w:rPr>
+          <w:rFonts w:ascii="Times New Roman CYR" w:hAnsi="Times New Roman CYR" w:cs="Times New Roman CYR"/>
+          <w:szCs w:val="24"/>
+          <w:lang w:val="uk-UA" w:eastAsia="en-US"/>
+        </w:rPr>
+        <w:t xml:space="preserve">, що підтверджує актуальність </w:t>
+      </w:r>
+      <w:r>
+        <w:rPr>
+          <w:rFonts w:ascii="Times New Roman CYR" w:hAnsi="Times New Roman CYR" w:cs="Times New Roman CYR"/>
+          <w:szCs w:val="24"/>
+          <w:highlight w:val="yellow"/>
+          <w:lang w:val="uk-UA" w:eastAsia="en-US"/>
+        </w:rPr>
+        <w:t>визначення (</w:t>
+      </w:r>
+      <w:r>
+        <w:rPr>
+          <w:rFonts w:ascii="Times New Roman CYR" w:hAnsi="Times New Roman CYR" w:cs="Times New Roman CYR"/>
+          <w:szCs w:val="24"/>
+          <w:highlight w:val="yellow"/>
+          <w:lang w:val="uk-UA" w:eastAsia="en-US"/>
+        </w:rPr>
+        <w:t>розробки</w:t>
+      </w:r>
+      <w:r>
+        <w:rPr>
+          <w:rFonts w:ascii="Times New Roman CYR" w:hAnsi="Times New Roman CYR" w:cs="Times New Roman CYR"/>
+          <w:szCs w:val="24"/>
+          <w:highlight w:val="yellow"/>
+          <w:lang w:val="uk-UA" w:eastAsia="en-US"/>
+        </w:rPr>
+        <w:t>)</w:t>
+      </w:r>
+      <w:r>
+        <w:rPr>
+          <w:rFonts w:ascii="Times New Roman CYR" w:hAnsi="Times New Roman CYR" w:cs="Times New Roman CYR"/>
+          <w:szCs w:val="24"/>
+          <w:lang w:val="uk-UA" w:eastAsia="en-US"/>
+        </w:rPr>
+        <w:t xml:space="preserve"> підходу до автоматизованого планування марш</w:t>
+      </w:r>
+      <w:r>
+        <w:rPr>
+          <w:rFonts w:ascii="Times New Roman CYR" w:hAnsi="Times New Roman CYR" w:cs="Times New Roman CYR"/>
+          <w:szCs w:val="24"/>
+          <w:lang w:val="uk-UA" w:eastAsia="en-US"/>
+        </w:rPr>
+        <w:t>руту БПС в несприятливих умовах.</w:t>
       </w:r>
     </w:p>
     <w:p>
@@ -812,33 +1201,84 @@
         <w:jc w:val="both"/>
         <w:rPr>
           <w:rFonts w:ascii="Times New Roman CYR" w:hAnsi="Times New Roman CYR" w:cs="Times New Roman CYR"/>
-          <w:szCs w:val="24"/>
-          <w:lang w:val="uk-UA" w:eastAsia="en-US"/>
-        </w:rPr>
-      </w:pPr>
-      <w:r>
-        <w:rPr>
-          <w:rFonts w:ascii="Times New Roman CYR" w:hAnsi="Times New Roman CYR" w:cs="Times New Roman CYR"/>
-          <w:b/>
-          <w:bCs/>
-          <w:szCs w:val="24"/>
-          <w:lang w:val="uk-UA" w:eastAsia="en-US"/>
-        </w:rPr>
-        <w:t>Постановка задачі</w:t>
-      </w:r>
-      <w:r>
-        <w:rPr>
-          <w:rFonts w:ascii="Times New Roman CYR" w:hAnsi="Times New Roman CYR" w:cs="Times New Roman CYR"/>
-          <w:szCs w:val="24"/>
-          <w:lang w:val="uk-UA" w:eastAsia="en-US"/>
-        </w:rPr>
-        <w:t>.</w:t>
-      </w:r>
-      <w:r>
-        <w:rPr>
-          <w:rFonts w:ascii="Times New Roman CYR" w:hAnsi="Times New Roman CYR" w:cs="Times New Roman CYR"/>
-          <w:szCs w:val="24"/>
-          <w:lang w:val="uk-UA"/>
+          <w:color w:val="000000"/>
+          <w:szCs w:val="24"/>
+          <w:lang w:val="uk-UA" w:eastAsia="en-US"/>
+        </w:rPr>
+      </w:pPr>
+      <w:r>
+        <w:rPr>
+          <w:rFonts w:ascii="Times New Roman CYR" w:hAnsi="Times New Roman CYR" w:cs="Times New Roman CYR"/>
+          <w:b/>
+          <w:bCs/>
+          <w:szCs w:val="24"/>
+          <w:lang w:val="uk-UA" w:eastAsia="en-US"/>
+        </w:rPr>
+        <w:t>Мета роботи</w:t>
+      </w:r>
+      <w:r>
+        <w:rPr>
+          <w:rFonts w:ascii="Times New Roman CYR" w:hAnsi="Times New Roman CYR" w:cs="Times New Roman CYR"/>
+          <w:szCs w:val="24"/>
+          <w:lang w:val="uk-UA" w:eastAsia="en-US"/>
+        </w:rPr>
+        <w:t xml:space="preserve">. </w:t>
+      </w:r>
+      <w:r>
+        <w:rPr>
+          <w:rFonts w:ascii="Times New Roman CYR" w:hAnsi="Times New Roman CYR" w:cs="Times New Roman CYR"/>
+          <w:szCs w:val="24"/>
+          <w:lang w:val="uk-UA" w:eastAsia="en-US"/>
+        </w:rPr>
+        <w:t xml:space="preserve">Метою роботи є постановка завдання </w:t>
+      </w:r>
+      <w:r>
+        <w:rPr>
+          <w:rFonts w:ascii="Times New Roman CYR" w:hAnsi="Times New Roman CYR" w:cs="Times New Roman CYR"/>
+          <w:szCs w:val="24"/>
+          <w:lang w:val="uk-UA" w:eastAsia="en-US"/>
+        </w:rPr>
+        <w:t xml:space="preserve">пошуку оптимального маршруту БПС в складі </w:t>
+      </w:r>
+      <w:proofErr w:type="spellStart"/>
+      <w:r>
+        <w:rPr>
+          <w:rFonts w:ascii="Times New Roman CYR" w:hAnsi="Times New Roman CYR" w:cs="Times New Roman CYR"/>
+          <w:szCs w:val="24"/>
+          <w:lang w:val="uk-UA" w:eastAsia="en-US"/>
+        </w:rPr>
+        <w:t>БпАК</w:t>
+      </w:r>
+      <w:proofErr w:type="spellEnd"/>
+      <w:r>
+        <w:rPr>
+          <w:rFonts w:ascii="Times New Roman CYR" w:hAnsi="Times New Roman CYR" w:cs="Times New Roman CYR"/>
+          <w:szCs w:val="24"/>
+          <w:lang w:val="uk-UA" w:eastAsia="en-US"/>
+        </w:rPr>
+        <w:t xml:space="preserve"> на основі різнорідних даних</w:t>
+      </w:r>
+      <w:r>
+        <w:rPr>
+          <w:rFonts w:ascii="Times New Roman CYR" w:hAnsi="Times New Roman CYR" w:cs="Times New Roman CYR"/>
+          <w:szCs w:val="24"/>
+          <w:lang w:val="uk-UA" w:eastAsia="en-US"/>
+        </w:rPr>
+        <w:t xml:space="preserve"> для виконання завдань в несприятливих умовах</w:t>
+      </w:r>
+      <w:r>
+        <w:rPr>
+          <w:rFonts w:ascii="Times New Roman CYR" w:hAnsi="Times New Roman CYR" w:cs="Times New Roman CYR"/>
+          <w:szCs w:val="24"/>
+          <w:lang w:val="uk-UA" w:eastAsia="en-US"/>
+        </w:rPr>
+        <w:t xml:space="preserve"> та визначення підходу до його вирішення</w:t>
+      </w:r>
+      <w:r>
+        <w:rPr>
+          <w:rFonts w:ascii="Times New Roman CYR" w:hAnsi="Times New Roman CYR" w:cs="Times New Roman CYR"/>
+          <w:szCs w:val="24"/>
+          <w:lang w:val="uk-UA" w:eastAsia="en-US"/>
         </w:rPr>
         <w:t>.</w:t>
       </w:r>
@@ -850,20 +1290,61 @@
         <w:jc w:val="both"/>
         <w:rPr>
           <w:rFonts w:ascii="Times New Roman CYR" w:hAnsi="Times New Roman CYR" w:cs="Times New Roman CYR"/>
-          <w:color w:val="000000"/>
-          <w:szCs w:val="24"/>
-          <w:lang w:val="uk-UA" w:eastAsia="en-US"/>
-        </w:rPr>
-      </w:pPr>
-      <w:r>
-        <w:rPr>
-          <w:rFonts w:ascii="Times New Roman CYR" w:hAnsi="Times New Roman CYR" w:cs="Times New Roman CYR"/>
-          <w:b/>
-          <w:bCs/>
-          <w:szCs w:val="24"/>
-          <w:lang w:val="uk-UA" w:eastAsia="en-US"/>
-        </w:rPr>
-        <w:t>Вирішення проблеми</w:t>
+          <w:szCs w:val="24"/>
+          <w:lang w:val="uk-UA" w:eastAsia="en-US"/>
+        </w:rPr>
+      </w:pPr>
+      <w:r>
+        <w:rPr>
+          <w:rFonts w:ascii="Times New Roman CYR" w:hAnsi="Times New Roman CYR" w:cs="Times New Roman CYR"/>
+          <w:b/>
+          <w:bCs/>
+          <w:szCs w:val="24"/>
+          <w:lang w:val="uk-UA" w:eastAsia="en-US"/>
+        </w:rPr>
+        <w:t>Постановка задачі</w:t>
+      </w:r>
+      <w:r>
+        <w:rPr>
+          <w:rFonts w:ascii="Times New Roman CYR" w:hAnsi="Times New Roman CYR" w:cs="Times New Roman CYR"/>
+          <w:szCs w:val="24"/>
+          <w:lang w:val="uk-UA" w:eastAsia="en-US"/>
+        </w:rPr>
+        <w:t>.</w:t>
+      </w:r>
+      <w:r>
+        <w:rPr>
+          <w:rFonts w:ascii="Times New Roman CYR" w:hAnsi="Times New Roman CYR" w:cs="Times New Roman CYR"/>
+          <w:szCs w:val="24"/>
+          <w:lang w:val="uk-UA" w:eastAsia="en-US"/>
+        </w:rPr>
+        <w:t xml:space="preserve"> Виконання завдання покладеного на БПС в складі </w:t>
+      </w:r>
+      <w:proofErr w:type="spellStart"/>
+      <w:r>
+        <w:rPr>
+          <w:rFonts w:ascii="Times New Roman CYR" w:hAnsi="Times New Roman CYR" w:cs="Times New Roman CYR"/>
+          <w:szCs w:val="24"/>
+          <w:lang w:val="uk-UA" w:eastAsia="en-US"/>
+        </w:rPr>
+        <w:t>БпАК</w:t>
+      </w:r>
+      <w:proofErr w:type="spellEnd"/>
+      <w:r>
+        <w:rPr>
+          <w:rFonts w:ascii="Times New Roman CYR" w:hAnsi="Times New Roman CYR" w:cs="Times New Roman CYR"/>
+          <w:szCs w:val="24"/>
+          <w:lang w:val="uk-UA" w:eastAsia="en-US"/>
+        </w:rPr>
+        <w:t xml:space="preserve"> </w:t>
+      </w:r>
+      <w:r>
+        <w:rPr>
+          <w:rFonts w:ascii="Times New Roman CYR" w:hAnsi="Times New Roman CYR" w:cs="Times New Roman CYR"/>
+          <w:szCs w:val="24"/>
+          <w:lang w:val="uk-UA" w:eastAsia="en-US"/>
+        </w:rPr>
+        <w:t>полягає в переміщенні БПС з початкової точки в точку призначення з виконанням точної посадки</w:t>
       </w:r>
       <w:r>
         <w:rPr>
@@ -872,6 +1353,48 @@
           <w:lang w:val="uk-UA" w:eastAsia="en-US"/>
         </w:rPr>
         <w:t xml:space="preserve">. </w:t>
+      </w:r>
+      <w:r>
+        <w:rPr>
+          <w:rFonts w:ascii="Times New Roman CYR" w:hAnsi="Times New Roman CYR" w:cs="Times New Roman CYR"/>
+          <w:szCs w:val="24"/>
+          <w:lang w:val="uk-UA" w:eastAsia="en-US"/>
+        </w:rPr>
+        <w:t xml:space="preserve">Через потенційну недоступність або некоректність роботи глобальних навігаційних супутникових систем (ГНСС) </w:t>
+      </w:r>
+      <w:bookmarkStart w:id="0" w:name="_GoBack"/>
+      <w:bookmarkEnd w:id="0"/>
+      <w:r>
+        <w:rPr>
+          <w:rFonts w:ascii="Times New Roman CYR" w:hAnsi="Times New Roman CYR" w:cs="Times New Roman CYR"/>
+          <w:szCs w:val="24"/>
+          <w:lang w:val="uk-UA"/>
+        </w:rPr>
+        <w:t xml:space="preserve"> </w:t>
+      </w:r>
+      <w:r>
+        <w:rPr>
+          <w:rFonts w:ascii="Times New Roman CYR" w:hAnsi="Times New Roman CYR" w:cs="Times New Roman CYR"/>
+          <w:szCs w:val="24"/>
+          <w:lang w:val="uk-UA"/>
+        </w:rPr>
+        <w:t xml:space="preserve">Вимоги до планування маршруту руху БПС в несприятливих умовах визначаються необхідністю оперативного виконання завдань для збереження життя та здоров’я людей, мінімізації втрат матеріальних ресурсів. </w:t>
+      </w:r>
+      <w:r>
+        <w:rPr>
+          <w:rFonts w:ascii="Times New Roman CYR" w:hAnsi="Times New Roman CYR" w:cs="Times New Roman CYR"/>
+          <w:szCs w:val="24"/>
+          <w:lang w:val="uk-UA"/>
+        </w:rPr>
+        <w:t>Тому результатом планування БПС має бути такий маршрут, який першочергово забезпечує мінімальний час виконання польот</w:t>
+      </w:r>
+      <w:r>
+        <w:rPr>
+          <w:rFonts w:ascii="Times New Roman CYR" w:hAnsi="Times New Roman CYR" w:cs="Times New Roman CYR"/>
+          <w:szCs w:val="24"/>
+          <w:lang w:val="uk-UA"/>
+        </w:rPr>
+        <w:t xml:space="preserve">у. </w:t>
       </w:r>
     </w:p>
     <w:p>
@@ -891,6 +1414,37 @@
           <w:rFonts w:ascii="Times New Roman CYR" w:hAnsi="Times New Roman CYR" w:cs="Times New Roman CYR"/>
           <w:b/>
           <w:bCs/>
+          <w:szCs w:val="24"/>
+          <w:lang w:val="uk-UA" w:eastAsia="en-US"/>
+        </w:rPr>
+        <w:t>Вирішення проблеми</w:t>
+      </w:r>
+      <w:r>
+        <w:rPr>
+          <w:rFonts w:ascii="Times New Roman CYR" w:hAnsi="Times New Roman CYR" w:cs="Times New Roman CYR"/>
+          <w:szCs w:val="24"/>
+          <w:lang w:val="uk-UA" w:eastAsia="en-US"/>
+        </w:rPr>
+        <w:t xml:space="preserve">. </w:t>
+      </w:r>
+    </w:p>
+    <w:p>
+      <w:pPr>
+        <w:pStyle w:val="BodyTextIndent"/>
+        <w:ind w:firstLine="567"/>
+        <w:jc w:val="both"/>
+        <w:rPr>
+          <w:rFonts w:ascii="Times New Roman CYR" w:hAnsi="Times New Roman CYR" w:cs="Times New Roman CYR"/>
+          <w:color w:val="000000"/>
+          <w:szCs w:val="24"/>
+          <w:lang w:val="uk-UA" w:eastAsia="en-US"/>
+        </w:rPr>
+      </w:pPr>
+      <w:r>
+        <w:rPr>
+          <w:rFonts w:ascii="Times New Roman CYR" w:hAnsi="Times New Roman CYR" w:cs="Times New Roman CYR"/>
+          <w:b/>
+          <w:bCs/>
           <w:color w:val="000000"/>
           <w:szCs w:val="24"/>
           <w:lang w:val="uk-UA" w:eastAsia="en-US"/>
@@ -945,7 +1499,6 @@
           <w:szCs w:val="24"/>
           <w:lang w:val="uk-UA" w:eastAsia="en-US"/>
         </w:rPr>
-        <w:lastRenderedPageBreak/>
         <w:t>Список використаних джерел</w:t>
       </w:r>
     </w:p>

</xml_diff>

<commit_message>
added to conference paper
</commit_message>
<xml_diff>
--- a/knowledgebase/conference_papers/wip/Тези_Українець_ІТОНТ.docx
+++ b/knowledgebase/conference_papers/wip/Тези_Українець_ІТОНТ.docx
@@ -266,56 +266,7 @@
           <w:rFonts w:ascii="Times New Roman CYR" w:hAnsi="Times New Roman CYR" w:cs="Times New Roman CYR"/>
           <w:color w:val="000000"/>
         </w:rPr>
-        <w:t xml:space="preserve">. В матеріалах роботи наводяться результати моделювання п‘єзоелектричних елементів різної форми та з різним набором матеріальних констант, що дозволило визначати електричний імпеданс п‘єзокерамічного зразка, який здійснює гармонійні коливання. Метою наукової роботи є дослідження особливостей проведення математичного моделювання п‘єзоелектричних компонентів різноманітної конфігурації для пристроїв інформаційно-комунікаційних та </w:t>
-      </w:r>
-      <w:proofErr w:type="spellStart"/>
-      <w:r>
-        <w:rPr>
-          <w:rFonts w:ascii="Times New Roman CYR" w:hAnsi="Times New Roman CYR" w:cs="Times New Roman CYR"/>
-          <w:color w:val="000000"/>
-        </w:rPr>
-        <w:t>робототехнічних</w:t>
-      </w:r>
-      <w:proofErr w:type="spellEnd"/>
-      <w:r>
-        <w:rPr>
-          <w:rFonts w:ascii="Times New Roman CYR" w:hAnsi="Times New Roman CYR" w:cs="Times New Roman CYR"/>
-          <w:color w:val="000000"/>
-        </w:rPr>
-        <w:t xml:space="preserve"> систем та визначення основних електромеханічних характеристик таких компонентів. Основним завданням роботи є отримання адекватної математичної моделі, використання якої дозволяє проводити високоточний (у тому числі й автоматизованими засобами) розрахунок електромеханічних характеристик п‘єзоелектричних елементів. </w:t>
-      </w:r>
-      <w:r>
-        <w:rPr>
-          <w:rFonts w:ascii="Times New Roman CYR" w:hAnsi="Times New Roman CYR" w:cs="Times New Roman CYR"/>
-          <w:color w:val="000000"/>
-          <w:spacing w:val="-6"/>
-        </w:rPr>
-        <w:t xml:space="preserve">Об‘єктом дослідження є процес математичного моделювання п‘єзоелектричних елементів різної конфігурації; предмет дослідження – математичні моделі таких елементів. Проведено визначення та порівняння розрахункових формул такої основної характеристики п‘єзоелектричних елементів, як електричний імпеданс та показана </w:t>
-      </w:r>
-      <w:proofErr w:type="spellStart"/>
-      <w:r>
-        <w:rPr>
-          <w:rFonts w:ascii="Times New Roman CYR" w:hAnsi="Times New Roman CYR" w:cs="Times New Roman CYR"/>
-          <w:color w:val="000000"/>
-          <w:spacing w:val="-6"/>
-        </w:rPr>
-        <w:t>частотно</w:t>
-      </w:r>
-      <w:proofErr w:type="spellEnd"/>
-      <w:r>
-        <w:rPr>
-          <w:rFonts w:ascii="Times New Roman CYR" w:hAnsi="Times New Roman CYR" w:cs="Times New Roman CYR"/>
-          <w:color w:val="000000"/>
-          <w:spacing w:val="-6"/>
-        </w:rPr>
-        <w:t xml:space="preserve"> залежна зміна амплітуди електричного струму в провідниках схеми для вимірювання електричного імпедансу п'єзокерамічного елемента за різних знаків відношення зарядів на поляризованих поверхнях такого елементу</w:t>
-      </w:r>
-      <w:r>
-        <w:rPr>
-          <w:rFonts w:ascii="Times New Roman CYR" w:hAnsi="Times New Roman CYR" w:cs="Times New Roman CYR"/>
-          <w:color w:val="000000"/>
-        </w:rPr>
-        <w:t>.</w:t>
+        <w:t xml:space="preserve">. </w:t>
       </w:r>
     </w:p>
     <w:p>
@@ -329,6 +280,7 @@
         <w:rPr>
           <w:rFonts w:ascii="Times New Roman CYR" w:hAnsi="Times New Roman CYR" w:cs="Times New Roman CYR"/>
           <w:color w:val="000000"/>
+          <w:lang w:val="en-US"/>
         </w:rPr>
       </w:pPr>
       <w:r>
@@ -345,7 +297,7 @@
           <w:rFonts w:ascii="Times New Roman CYR" w:hAnsi="Times New Roman CYR" w:cs="Times New Roman CYR"/>
           <w:color w:val="000000"/>
         </w:rPr>
-        <w:t xml:space="preserve">: п‘єзокерамічний елемент, математична модель, електричний імпеданс, електромеханічні характеристики. </w:t>
+        <w:t xml:space="preserve">: </w:t>
       </w:r>
     </w:p>
     <w:p>
@@ -577,30 +529,7 @@
           <w:color w:val="000000"/>
           <w:lang w:val="en-GB"/>
         </w:rPr>
-        <w:t>. The paper presents the results of modelling piezoelectric elements of different shapes and with different sets of material constants, which made it possible to determine the electrical impedance of a piezoceramic sample that performs harmonic oscillations. This research aims to study the peculiarities of mathematical modelling of piezoelectric components of various configurations for information and communication</w:t>
-      </w:r>
-      <w:r>
-        <w:rPr>
-          <w:rFonts w:ascii="Times New Roman CYR" w:hAnsi="Times New Roman CYR" w:cs="Times New Roman CYR"/>
-          <w:color w:val="000000"/>
-        </w:rPr>
-        <w:t xml:space="preserve"> </w:t>
-      </w:r>
-      <w:r>
-        <w:rPr>
-          <w:rFonts w:ascii="Times New Roman CYR" w:hAnsi="Times New Roman CYR" w:cs="Times New Roman CYR"/>
-          <w:color w:val="000000"/>
-          <w:lang w:val="en-US"/>
-        </w:rPr>
-        <w:t>as well as robotic</w:t>
-      </w:r>
-      <w:r>
-        <w:rPr>
-          <w:rFonts w:ascii="Times New Roman CYR" w:hAnsi="Times New Roman CYR" w:cs="Times New Roman CYR"/>
-          <w:color w:val="000000"/>
-          <w:lang w:val="en-GB"/>
-        </w:rPr>
-        <w:t xml:space="preserve"> systems and to determine the main electromechanical characteristics of such components. The main objective of the work is to obtain an adequate mathematical model, the use of which allows for a highly accurate (including automated) calculation of the electromechanical characteristics of piezoelectric elements. The object of the study is the process of mathematical modelling of piezoelectric elements of various configurations; the subject of the study is mathematical models of such elements. The paper defines and compares the calculation formulas of such a basic characteristic of piezoelectric elements as electrical impedance and shows the frequency-dependent change in the amplitude of the electric current in the conductors of the circuit for measuring the electrical impedance of a piezoceramic element with different signs of the charge ratio on the polarised surfaces of such an element.</w:t>
+        <w:t xml:space="preserve">. </w:t>
       </w:r>
     </w:p>
     <w:p>
@@ -633,7 +562,7 @@
           <w:color w:val="000000"/>
           <w:lang w:val="en-GB"/>
         </w:rPr>
-        <w:t xml:space="preserve">: piezoceramic element, mathematical model, electrical impedance, electromechanical characteristics. </w:t>
+        <w:t xml:space="preserve">: </w:t>
       </w:r>
     </w:p>
     <w:p>
@@ -969,16 +898,7 @@
           <w:szCs w:val="24"/>
           <w:lang w:val="uk-UA" w:eastAsia="en-US"/>
         </w:rPr>
-        <w:t xml:space="preserve">Одним з найбільш поширених </w:t>
-      </w:r>
-      <w:r>
-        <w:rPr>
-          <w:rFonts w:ascii="Times New Roman CYR" w:hAnsi="Times New Roman CYR" w:cs="Times New Roman CYR"/>
-          <w:szCs w:val="24"/>
-          <w:lang w:val="uk-UA" w:eastAsia="en-US"/>
-        </w:rPr>
-        <w:lastRenderedPageBreak/>
-        <w:t xml:space="preserve">підходів до планування маршруту руху БПС в складі </w:t>
+        <w:t xml:space="preserve">Одним з найбільш поширених підходів до планування маршруту руху БПС в складі </w:t>
       </w:r>
       <w:proofErr w:type="spellStart"/>
       <w:r>
@@ -1360,10 +1280,82 @@
           <w:szCs w:val="24"/>
           <w:lang w:val="uk-UA" w:eastAsia="en-US"/>
         </w:rPr>
-        <w:t xml:space="preserve">Через потенційну недоступність або некоректність роботи глобальних навігаційних супутникових систем (ГНСС) </w:t>
-      </w:r>
-      <w:bookmarkStart w:id="0" w:name="_GoBack"/>
-      <w:bookmarkEnd w:id="0"/>
+        <w:t xml:space="preserve">Через </w:t>
+      </w:r>
+      <w:r>
+        <w:rPr>
+          <w:rFonts w:ascii="Times New Roman CYR" w:hAnsi="Times New Roman CYR" w:cs="Times New Roman CYR"/>
+          <w:szCs w:val="24"/>
+          <w:lang w:val="uk-UA" w:eastAsia="en-US"/>
+        </w:rPr>
+        <w:t>високу ймовірність недоступності</w:t>
+      </w:r>
+      <w:r>
+        <w:rPr>
+          <w:rFonts w:ascii="Times New Roman CYR" w:hAnsi="Times New Roman CYR" w:cs="Times New Roman CYR"/>
+          <w:szCs w:val="24"/>
+          <w:lang w:val="uk-UA" w:eastAsia="en-US"/>
+        </w:rPr>
+        <w:t xml:space="preserve"> або некоректн</w:t>
+      </w:r>
+      <w:r>
+        <w:rPr>
+          <w:rFonts w:ascii="Times New Roman CYR" w:hAnsi="Times New Roman CYR" w:cs="Times New Roman CYR"/>
+          <w:szCs w:val="24"/>
+          <w:lang w:val="uk-UA" w:eastAsia="en-US"/>
+        </w:rPr>
+        <w:t>ості</w:t>
+      </w:r>
+      <w:r>
+        <w:rPr>
+          <w:rFonts w:ascii="Times New Roman CYR" w:hAnsi="Times New Roman CYR" w:cs="Times New Roman CYR"/>
+          <w:szCs w:val="24"/>
+          <w:lang w:val="uk-UA" w:eastAsia="en-US"/>
+        </w:rPr>
+        <w:t xml:space="preserve"> роботи глобальних навігаційних супутникових систем (ГНСС) </w:t>
+      </w:r>
+      <w:r>
+        <w:rPr>
+          <w:rFonts w:ascii="Times New Roman CYR" w:hAnsi="Times New Roman CYR" w:cs="Times New Roman CYR"/>
+          <w:szCs w:val="24"/>
+          <w:lang w:val="uk-UA" w:eastAsia="en-US"/>
+        </w:rPr>
+        <w:t xml:space="preserve">в зоні виконання завдань для визначення місцезнаходження БПС </w:t>
+      </w:r>
+      <w:r>
+        <w:rPr>
+          <w:rFonts w:ascii="Times New Roman CYR" w:hAnsi="Times New Roman CYR" w:cs="Times New Roman CYR"/>
+          <w:szCs w:val="24"/>
+          <w:lang w:val="uk-UA" w:eastAsia="en-US"/>
+        </w:rPr>
+        <w:t xml:space="preserve">застосовується гібридний підхід, який поєднує візуальну навігацію на основі </w:t>
+      </w:r>
+      <w:proofErr w:type="spellStart"/>
+      <w:r>
+        <w:rPr>
+          <w:rFonts w:ascii="Times New Roman CYR" w:hAnsi="Times New Roman CYR" w:cs="Times New Roman CYR"/>
+          <w:szCs w:val="24"/>
+          <w:lang w:val="uk-UA" w:eastAsia="en-US"/>
+        </w:rPr>
+        <w:t>геоприв’язаних</w:t>
+      </w:r>
+      <w:proofErr w:type="spellEnd"/>
+      <w:r>
+        <w:rPr>
+          <w:rFonts w:ascii="Times New Roman CYR" w:hAnsi="Times New Roman CYR" w:cs="Times New Roman CYR"/>
+          <w:szCs w:val="24"/>
+          <w:lang w:val="uk-UA" w:eastAsia="en-US"/>
+        </w:rPr>
+        <w:t xml:space="preserve"> супутникових знімків та </w:t>
+      </w:r>
+      <w:r>
+        <w:rPr>
+          <w:rFonts w:ascii="Times New Roman CYR" w:hAnsi="Times New Roman CYR" w:cs="Times New Roman CYR"/>
+          <w:szCs w:val="24"/>
+          <w:lang w:val="uk-UA" w:eastAsia="en-US"/>
+        </w:rPr>
+        <w:t>карти висот з методом числення координат.</w:t>
+      </w:r>
       <w:r>
         <w:rPr>
           <w:rFonts w:ascii="Times New Roman CYR" w:hAnsi="Times New Roman CYR" w:cs="Times New Roman CYR"/>
@@ -1395,6 +1387,151 @@
           <w:lang w:val="uk-UA"/>
         </w:rPr>
         <w:t xml:space="preserve">у. </w:t>
+      </w:r>
+      <w:r>
+        <w:rPr>
+          <w:rFonts w:ascii="Times New Roman CYR" w:hAnsi="Times New Roman CYR" w:cs="Times New Roman CYR"/>
+          <w:szCs w:val="24"/>
+          <w:lang w:val="uk-UA"/>
+        </w:rPr>
+        <w:t xml:space="preserve">Однак, зважаючи на те, що визначення місцезнаходження БПС ускладнене </w:t>
+      </w:r>
+      <w:r>
+        <w:rPr>
+          <w:rFonts w:ascii="Times New Roman CYR" w:hAnsi="Times New Roman CYR" w:cs="Times New Roman CYR"/>
+          <w:szCs w:val="24"/>
+          <w:lang w:val="uk-UA"/>
+        </w:rPr>
+        <w:t xml:space="preserve">несприятливими умовами, важливим аспектом є </w:t>
+      </w:r>
+      <w:r>
+        <w:rPr>
+          <w:rFonts w:ascii="Times New Roman CYR" w:hAnsi="Times New Roman CYR" w:cs="Times New Roman CYR"/>
+          <w:szCs w:val="24"/>
+          <w:lang w:val="uk-UA"/>
+        </w:rPr>
+        <w:t xml:space="preserve">придатність запланованого маршруту для застосування </w:t>
+      </w:r>
+      <w:r>
+        <w:rPr>
+          <w:rFonts w:ascii="Times New Roman CYR" w:hAnsi="Times New Roman CYR" w:cs="Times New Roman CYR"/>
+          <w:szCs w:val="24"/>
+          <w:lang w:val="uk-UA"/>
+        </w:rPr>
+        <w:t>візуального</w:t>
+      </w:r>
+      <w:r>
+        <w:rPr>
+          <w:rFonts w:ascii="Times New Roman CYR" w:hAnsi="Times New Roman CYR" w:cs="Times New Roman CYR"/>
+          <w:szCs w:val="24"/>
+          <w:lang w:val="uk-UA"/>
+        </w:rPr>
+        <w:t xml:space="preserve"> підходу. Від того </w:t>
+      </w:r>
+      <w:r>
+        <w:rPr>
+          <w:rFonts w:ascii="Times New Roman CYR" w:hAnsi="Times New Roman CYR" w:cs="Times New Roman CYR"/>
+          <w:szCs w:val="24"/>
+          <w:lang w:val="uk-UA"/>
+        </w:rPr>
+        <w:lastRenderedPageBreak/>
+        <w:t>наскільки багатою на візуальні</w:t>
+      </w:r>
+      <w:r>
+        <w:rPr>
+          <w:rFonts w:ascii="Times New Roman CYR" w:hAnsi="Times New Roman CYR" w:cs="Times New Roman CYR"/>
+          <w:szCs w:val="24"/>
+          <w:lang w:val="uk-UA"/>
+        </w:rPr>
+        <w:t xml:space="preserve"> та рельєфні</w:t>
+      </w:r>
+      <w:r>
+        <w:rPr>
+          <w:rFonts w:ascii="Times New Roman CYR" w:hAnsi="Times New Roman CYR" w:cs="Times New Roman CYR"/>
+          <w:szCs w:val="24"/>
+          <w:lang w:val="uk-UA"/>
+        </w:rPr>
+        <w:t xml:space="preserve"> особливості є поверхня над якою проходить маршрут залежить точність визначення місцезнаходження під час польоту, відповідно, точність</w:t>
+      </w:r>
+      <w:r>
+        <w:rPr>
+          <w:rFonts w:ascii="Times New Roman CYR" w:hAnsi="Times New Roman CYR" w:cs="Times New Roman CYR"/>
+          <w:szCs w:val="24"/>
+          <w:lang w:val="uk-UA"/>
+        </w:rPr>
+        <w:t xml:space="preserve"> та швидкість</w:t>
+      </w:r>
+      <w:r>
+        <w:rPr>
+          <w:rFonts w:ascii="Times New Roman CYR" w:hAnsi="Times New Roman CYR" w:cs="Times New Roman CYR"/>
+          <w:szCs w:val="24"/>
+          <w:lang w:val="uk-UA"/>
+        </w:rPr>
+        <w:t xml:space="preserve"> вик</w:t>
+      </w:r>
+      <w:r>
+        <w:rPr>
+          <w:rFonts w:ascii="Times New Roman CYR" w:hAnsi="Times New Roman CYR" w:cs="Times New Roman CYR"/>
+          <w:szCs w:val="24"/>
+          <w:lang w:val="uk-UA"/>
+        </w:rPr>
+        <w:t>онання поставленого завдання.</w:t>
+      </w:r>
+      <w:r>
+        <w:rPr>
+          <w:rFonts w:ascii="Times New Roman CYR" w:hAnsi="Times New Roman CYR" w:cs="Times New Roman CYR"/>
+          <w:szCs w:val="24"/>
+          <w:lang w:val="en-US"/>
+        </w:rPr>
+        <w:t xml:space="preserve"> </w:t>
+      </w:r>
+      <w:r>
+        <w:rPr>
+          <w:rFonts w:ascii="Times New Roman CYR" w:hAnsi="Times New Roman CYR" w:cs="Times New Roman CYR"/>
+          <w:szCs w:val="24"/>
+          <w:lang w:val="uk-UA"/>
+        </w:rPr>
+        <w:t>Отже</w:t>
+      </w:r>
+      <w:r>
+        <w:rPr>
+          <w:rFonts w:ascii="Times New Roman CYR" w:hAnsi="Times New Roman CYR" w:cs="Times New Roman CYR"/>
+          <w:szCs w:val="24"/>
+          <w:lang w:val="uk-UA"/>
+        </w:rPr>
+        <w:t>,</w:t>
+      </w:r>
+      <w:r>
+        <w:rPr>
+          <w:rFonts w:ascii="Times New Roman CYR" w:hAnsi="Times New Roman CYR" w:cs="Times New Roman CYR"/>
+          <w:szCs w:val="24"/>
+          <w:lang w:val="uk-UA"/>
+        </w:rPr>
+        <w:t xml:space="preserve"> маршрут отриманий в результаті планування має мінімізувати час виконання польоту</w:t>
+      </w:r>
+      <w:r>
+        <w:rPr>
+          <w:rFonts w:ascii="Times New Roman CYR" w:hAnsi="Times New Roman CYR" w:cs="Times New Roman CYR"/>
+          <w:szCs w:val="24"/>
+          <w:lang w:val="uk-UA"/>
+        </w:rPr>
+        <w:t xml:space="preserve"> з початкової точки в кінцеву та забезпечувати належну </w:t>
+      </w:r>
+      <w:r>
+        <w:rPr>
+          <w:rFonts w:ascii="Times New Roman CYR" w:hAnsi="Times New Roman CYR" w:cs="Times New Roman CYR"/>
+          <w:szCs w:val="24"/>
+          <w:lang w:val="uk-UA"/>
+        </w:rPr>
+        <w:t xml:space="preserve">деталізацію </w:t>
+      </w:r>
+      <w:r>
+        <w:rPr>
+          <w:rFonts w:ascii="Times New Roman CYR" w:hAnsi="Times New Roman CYR" w:cs="Times New Roman CYR"/>
+          <w:szCs w:val="24"/>
+          <w:lang w:val="uk-UA"/>
+        </w:rPr>
+        <w:t>місцевості для визначення місцезнаходження під час польоту.</w:t>
       </w:r>
     </w:p>
     <w:p>
@@ -1404,7 +1541,6 @@
         <w:jc w:val="both"/>
         <w:rPr>
           <w:rFonts w:ascii="Times New Roman CYR" w:hAnsi="Times New Roman CYR" w:cs="Times New Roman CYR"/>
-          <w:color w:val="000000"/>
           <w:szCs w:val="24"/>
           <w:lang w:val="uk-UA" w:eastAsia="en-US"/>
         </w:rPr>
@@ -1427,6 +1563,1413 @@
         </w:rPr>
         <w:t xml:space="preserve">. </w:t>
       </w:r>
+      <w:r>
+        <w:rPr>
+          <w:rFonts w:ascii="Times New Roman CYR" w:hAnsi="Times New Roman CYR" w:cs="Times New Roman CYR"/>
+          <w:szCs w:val="24"/>
+          <w:lang w:val="uk-UA" w:eastAsia="en-US"/>
+        </w:rPr>
+        <w:t xml:space="preserve">Для постановки задачі багатокритеріальної оптимізації слід визначити </w:t>
+      </w:r>
+      <w:r>
+        <w:rPr>
+          <w:rFonts w:ascii="Times New Roman CYR" w:hAnsi="Times New Roman CYR" w:cs="Times New Roman CYR"/>
+          <w:szCs w:val="24"/>
+          <w:lang w:val="uk-UA" w:eastAsia="en-US"/>
+        </w:rPr>
+        <w:t xml:space="preserve">набір вхідних даних, які мають надаватися для планування маршруту. </w:t>
+      </w:r>
+      <w:r>
+        <w:rPr>
+          <w:rFonts w:ascii="Times New Roman CYR" w:hAnsi="Times New Roman CYR" w:cs="Times New Roman CYR"/>
+          <w:szCs w:val="24"/>
+          <w:lang w:val="uk-UA" w:eastAsia="en-US"/>
+        </w:rPr>
+        <w:t>Про місцевість вико</w:t>
+      </w:r>
+      <w:r>
+        <w:rPr>
+          <w:rFonts w:ascii="Times New Roman CYR" w:hAnsi="Times New Roman CYR" w:cs="Times New Roman CYR"/>
+          <w:szCs w:val="24"/>
+          <w:lang w:val="uk-UA" w:eastAsia="en-US"/>
+        </w:rPr>
+        <w:t>нання завдань слід мати наступний набір даних</w:t>
+      </w:r>
+      <w:r>
+        <w:rPr>
+          <w:rFonts w:ascii="Times New Roman CYR" w:hAnsi="Times New Roman CYR" w:cs="Times New Roman CYR"/>
+          <w:szCs w:val="24"/>
+          <w:lang w:val="uk-UA" w:eastAsia="en-US"/>
+        </w:rPr>
+        <w:t xml:space="preserve">: </w:t>
+      </w:r>
+      <w:proofErr w:type="spellStart"/>
+      <w:r>
+        <w:rPr>
+          <w:rFonts w:ascii="Times New Roman CYR" w:hAnsi="Times New Roman CYR" w:cs="Times New Roman CYR"/>
+          <w:szCs w:val="24"/>
+          <w:lang w:val="uk-UA" w:eastAsia="en-US"/>
+        </w:rPr>
+        <w:t>геоприв’язаний</w:t>
+      </w:r>
+      <w:proofErr w:type="spellEnd"/>
+      <w:r>
+        <w:rPr>
+          <w:rFonts w:ascii="Times New Roman CYR" w:hAnsi="Times New Roman CYR" w:cs="Times New Roman CYR"/>
+          <w:szCs w:val="24"/>
+          <w:lang w:val="uk-UA" w:eastAsia="en-US"/>
+        </w:rPr>
+        <w:t xml:space="preserve"> супутниковий знімок, карта висот, карта вітру, </w:t>
+      </w:r>
+      <w:r>
+        <w:rPr>
+          <w:rFonts w:ascii="Times New Roman CYR" w:hAnsi="Times New Roman CYR" w:cs="Times New Roman CYR"/>
+          <w:szCs w:val="24"/>
+          <w:lang w:val="uk-UA" w:eastAsia="en-US"/>
+        </w:rPr>
+        <w:t xml:space="preserve">зони, де проліт заборонено, зони з погіршеною видимістю. </w:t>
+      </w:r>
+      <w:r>
+        <w:rPr>
+          <w:rFonts w:ascii="Times New Roman CYR" w:hAnsi="Times New Roman CYR" w:cs="Times New Roman CYR"/>
+          <w:szCs w:val="24"/>
+          <w:lang w:val="uk-UA" w:eastAsia="en-US"/>
+        </w:rPr>
+        <w:t>Для забезпечення допустимого маршруту для конкретного</w:t>
+      </w:r>
+      <w:r>
+        <w:rPr>
+          <w:rFonts w:ascii="Times New Roman CYR" w:hAnsi="Times New Roman CYR" w:cs="Times New Roman CYR"/>
+          <w:szCs w:val="24"/>
+          <w:lang w:val="uk-UA" w:eastAsia="en-US"/>
+        </w:rPr>
+        <w:t xml:space="preserve"> виду БПС, слід подати кінематичну</w:t>
+      </w:r>
+      <w:r>
+        <w:rPr>
+          <w:rFonts w:ascii="Times New Roman CYR" w:hAnsi="Times New Roman CYR" w:cs="Times New Roman CYR"/>
+          <w:szCs w:val="24"/>
+          <w:lang w:val="uk-UA" w:eastAsia="en-US"/>
+        </w:rPr>
+        <w:t xml:space="preserve"> модель БПС та </w:t>
+      </w:r>
+      <w:r>
+        <w:rPr>
+          <w:rFonts w:ascii="Times New Roman CYR" w:hAnsi="Times New Roman CYR" w:cs="Times New Roman CYR"/>
+          <w:szCs w:val="24"/>
+          <w:lang w:val="uk-UA" w:eastAsia="en-US"/>
+        </w:rPr>
+        <w:t>набір обмежень його льотних характеристик, таких як максимальна</w:t>
+      </w:r>
+      <w:r>
+        <w:rPr>
+          <w:rFonts w:ascii="Times New Roman CYR" w:hAnsi="Times New Roman CYR" w:cs="Times New Roman CYR"/>
+          <w:szCs w:val="24"/>
+          <w:lang w:val="uk-UA" w:eastAsia="en-US"/>
+        </w:rPr>
+        <w:t>, мінімальна</w:t>
+      </w:r>
+      <w:r>
+        <w:rPr>
+          <w:rFonts w:ascii="Times New Roman CYR" w:hAnsi="Times New Roman CYR" w:cs="Times New Roman CYR"/>
+          <w:szCs w:val="24"/>
+          <w:lang w:val="uk-UA" w:eastAsia="en-US"/>
+        </w:rPr>
+        <w:t xml:space="preserve"> швидкість</w:t>
+      </w:r>
+      <w:r>
+        <w:rPr>
+          <w:rFonts w:ascii="Times New Roman CYR" w:hAnsi="Times New Roman CYR" w:cs="Times New Roman CYR"/>
+          <w:szCs w:val="24"/>
+          <w:lang w:val="uk-UA" w:eastAsia="en-US"/>
+        </w:rPr>
+        <w:t xml:space="preserve"> та </w:t>
+      </w:r>
+      <w:r>
+        <w:rPr>
+          <w:rFonts w:ascii="Times New Roman CYR" w:hAnsi="Times New Roman CYR" w:cs="Times New Roman CYR"/>
+          <w:szCs w:val="24"/>
+          <w:lang w:val="uk-UA" w:eastAsia="en-US"/>
+        </w:rPr>
+        <w:t xml:space="preserve">висота </w:t>
+      </w:r>
+      <w:r>
+        <w:rPr>
+          <w:rFonts w:ascii="Times New Roman CYR" w:hAnsi="Times New Roman CYR" w:cs="Times New Roman CYR"/>
+          <w:szCs w:val="24"/>
+          <w:lang w:val="uk-UA" w:eastAsia="en-US"/>
+        </w:rPr>
+        <w:t>польоту.</w:t>
+      </w:r>
+    </w:p>
+    <w:p>
+      <w:pPr>
+        <w:pStyle w:val="BodyTextIndent"/>
+        <w:ind w:firstLine="567"/>
+        <w:jc w:val="both"/>
+        <w:rPr>
+          <w:rFonts w:ascii="Times New Roman CYR" w:hAnsi="Times New Roman CYR" w:cs="Times New Roman CYR"/>
+          <w:szCs w:val="24"/>
+          <w:lang w:val="uk-UA" w:eastAsia="en-US"/>
+        </w:rPr>
+      </w:pPr>
+      <w:r>
+        <w:rPr>
+          <w:rFonts w:ascii="Times New Roman CYR" w:hAnsi="Times New Roman CYR" w:cs="Times New Roman CYR"/>
+          <w:szCs w:val="24"/>
+          <w:lang w:val="uk-UA" w:eastAsia="en-US"/>
+        </w:rPr>
+        <w:t>Наведемо формалізований запис завдання планування маршруту руху. Маршрут являє собою шлях</w:t>
+      </w:r>
+      <w:r>
+        <w:rPr>
+          <w:rFonts w:ascii="Times New Roman CYR" w:hAnsi="Times New Roman CYR" w:cs="Times New Roman CYR"/>
+          <w:szCs w:val="24"/>
+          <w:lang w:val="uk-UA" w:eastAsia="en-US"/>
+        </w:rPr>
+        <w:t xml:space="preserve"> в графі:</w:t>
+      </w:r>
+    </w:p>
+    <w:p>
+      <w:pPr>
+        <w:pStyle w:val="BodyTextIndent"/>
+        <w:ind w:firstLine="567"/>
+        <w:jc w:val="both"/>
+        <w:rPr>
+          <w:rFonts w:eastAsiaTheme="minorEastAsia" w:cs="Times New Roman"/>
+          <w:i/>
+          <w:szCs w:val="24"/>
+          <w:lang w:val="uk-UA" w:eastAsia="en-US"/>
+        </w:rPr>
+      </w:pPr>
+      <m:oMathPara>
+        <m:oMath>
+          <m:r>
+            <w:rPr>
+              <w:rFonts w:ascii="Cambria Math" w:hAnsi="Cambria Math" w:cs="Times New Roman"/>
+              <w:szCs w:val="24"/>
+              <w:lang w:val="uk-UA" w:eastAsia="en-US"/>
+            </w:rPr>
+            <m:t xml:space="preserve">P= </m:t>
+          </m:r>
+          <m:d>
+            <m:dPr>
+              <m:begChr m:val="〈"/>
+              <m:endChr m:val="〉"/>
+              <m:ctrlPr>
+                <w:rPr>
+                  <w:rFonts w:ascii="Cambria Math" w:hAnsi="Cambria Math" w:cs="Times New Roman"/>
+                  <w:i/>
+                  <w:szCs w:val="24"/>
+                  <w:lang w:val="uk-UA" w:eastAsia="en-US"/>
+                </w:rPr>
+              </m:ctrlPr>
+            </m:dPr>
+            <m:e>
+              <m:sSub>
+                <m:sSubPr>
+                  <m:ctrlPr>
+                    <w:rPr>
+                      <w:rFonts w:ascii="Cambria Math" w:hAnsi="Cambria Math" w:cs="Times New Roman"/>
+                      <w:i/>
+                      <w:szCs w:val="24"/>
+                      <w:lang w:val="uk-UA" w:eastAsia="en-US"/>
+                    </w:rPr>
+                  </m:ctrlPr>
+                </m:sSubPr>
+                <m:e>
+                  <m:r>
+                    <w:rPr>
+                      <w:rFonts w:ascii="Cambria Math" w:hAnsi="Cambria Math" w:cs="Times New Roman"/>
+                      <w:szCs w:val="24"/>
+                      <w:lang w:val="uk-UA" w:eastAsia="en-US"/>
+                    </w:rPr>
+                    <m:t>w</m:t>
+                  </m:r>
+                </m:e>
+                <m:sub>
+                  <m:r>
+                    <w:rPr>
+                      <w:rFonts w:ascii="Cambria Math" w:hAnsi="Cambria Math" w:cs="Times New Roman"/>
+                      <w:szCs w:val="24"/>
+                      <w:lang w:val="uk-UA" w:eastAsia="en-US"/>
+                    </w:rPr>
+                    <m:t>0</m:t>
+                  </m:r>
+                </m:sub>
+              </m:sSub>
+              <m:r>
+                <w:rPr>
+                  <w:rFonts w:ascii="Cambria Math" w:hAnsi="Cambria Math" w:cs="Times New Roman"/>
+                  <w:szCs w:val="24"/>
+                  <w:lang w:val="uk-UA" w:eastAsia="en-US"/>
+                </w:rPr>
+                <m:t>,</m:t>
+              </m:r>
+              <m:sSub>
+                <m:sSubPr>
+                  <m:ctrlPr>
+                    <w:rPr>
+                      <w:rFonts w:ascii="Cambria Math" w:hAnsi="Cambria Math" w:cs="Times New Roman"/>
+                      <w:i/>
+                      <w:szCs w:val="24"/>
+                      <w:lang w:val="uk-UA" w:eastAsia="en-US"/>
+                    </w:rPr>
+                  </m:ctrlPr>
+                </m:sSubPr>
+                <m:e>
+                  <m:r>
+                    <w:rPr>
+                      <w:rFonts w:ascii="Cambria Math" w:hAnsi="Cambria Math" w:cs="Times New Roman"/>
+                      <w:szCs w:val="24"/>
+                      <w:lang w:val="uk-UA" w:eastAsia="en-US"/>
+                    </w:rPr>
+                    <m:t>w</m:t>
+                  </m:r>
+                </m:e>
+                <m:sub>
+                  <m:r>
+                    <w:rPr>
+                      <w:rFonts w:ascii="Cambria Math" w:hAnsi="Cambria Math" w:cs="Times New Roman"/>
+                      <w:szCs w:val="24"/>
+                      <w:lang w:val="uk-UA" w:eastAsia="en-US"/>
+                    </w:rPr>
+                    <m:t>1</m:t>
+                  </m:r>
+                </m:sub>
+              </m:sSub>
+              <m:r>
+                <w:rPr>
+                  <w:rFonts w:ascii="Cambria Math" w:hAnsi="Cambria Math" w:cs="Times New Roman"/>
+                  <w:szCs w:val="24"/>
+                  <w:lang w:val="uk-UA" w:eastAsia="en-US"/>
+                </w:rPr>
+                <m:t>,…,</m:t>
+              </m:r>
+              <m:sSub>
+                <m:sSubPr>
+                  <m:ctrlPr>
+                    <w:rPr>
+                      <w:rFonts w:ascii="Cambria Math" w:hAnsi="Cambria Math" w:cs="Times New Roman"/>
+                      <w:i/>
+                      <w:szCs w:val="24"/>
+                      <w:lang w:val="uk-UA" w:eastAsia="en-US"/>
+                    </w:rPr>
+                  </m:ctrlPr>
+                </m:sSubPr>
+                <m:e>
+                  <m:r>
+                    <w:rPr>
+                      <w:rFonts w:ascii="Cambria Math" w:hAnsi="Cambria Math" w:cs="Times New Roman"/>
+                      <w:szCs w:val="24"/>
+                      <w:lang w:val="uk-UA" w:eastAsia="en-US"/>
+                    </w:rPr>
+                    <m:t>w</m:t>
+                  </m:r>
+                </m:e>
+                <m:sub>
+                  <m:r>
+                    <w:rPr>
+                      <w:rFonts w:ascii="Cambria Math" w:hAnsi="Cambria Math" w:cs="Times New Roman"/>
+                      <w:szCs w:val="24"/>
+                      <w:lang w:val="uk-UA" w:eastAsia="en-US"/>
+                    </w:rPr>
+                    <m:t>n</m:t>
+                  </m:r>
+                </m:sub>
+              </m:sSub>
+            </m:e>
+          </m:d>
+          <m:r>
+            <w:rPr>
+              <w:rFonts w:ascii="Cambria Math" w:hAnsi="Cambria Math" w:cs="Times New Roman"/>
+              <w:szCs w:val="24"/>
+              <w:lang w:val="uk-UA" w:eastAsia="en-US"/>
+            </w:rPr>
+            <m:t xml:space="preserve">,  </m:t>
+          </m:r>
+          <m:sSub>
+            <m:sSubPr>
+              <m:ctrlPr>
+                <w:rPr>
+                  <w:rFonts w:ascii="Cambria Math" w:hAnsi="Cambria Math" w:cs="Times New Roman CYR"/>
+                  <w:i/>
+                  <w:szCs w:val="24"/>
+                  <w:lang w:val="uk-UA" w:eastAsia="en-US"/>
+                </w:rPr>
+              </m:ctrlPr>
+            </m:sSubPr>
+            <m:e>
+              <m:r>
+                <w:rPr>
+                  <w:rFonts w:ascii="Cambria Math" w:hAnsi="Cambria Math" w:cs="Times New Roman CYR"/>
+                  <w:szCs w:val="24"/>
+                  <w:lang w:val="uk-UA" w:eastAsia="en-US"/>
+                </w:rPr>
+                <m:t>w</m:t>
+              </m:r>
+            </m:e>
+            <m:sub>
+              <m:r>
+                <w:rPr>
+                  <w:rFonts w:ascii="Cambria Math" w:hAnsi="Cambria Math" w:cs="Times New Roman CYR"/>
+                  <w:szCs w:val="24"/>
+                  <w:lang w:val="uk-UA" w:eastAsia="en-US"/>
+                </w:rPr>
+                <m:t>i</m:t>
+              </m:r>
+            </m:sub>
+          </m:sSub>
+          <m:r>
+            <w:rPr>
+              <w:rFonts w:ascii="Cambria Math" w:hAnsi="Cambria Math" w:cs="Times New Roman CYR"/>
+              <w:szCs w:val="24"/>
+              <w:lang w:val="uk-UA" w:eastAsia="en-US"/>
+            </w:rPr>
+            <m:t>=(</m:t>
+          </m:r>
+          <m:sSub>
+            <m:sSubPr>
+              <m:ctrlPr>
+                <w:rPr>
+                  <w:rFonts w:ascii="Cambria Math" w:hAnsi="Cambria Math" w:cs="Times New Roman CYR"/>
+                  <w:i/>
+                  <w:szCs w:val="24"/>
+                  <w:lang w:val="uk-UA" w:eastAsia="en-US"/>
+                </w:rPr>
+              </m:ctrlPr>
+            </m:sSubPr>
+            <m:e>
+              <m:r>
+                <w:rPr>
+                  <w:rFonts w:ascii="Cambria Math" w:hAnsi="Cambria Math" w:cs="Times New Roman CYR"/>
+                  <w:szCs w:val="24"/>
+                  <w:lang w:val="uk-UA" w:eastAsia="en-US"/>
+                </w:rPr>
+                <m:t>x</m:t>
+              </m:r>
+            </m:e>
+            <m:sub>
+              <m:r>
+                <w:rPr>
+                  <w:rFonts w:ascii="Cambria Math" w:hAnsi="Cambria Math" w:cs="Times New Roman CYR"/>
+                  <w:szCs w:val="24"/>
+                  <w:lang w:val="uk-UA" w:eastAsia="en-US"/>
+                </w:rPr>
+                <m:t>i</m:t>
+              </m:r>
+            </m:sub>
+          </m:sSub>
+          <m:r>
+            <w:rPr>
+              <w:rFonts w:ascii="Cambria Math" w:hAnsi="Cambria Math" w:cs="Times New Roman CYR"/>
+              <w:szCs w:val="24"/>
+              <w:lang w:val="uk-UA" w:eastAsia="en-US"/>
+            </w:rPr>
+            <m:t>,</m:t>
+          </m:r>
+          <m:sSub>
+            <m:sSubPr>
+              <m:ctrlPr>
+                <w:rPr>
+                  <w:rFonts w:ascii="Cambria Math" w:hAnsi="Cambria Math" w:cs="Times New Roman CYR"/>
+                  <w:i/>
+                  <w:szCs w:val="24"/>
+                  <w:lang w:val="uk-UA" w:eastAsia="en-US"/>
+                </w:rPr>
+              </m:ctrlPr>
+            </m:sSubPr>
+            <m:e>
+              <m:r>
+                <w:rPr>
+                  <w:rFonts w:ascii="Cambria Math" w:hAnsi="Cambria Math" w:cs="Times New Roman CYR"/>
+                  <w:szCs w:val="24"/>
+                  <w:lang w:val="uk-UA" w:eastAsia="en-US"/>
+                </w:rPr>
+                <m:t>y</m:t>
+              </m:r>
+            </m:e>
+            <m:sub>
+              <m:r>
+                <w:rPr>
+                  <w:rFonts w:ascii="Cambria Math" w:hAnsi="Cambria Math" w:cs="Times New Roman CYR"/>
+                  <w:szCs w:val="24"/>
+                  <w:lang w:val="uk-UA" w:eastAsia="en-US"/>
+                </w:rPr>
+                <m:t>i</m:t>
+              </m:r>
+            </m:sub>
+          </m:sSub>
+          <m:r>
+            <w:rPr>
+              <w:rFonts w:ascii="Cambria Math" w:hAnsi="Cambria Math" w:cs="Times New Roman CYR"/>
+              <w:szCs w:val="24"/>
+              <w:lang w:val="uk-UA" w:eastAsia="en-US"/>
+            </w:rPr>
+            <m:t>,</m:t>
+          </m:r>
+          <m:sSub>
+            <m:sSubPr>
+              <m:ctrlPr>
+                <w:rPr>
+                  <w:rFonts w:ascii="Cambria Math" w:hAnsi="Cambria Math" w:cs="Times New Roman CYR"/>
+                  <w:i/>
+                  <w:szCs w:val="24"/>
+                  <w:lang w:val="uk-UA" w:eastAsia="en-US"/>
+                </w:rPr>
+              </m:ctrlPr>
+            </m:sSubPr>
+            <m:e>
+              <m:r>
+                <w:rPr>
+                  <w:rFonts w:ascii="Cambria Math" w:hAnsi="Cambria Math" w:cs="Times New Roman CYR"/>
+                  <w:szCs w:val="24"/>
+                  <w:lang w:val="uk-UA" w:eastAsia="en-US"/>
+                </w:rPr>
+                <m:t>z</m:t>
+              </m:r>
+            </m:e>
+            <m:sub>
+              <m:r>
+                <w:rPr>
+                  <w:rFonts w:ascii="Cambria Math" w:hAnsi="Cambria Math" w:cs="Times New Roman CYR"/>
+                  <w:szCs w:val="24"/>
+                  <w:lang w:val="uk-UA" w:eastAsia="en-US"/>
+                </w:rPr>
+                <m:t>i</m:t>
+              </m:r>
+            </m:sub>
+          </m:sSub>
+          <m:r>
+            <w:rPr>
+              <w:rFonts w:ascii="Cambria Math" w:hAnsi="Cambria Math" w:cs="Times New Roman CYR"/>
+              <w:szCs w:val="24"/>
+              <w:lang w:val="uk-UA" w:eastAsia="en-US"/>
+            </w:rPr>
+            <m:t>)</m:t>
+          </m:r>
+          <m:r>
+            <w:rPr>
+              <w:rFonts w:ascii="Cambria Math" w:hAnsi="Cambria Math" w:cs="Times New Roman CYR"/>
+              <w:szCs w:val="24"/>
+              <w:lang w:val="uk-UA" w:eastAsia="en-US"/>
+            </w:rPr>
+            <m:t>∈</m:t>
+          </m:r>
+          <m:sSup>
+            <m:sSupPr>
+              <m:ctrlPr>
+                <w:rPr>
+                  <w:rFonts w:ascii="Cambria Math" w:hAnsi="Cambria Math" w:cs="Times New Roman CYR"/>
+                  <w:i/>
+                  <w:szCs w:val="24"/>
+                  <w:lang w:val="uk-UA" w:eastAsia="en-US"/>
+                </w:rPr>
+              </m:ctrlPr>
+            </m:sSupPr>
+            <m:e>
+              <m:r>
+                <m:rPr>
+                  <m:scr m:val="double-struck"/>
+                </m:rPr>
+                <w:rPr>
+                  <w:rFonts w:ascii="Cambria Math" w:hAnsi="Cambria Math" w:cs="Times New Roman CYR"/>
+                  <w:szCs w:val="24"/>
+                  <w:lang w:val="uk-UA" w:eastAsia="en-US"/>
+                </w:rPr>
+                <m:t>R</m:t>
+              </m:r>
+            </m:e>
+            <m:sup>
+              <m:r>
+                <w:rPr>
+                  <w:rFonts w:ascii="Cambria Math" w:hAnsi="Cambria Math" w:cs="Times New Roman CYR"/>
+                  <w:szCs w:val="24"/>
+                  <w:lang w:val="uk-UA" w:eastAsia="en-US"/>
+                </w:rPr>
+                <m:t>3</m:t>
+              </m:r>
+            </m:sup>
+          </m:sSup>
+        </m:oMath>
+      </m:oMathPara>
+    </w:p>
+    <w:p>
+      <w:pPr>
+        <w:pStyle w:val="BodyTextIndent"/>
+        <w:ind w:firstLine="567"/>
+        <w:jc w:val="both"/>
+        <w:rPr>
+          <w:rFonts w:eastAsiaTheme="minorEastAsia" w:cs="Times New Roman"/>
+          <w:szCs w:val="24"/>
+          <w:lang w:val="uk-UA" w:eastAsia="en-US"/>
+        </w:rPr>
+      </w:pPr>
+      <w:r>
+        <w:rPr>
+          <w:rFonts w:eastAsiaTheme="minorEastAsia" w:cs="Times New Roman"/>
+          <w:szCs w:val="24"/>
+          <w:lang w:val="uk-UA" w:eastAsia="en-US"/>
+        </w:rPr>
+        <w:t xml:space="preserve">Множина </w:t>
+      </w:r>
+      <w:proofErr w:type="spellStart"/>
+      <w:r>
+        <w:rPr>
+          <w:rFonts w:eastAsiaTheme="minorEastAsia" w:cs="Times New Roman"/>
+          <w:szCs w:val="24"/>
+          <w:lang w:val="uk-UA" w:eastAsia="en-US"/>
+        </w:rPr>
+        <w:t>ребер</w:t>
+      </w:r>
+      <w:proofErr w:type="spellEnd"/>
+      <w:r>
+        <w:rPr>
+          <w:rFonts w:eastAsiaTheme="minorEastAsia" w:cs="Times New Roman"/>
+          <w:szCs w:val="24"/>
+          <w:lang w:val="uk-UA" w:eastAsia="en-US"/>
+        </w:rPr>
+        <w:t xml:space="preserve"> маршруту:</w:t>
+      </w:r>
+    </w:p>
+    <w:p>
+      <w:pPr>
+        <w:pStyle w:val="BodyTextIndent"/>
+        <w:ind w:firstLine="567"/>
+        <w:jc w:val="both"/>
+        <w:rPr>
+          <w:rFonts w:eastAsiaTheme="minorEastAsia" w:cs="Times New Roman"/>
+          <w:color w:val="000000"/>
+          <w:szCs w:val="24"/>
+          <w:lang w:val="en-US" w:eastAsia="en-US"/>
+        </w:rPr>
+      </w:pPr>
+      <m:oMathPara>
+        <m:oMath>
+          <m:r>
+            <w:rPr>
+              <w:rFonts w:ascii="Cambria Math" w:hAnsi="Cambria Math" w:cs="Times New Roman"/>
+              <w:color w:val="000000"/>
+              <w:szCs w:val="24"/>
+              <w:lang w:val="en-US" w:eastAsia="en-US"/>
+            </w:rPr>
+            <m:t>E</m:t>
+          </m:r>
+          <m:d>
+            <m:dPr>
+              <m:ctrlPr>
+                <w:rPr>
+                  <w:rFonts w:ascii="Cambria Math" w:hAnsi="Cambria Math" w:cs="Times New Roman"/>
+                  <w:i/>
+                  <w:color w:val="000000"/>
+                  <w:szCs w:val="24"/>
+                  <w:lang w:val="en-US" w:eastAsia="en-US"/>
+                </w:rPr>
+              </m:ctrlPr>
+            </m:dPr>
+            <m:e>
+              <m:r>
+                <w:rPr>
+                  <w:rFonts w:ascii="Cambria Math" w:hAnsi="Cambria Math" w:cs="Times New Roman"/>
+                  <w:color w:val="000000"/>
+                  <w:szCs w:val="24"/>
+                  <w:lang w:val="en-US" w:eastAsia="en-US"/>
+                </w:rPr>
+                <m:t>P</m:t>
+              </m:r>
+            </m:e>
+          </m:d>
+          <m:r>
+            <w:rPr>
+              <w:rFonts w:ascii="Cambria Math" w:hAnsi="Cambria Math" w:cs="Times New Roman"/>
+              <w:color w:val="000000"/>
+              <w:szCs w:val="24"/>
+              <w:lang w:val="en-US" w:eastAsia="en-US"/>
+            </w:rPr>
+            <m:t>=</m:t>
+          </m:r>
+          <m:d>
+            <m:dPr>
+              <m:begChr m:val="{"/>
+              <m:ctrlPr>
+                <w:rPr>
+                  <w:rFonts w:ascii="Cambria Math" w:hAnsi="Cambria Math" w:cs="Times New Roman"/>
+                  <w:i/>
+                  <w:color w:val="000000"/>
+                  <w:szCs w:val="24"/>
+                  <w:lang w:val="en-US" w:eastAsia="en-US"/>
+                </w:rPr>
+              </m:ctrlPr>
+            </m:dPr>
+            <m:e>
+              <m:sSub>
+                <m:sSubPr>
+                  <m:ctrlPr>
+                    <w:rPr>
+                      <w:rFonts w:ascii="Cambria Math" w:hAnsi="Cambria Math" w:cs="Times New Roman"/>
+                      <w:i/>
+                      <w:color w:val="000000"/>
+                      <w:szCs w:val="24"/>
+                      <w:lang w:val="en-US" w:eastAsia="en-US"/>
+                    </w:rPr>
+                  </m:ctrlPr>
+                </m:sSubPr>
+                <m:e>
+                  <m:r>
+                    <w:rPr>
+                      <w:rFonts w:ascii="Cambria Math" w:hAnsi="Cambria Math" w:cs="Times New Roman"/>
+                      <w:color w:val="000000"/>
+                      <w:szCs w:val="24"/>
+                      <w:lang w:val="en-US" w:eastAsia="en-US"/>
+                    </w:rPr>
+                    <m:t>(w</m:t>
+                  </m:r>
+                </m:e>
+                <m:sub>
+                  <m:r>
+                    <w:rPr>
+                      <w:rFonts w:ascii="Cambria Math" w:hAnsi="Cambria Math" w:cs="Times New Roman"/>
+                      <w:color w:val="000000"/>
+                      <w:szCs w:val="24"/>
+                      <w:lang w:val="en-US" w:eastAsia="en-US"/>
+                    </w:rPr>
+                    <m:t>i</m:t>
+                  </m:r>
+                </m:sub>
+              </m:sSub>
+              <m:sSub>
+                <m:sSubPr>
+                  <m:ctrlPr>
+                    <w:rPr>
+                      <w:rFonts w:ascii="Cambria Math" w:hAnsi="Cambria Math" w:cs="Times New Roman"/>
+                      <w:i/>
+                      <w:color w:val="000000"/>
+                      <w:szCs w:val="24"/>
+                      <w:lang w:val="en-US" w:eastAsia="en-US"/>
+                    </w:rPr>
+                  </m:ctrlPr>
+                </m:sSubPr>
+                <m:e>
+                  <m:r>
+                    <w:rPr>
+                      <w:rFonts w:ascii="Cambria Math" w:hAnsi="Cambria Math" w:cs="Times New Roman"/>
+                      <w:color w:val="000000"/>
+                      <w:szCs w:val="24"/>
+                      <w:lang w:val="en-US" w:eastAsia="en-US"/>
+                    </w:rPr>
+                    <m:t>,w</m:t>
+                  </m:r>
+                </m:e>
+                <m:sub>
+                  <m:r>
+                    <w:rPr>
+                      <w:rFonts w:ascii="Cambria Math" w:hAnsi="Cambria Math" w:cs="Times New Roman"/>
+                      <w:color w:val="000000"/>
+                      <w:szCs w:val="24"/>
+                      <w:lang w:val="en-US" w:eastAsia="en-US"/>
+                    </w:rPr>
+                    <m:t>i+1</m:t>
+                  </m:r>
+                </m:sub>
+              </m:sSub>
+            </m:e>
+          </m:d>
+          <m:r>
+            <w:rPr>
+              <w:rFonts w:ascii="Cambria Math" w:hAnsi="Cambria Math" w:cs="Times New Roman"/>
+              <w:color w:val="000000"/>
+              <w:szCs w:val="24"/>
+              <w:lang w:val="en-US" w:eastAsia="en-US"/>
+            </w:rPr>
+            <m:t xml:space="preserve"> | i=0</m:t>
+          </m:r>
+          <m:r>
+            <w:rPr>
+              <w:rFonts w:ascii="Cambria Math" w:hAnsi="Cambria Math" w:cs="Times New Roman"/>
+              <w:color w:val="000000"/>
+              <w:szCs w:val="24"/>
+              <w:lang w:val="en-US" w:eastAsia="en-US"/>
+            </w:rPr>
+            <m:t>,…,n-1</m:t>
+          </m:r>
+          <m:r>
+            <w:rPr>
+              <w:rFonts w:ascii="Cambria Math" w:hAnsi="Cambria Math" w:cs="Times New Roman"/>
+              <w:color w:val="000000"/>
+              <w:szCs w:val="24"/>
+              <w:lang w:val="en-US" w:eastAsia="en-US"/>
+            </w:rPr>
+            <m:t>}</m:t>
+          </m:r>
+        </m:oMath>
+      </m:oMathPara>
+    </w:p>
+    <w:p>
+      <w:pPr>
+        <w:pStyle w:val="BodyTextIndent"/>
+        <w:ind w:firstLine="567"/>
+        <w:jc w:val="both"/>
+        <w:rPr>
+          <w:rFonts w:eastAsiaTheme="minorEastAsia" w:cs="Times New Roman"/>
+          <w:color w:val="000000"/>
+          <w:szCs w:val="24"/>
+          <w:lang w:val="uk-UA" w:eastAsia="en-US"/>
+        </w:rPr>
+      </w:pPr>
+      <w:r>
+        <w:rPr>
+          <w:rFonts w:eastAsiaTheme="minorEastAsia" w:cs="Times New Roman"/>
+          <w:color w:val="000000"/>
+          <w:szCs w:val="24"/>
+          <w:lang w:val="uk-UA" w:eastAsia="en-US"/>
+        </w:rPr>
+        <w:t xml:space="preserve">Зважаючи на </w:t>
+      </w:r>
+      <w:r>
+        <w:rPr>
+          <w:rFonts w:eastAsiaTheme="minorEastAsia" w:cs="Times New Roman"/>
+          <w:color w:val="000000"/>
+          <w:szCs w:val="24"/>
+          <w:lang w:val="uk-UA" w:eastAsia="en-US"/>
+        </w:rPr>
+        <w:t>першочергов</w:t>
+      </w:r>
+      <w:r>
+        <w:rPr>
+          <w:rFonts w:eastAsiaTheme="minorEastAsia" w:cs="Times New Roman"/>
+          <w:color w:val="000000"/>
+          <w:szCs w:val="24"/>
+          <w:lang w:val="uk-UA" w:eastAsia="en-US"/>
+        </w:rPr>
+        <w:t xml:space="preserve">у важливість тривалості польоту, </w:t>
+      </w:r>
+      <w:proofErr w:type="spellStart"/>
+      <w:r>
+        <w:rPr>
+          <w:rFonts w:eastAsiaTheme="minorEastAsia" w:cs="Times New Roman"/>
+          <w:color w:val="000000"/>
+          <w:szCs w:val="24"/>
+          <w:lang w:val="uk-UA" w:eastAsia="en-US"/>
+        </w:rPr>
+        <w:t>запишемо</w:t>
+      </w:r>
+      <w:proofErr w:type="spellEnd"/>
+      <w:r>
+        <w:rPr>
+          <w:rFonts w:eastAsiaTheme="minorEastAsia" w:cs="Times New Roman"/>
+          <w:color w:val="000000"/>
+          <w:szCs w:val="24"/>
+          <w:lang w:val="uk-UA" w:eastAsia="en-US"/>
+        </w:rPr>
+        <w:t xml:space="preserve"> функцію для часу польоту:</w:t>
+      </w:r>
+    </w:p>
+    <w:p>
+      <w:pPr>
+        <w:pStyle w:val="BodyTextIndent"/>
+        <w:ind w:firstLine="567"/>
+        <w:jc w:val="both"/>
+        <w:rPr>
+          <w:rFonts w:eastAsiaTheme="minorEastAsia" w:cs="Times New Roman"/>
+          <w:color w:val="000000"/>
+          <w:szCs w:val="24"/>
+          <w:lang w:val="uk-UA" w:eastAsia="en-US"/>
+        </w:rPr>
+      </w:pPr>
+      <m:oMathPara>
+        <m:oMath>
+          <m:sSub>
+            <m:sSubPr>
+              <m:ctrlPr>
+                <w:rPr>
+                  <w:rFonts w:ascii="Cambria Math" w:hAnsi="Cambria Math" w:cs="Times New Roman"/>
+                  <w:i/>
+                  <w:color w:val="000000"/>
+                  <w:szCs w:val="24"/>
+                  <w:lang w:val="uk-UA" w:eastAsia="en-US"/>
+                </w:rPr>
+              </m:ctrlPr>
+            </m:sSubPr>
+            <m:e>
+              <m:r>
+                <w:rPr>
+                  <w:rFonts w:ascii="Cambria Math" w:hAnsi="Cambria Math" w:cs="Times New Roman"/>
+                  <w:color w:val="000000"/>
+                  <w:szCs w:val="24"/>
+                  <w:lang w:val="uk-UA" w:eastAsia="en-US"/>
+                </w:rPr>
+                <m:t>f</m:t>
+              </m:r>
+            </m:e>
+            <m:sub>
+              <m:r>
+                <w:rPr>
+                  <w:rFonts w:ascii="Cambria Math" w:hAnsi="Cambria Math" w:cs="Times New Roman"/>
+                  <w:color w:val="000000"/>
+                  <w:szCs w:val="24"/>
+                  <w:lang w:val="uk-UA" w:eastAsia="en-US"/>
+                </w:rPr>
+                <m:t>1</m:t>
+              </m:r>
+            </m:sub>
+          </m:sSub>
+          <m:d>
+            <m:dPr>
+              <m:ctrlPr>
+                <w:rPr>
+                  <w:rFonts w:ascii="Cambria Math" w:hAnsi="Cambria Math" w:cs="Times New Roman"/>
+                  <w:i/>
+                  <w:color w:val="000000"/>
+                  <w:szCs w:val="24"/>
+                  <w:lang w:val="uk-UA" w:eastAsia="en-US"/>
+                </w:rPr>
+              </m:ctrlPr>
+            </m:dPr>
+            <m:e>
+              <m:r>
+                <w:rPr>
+                  <w:rFonts w:ascii="Cambria Math" w:hAnsi="Cambria Math" w:cs="Times New Roman"/>
+                  <w:color w:val="000000"/>
+                  <w:szCs w:val="24"/>
+                  <w:lang w:val="uk-UA" w:eastAsia="en-US"/>
+                </w:rPr>
+                <m:t>P</m:t>
+              </m:r>
+            </m:e>
+          </m:d>
+          <m:r>
+            <w:rPr>
+              <w:rFonts w:ascii="Cambria Math" w:hAnsi="Cambria Math" w:cs="Times New Roman"/>
+              <w:color w:val="000000"/>
+              <w:szCs w:val="24"/>
+              <w:lang w:val="uk-UA" w:eastAsia="en-US"/>
+            </w:rPr>
+            <m:t>=</m:t>
+          </m:r>
+          <m:nary>
+            <m:naryPr>
+              <m:chr m:val="∑"/>
+              <m:limLoc m:val="undOvr"/>
+              <m:ctrlPr>
+                <w:rPr>
+                  <w:rFonts w:ascii="Cambria Math" w:hAnsi="Cambria Math" w:cs="Times New Roman"/>
+                  <w:i/>
+                  <w:color w:val="000000"/>
+                  <w:szCs w:val="24"/>
+                  <w:lang w:val="uk-UA" w:eastAsia="en-US"/>
+                </w:rPr>
+              </m:ctrlPr>
+            </m:naryPr>
+            <m:sub>
+              <m:r>
+                <w:rPr>
+                  <w:rFonts w:ascii="Cambria Math" w:hAnsi="Cambria Math" w:cs="Times New Roman"/>
+                  <w:color w:val="000000"/>
+                  <w:szCs w:val="24"/>
+                  <w:lang w:val="uk-UA" w:eastAsia="en-US"/>
+                </w:rPr>
+                <m:t>e∈E</m:t>
+              </m:r>
+              <m:d>
+                <m:dPr>
+                  <m:ctrlPr>
+                    <w:rPr>
+                      <w:rFonts w:ascii="Cambria Math" w:hAnsi="Cambria Math" w:cs="Times New Roman"/>
+                      <w:i/>
+                      <w:color w:val="000000"/>
+                      <w:szCs w:val="24"/>
+                      <w:lang w:val="uk-UA" w:eastAsia="en-US"/>
+                    </w:rPr>
+                  </m:ctrlPr>
+                </m:dPr>
+                <m:e>
+                  <m:r>
+                    <w:rPr>
+                      <w:rFonts w:ascii="Cambria Math" w:hAnsi="Cambria Math" w:cs="Times New Roman"/>
+                      <w:color w:val="000000"/>
+                      <w:szCs w:val="24"/>
+                      <w:lang w:val="uk-UA" w:eastAsia="en-US"/>
+                    </w:rPr>
+                    <m:t>P</m:t>
+                  </m:r>
+                </m:e>
+              </m:d>
+            </m:sub>
+            <m:sup/>
+            <m:e>
+              <m:f>
+                <m:fPr>
+                  <m:ctrlPr>
+                    <w:rPr>
+                      <w:rFonts w:ascii="Cambria Math" w:hAnsi="Cambria Math" w:cs="Times New Roman"/>
+                      <w:i/>
+                      <w:color w:val="000000"/>
+                      <w:szCs w:val="24"/>
+                      <w:lang w:val="uk-UA" w:eastAsia="en-US"/>
+                    </w:rPr>
+                  </m:ctrlPr>
+                </m:fPr>
+                <m:num>
+                  <m:r>
+                    <w:rPr>
+                      <w:rFonts w:ascii="Cambria Math" w:hAnsi="Cambria Math" w:cs="Times New Roman"/>
+                      <w:color w:val="000000"/>
+                      <w:szCs w:val="24"/>
+                      <w:lang w:val="uk-UA" w:eastAsia="en-US"/>
+                    </w:rPr>
+                    <m:t>d</m:t>
+                  </m:r>
+                  <m:d>
+                    <m:dPr>
+                      <m:ctrlPr>
+                        <w:rPr>
+                          <w:rFonts w:ascii="Cambria Math" w:hAnsi="Cambria Math" w:cs="Times New Roman"/>
+                          <w:i/>
+                          <w:color w:val="000000"/>
+                          <w:szCs w:val="24"/>
+                          <w:lang w:val="uk-UA" w:eastAsia="en-US"/>
+                        </w:rPr>
+                      </m:ctrlPr>
+                    </m:dPr>
+                    <m:e>
+                      <m:r>
+                        <w:rPr>
+                          <w:rFonts w:ascii="Cambria Math" w:hAnsi="Cambria Math" w:cs="Times New Roman"/>
+                          <w:color w:val="000000"/>
+                          <w:szCs w:val="24"/>
+                          <w:lang w:val="uk-UA" w:eastAsia="en-US"/>
+                        </w:rPr>
+                        <m:t>e</m:t>
+                      </m:r>
+                    </m:e>
+                  </m:d>
+                </m:num>
+                <m:den>
+                  <m:sSub>
+                    <m:sSubPr>
+                      <m:ctrlPr>
+                        <w:rPr>
+                          <w:rFonts w:ascii="Cambria Math" w:hAnsi="Cambria Math" w:cs="Times New Roman"/>
+                          <w:i/>
+                          <w:color w:val="000000"/>
+                          <w:szCs w:val="24"/>
+                          <w:lang w:val="uk-UA" w:eastAsia="en-US"/>
+                        </w:rPr>
+                      </m:ctrlPr>
+                    </m:sSubPr>
+                    <m:e>
+                      <m:r>
+                        <w:rPr>
+                          <w:rFonts w:ascii="Cambria Math" w:hAnsi="Cambria Math" w:cs="Times New Roman"/>
+                          <w:color w:val="000000"/>
+                          <w:szCs w:val="24"/>
+                          <w:lang w:val="uk-UA" w:eastAsia="en-US"/>
+                        </w:rPr>
+                        <m:t>v</m:t>
+                      </m:r>
+                    </m:e>
+                    <m:sub>
+                      <m:r>
+                        <w:rPr>
+                          <w:rFonts w:ascii="Cambria Math" w:hAnsi="Cambria Math" w:cs="Times New Roman"/>
+                          <w:color w:val="000000"/>
+                          <w:szCs w:val="24"/>
+                          <w:lang w:val="uk-UA" w:eastAsia="en-US"/>
+                        </w:rPr>
+                        <m:t>g</m:t>
+                      </m:r>
+                    </m:sub>
+                  </m:sSub>
+                  <m:r>
+                    <w:rPr>
+                      <w:rFonts w:ascii="Cambria Math" w:hAnsi="Cambria Math" w:cs="Times New Roman"/>
+                      <w:color w:val="000000"/>
+                      <w:szCs w:val="24"/>
+                      <w:lang w:val="uk-UA" w:eastAsia="en-US"/>
+                    </w:rPr>
+                    <m:t>(e)</m:t>
+                  </m:r>
+                </m:den>
+              </m:f>
+            </m:e>
+          </m:nary>
+          <m:r>
+            <w:rPr>
+              <w:rFonts w:ascii="Cambria Math" w:eastAsiaTheme="minorEastAsia" w:hAnsi="Cambria Math" w:cs="Times New Roman"/>
+              <w:color w:val="000000"/>
+              <w:szCs w:val="24"/>
+              <w:lang w:val="en-US" w:eastAsia="en-US"/>
+            </w:rPr>
+            <m:t xml:space="preserve">,  </m:t>
+          </m:r>
+          <m:r>
+            <w:rPr>
+              <w:rFonts w:ascii="Cambria Math" w:eastAsiaTheme="minorEastAsia" w:hAnsi="Cambria Math" w:cs="Times New Roman"/>
+              <w:color w:val="000000"/>
+              <w:szCs w:val="24"/>
+              <w:lang w:val="uk-UA" w:eastAsia="en-US"/>
+            </w:rPr>
+            <m:t xml:space="preserve">де </m:t>
+          </m:r>
+          <m:sSub>
+            <m:sSubPr>
+              <m:ctrlPr>
+                <w:rPr>
+                  <w:rFonts w:ascii="Cambria Math" w:hAnsi="Cambria Math" w:cs="Times New Roman"/>
+                  <w:i/>
+                  <w:color w:val="000000"/>
+                  <w:szCs w:val="24"/>
+                  <w:lang w:val="uk-UA" w:eastAsia="en-US"/>
+                </w:rPr>
+              </m:ctrlPr>
+            </m:sSubPr>
+            <m:e>
+              <m:r>
+                <w:rPr>
+                  <w:rFonts w:ascii="Cambria Math" w:hAnsi="Cambria Math" w:cs="Times New Roman"/>
+                  <w:color w:val="000000"/>
+                  <w:szCs w:val="24"/>
+                  <w:lang w:val="uk-UA" w:eastAsia="en-US"/>
+                </w:rPr>
+                <m:t>v</m:t>
+              </m:r>
+            </m:e>
+            <m:sub>
+              <m:r>
+                <w:rPr>
+                  <w:rFonts w:ascii="Cambria Math" w:hAnsi="Cambria Math" w:cs="Times New Roman"/>
+                  <w:color w:val="000000"/>
+                  <w:szCs w:val="24"/>
+                  <w:lang w:val="uk-UA" w:eastAsia="en-US"/>
+                </w:rPr>
+                <m:t>g</m:t>
+              </m:r>
+            </m:sub>
+          </m:sSub>
+          <m:r>
+            <w:rPr>
+              <w:rFonts w:ascii="Cambria Math" w:eastAsiaTheme="minorEastAsia" w:hAnsi="Cambria Math" w:cs="Times New Roman"/>
+              <w:color w:val="000000"/>
+              <w:szCs w:val="24"/>
+              <w:lang w:val="uk-UA" w:eastAsia="en-US"/>
+            </w:rPr>
+            <m:t>=</m:t>
+          </m:r>
+          <m:rad>
+            <m:radPr>
+              <m:degHide m:val="1"/>
+              <m:ctrlPr>
+                <w:rPr>
+                  <w:rFonts w:ascii="Cambria Math" w:eastAsiaTheme="minorEastAsia" w:hAnsi="Cambria Math" w:cs="Times New Roman"/>
+                  <w:i/>
+                  <w:color w:val="000000"/>
+                  <w:szCs w:val="24"/>
+                  <w:lang w:val="uk-UA" w:eastAsia="en-US"/>
+                </w:rPr>
+              </m:ctrlPr>
+            </m:radPr>
+            <m:deg/>
+            <m:e>
+              <m:sSubSup>
+                <m:sSubSupPr>
+                  <m:ctrlPr>
+                    <w:rPr>
+                      <w:rFonts w:ascii="Cambria Math" w:eastAsiaTheme="minorEastAsia" w:hAnsi="Cambria Math" w:cs="Times New Roman"/>
+                      <w:i/>
+                      <w:color w:val="000000"/>
+                      <w:szCs w:val="24"/>
+                      <w:lang w:val="en-US" w:eastAsia="en-US"/>
+                    </w:rPr>
+                  </m:ctrlPr>
+                </m:sSubSupPr>
+                <m:e>
+                  <m:r>
+                    <w:rPr>
+                      <w:rFonts w:ascii="Cambria Math" w:eastAsiaTheme="minorEastAsia" w:hAnsi="Cambria Math" w:cs="Times New Roman"/>
+                      <w:color w:val="000000"/>
+                      <w:szCs w:val="24"/>
+                      <w:lang w:val="en-US" w:eastAsia="en-US"/>
+                    </w:rPr>
+                    <m:t>v</m:t>
+                  </m:r>
+                </m:e>
+                <m:sub>
+                  <m:r>
+                    <w:rPr>
+                      <w:rFonts w:ascii="Cambria Math" w:eastAsiaTheme="minorEastAsia" w:hAnsi="Cambria Math" w:cs="Times New Roman"/>
+                      <w:color w:val="000000"/>
+                      <w:szCs w:val="24"/>
+                      <w:lang w:val="en-US" w:eastAsia="en-US"/>
+                    </w:rPr>
+                    <m:t>air</m:t>
+                  </m:r>
+                </m:sub>
+                <m:sup>
+                  <m:r>
+                    <w:rPr>
+                      <w:rFonts w:ascii="Cambria Math" w:eastAsiaTheme="minorEastAsia" w:hAnsi="Cambria Math" w:cs="Times New Roman"/>
+                      <w:color w:val="000000"/>
+                      <w:szCs w:val="24"/>
+                      <w:lang w:val="en-US" w:eastAsia="en-US"/>
+                    </w:rPr>
+                    <m:t>2</m:t>
+                  </m:r>
+                </m:sup>
+              </m:sSubSup>
+              <m:r>
+                <w:rPr>
+                  <w:rFonts w:ascii="Cambria Math" w:eastAsiaTheme="minorEastAsia" w:hAnsi="Cambria Math" w:cs="Times New Roman"/>
+                  <w:color w:val="000000"/>
+                  <w:szCs w:val="24"/>
+                  <w:lang w:val="en-US" w:eastAsia="en-US"/>
+                </w:rPr>
+                <m:t>-</m:t>
+              </m:r>
+              <m:sSup>
+                <m:sSupPr>
+                  <m:ctrlPr>
+                    <w:rPr>
+                      <w:rFonts w:ascii="Cambria Math" w:eastAsiaTheme="minorEastAsia" w:hAnsi="Cambria Math" w:cs="Times New Roman"/>
+                      <w:i/>
+                      <w:color w:val="000000"/>
+                      <w:szCs w:val="24"/>
+                      <w:lang w:val="en-US" w:eastAsia="en-US"/>
+                    </w:rPr>
+                  </m:ctrlPr>
+                </m:sSupPr>
+                <m:e>
+                  <m:sSub>
+                    <m:sSubPr>
+                      <m:ctrlPr>
+                        <w:rPr>
+                          <w:rFonts w:ascii="Cambria Math" w:eastAsiaTheme="minorEastAsia" w:hAnsi="Cambria Math" w:cs="Times New Roman"/>
+                          <w:i/>
+                          <w:color w:val="000000"/>
+                          <w:szCs w:val="24"/>
+                          <w:lang w:val="en-US" w:eastAsia="en-US"/>
+                        </w:rPr>
+                      </m:ctrlPr>
+                    </m:sSubPr>
+                    <m:e>
+                      <m:r>
+                        <w:rPr>
+                          <w:rFonts w:ascii="Cambria Math" w:eastAsiaTheme="minorEastAsia" w:hAnsi="Cambria Math" w:cs="Times New Roman"/>
+                          <w:color w:val="000000"/>
+                          <w:szCs w:val="24"/>
+                          <w:lang w:val="en-US" w:eastAsia="en-US"/>
+                        </w:rPr>
+                        <m:t>(u</m:t>
+                      </m:r>
+                    </m:e>
+                    <m:sub>
+                      <m:r>
+                        <w:rPr>
+                          <w:rFonts w:ascii="Cambria Math" w:eastAsiaTheme="minorEastAsia" w:hAnsi="Cambria Math" w:cs="Times New Roman"/>
+                          <w:color w:val="000000"/>
+                          <w:szCs w:val="24"/>
+                          <w:lang w:val="en-US" w:eastAsia="en-US"/>
+                        </w:rPr>
+                        <m:t>cross</m:t>
+                      </m:r>
+                    </m:sub>
+                  </m:sSub>
+                  <m:r>
+                    <w:rPr>
+                      <w:rFonts w:ascii="Cambria Math" w:eastAsiaTheme="minorEastAsia" w:hAnsi="Cambria Math" w:cs="Times New Roman"/>
+                      <w:color w:val="000000"/>
+                      <w:szCs w:val="24"/>
+                      <w:lang w:val="en-US" w:eastAsia="en-US"/>
+                    </w:rPr>
+                    <m:t>(e))</m:t>
+                  </m:r>
+                </m:e>
+                <m:sup>
+                  <m:r>
+                    <w:rPr>
+                      <w:rFonts w:ascii="Cambria Math" w:eastAsiaTheme="minorEastAsia" w:hAnsi="Cambria Math" w:cs="Times New Roman"/>
+                      <w:color w:val="000000"/>
+                      <w:szCs w:val="24"/>
+                      <w:lang w:val="en-US" w:eastAsia="en-US"/>
+                    </w:rPr>
+                    <m:t>2</m:t>
+                  </m:r>
+                </m:sup>
+              </m:sSup>
+            </m:e>
+          </m:rad>
+          <m:r>
+            <w:rPr>
+              <w:rFonts w:ascii="Cambria Math" w:eastAsiaTheme="minorEastAsia" w:hAnsi="Cambria Math" w:cs="Times New Roman"/>
+              <w:color w:val="000000"/>
+              <w:szCs w:val="24"/>
+              <w:lang w:val="uk-UA" w:eastAsia="en-US"/>
+            </w:rPr>
+            <m:t>+</m:t>
+          </m:r>
+          <m:sSub>
+            <m:sSubPr>
+              <m:ctrlPr>
+                <w:rPr>
+                  <w:rFonts w:ascii="Cambria Math" w:eastAsiaTheme="minorEastAsia" w:hAnsi="Cambria Math" w:cs="Times New Roman"/>
+                  <w:i/>
+                  <w:color w:val="000000"/>
+                  <w:szCs w:val="24"/>
+                  <w:lang w:val="uk-UA" w:eastAsia="en-US"/>
+                </w:rPr>
+              </m:ctrlPr>
+            </m:sSubPr>
+            <m:e>
+              <m:r>
+                <w:rPr>
+                  <w:rFonts w:ascii="Cambria Math" w:eastAsiaTheme="minorEastAsia" w:hAnsi="Cambria Math" w:cs="Times New Roman"/>
+                  <w:color w:val="000000"/>
+                  <w:szCs w:val="24"/>
+                  <w:lang w:val="uk-UA" w:eastAsia="en-US"/>
+                </w:rPr>
+                <m:t>u</m:t>
+              </m:r>
+            </m:e>
+            <m:sub>
+              <m:r>
+                <w:rPr>
+                  <w:rFonts w:ascii="Cambria Math" w:eastAsiaTheme="minorEastAsia" w:hAnsi="Cambria Math" w:cs="Times New Roman"/>
+                  <w:color w:val="000000"/>
+                  <w:szCs w:val="24"/>
+                  <w:lang w:val="uk-UA" w:eastAsia="en-US"/>
+                </w:rPr>
+                <m:t>along</m:t>
+              </m:r>
+            </m:sub>
+          </m:sSub>
+          <m:r>
+            <w:rPr>
+              <w:rFonts w:ascii="Cambria Math" w:eastAsiaTheme="minorEastAsia" w:hAnsi="Cambria Math" w:cs="Times New Roman"/>
+              <w:color w:val="000000"/>
+              <w:szCs w:val="24"/>
+              <w:lang w:val="uk-UA" w:eastAsia="en-US"/>
+            </w:rPr>
+            <m:t xml:space="preserve">(e) </m:t>
+          </m:r>
+        </m:oMath>
+      </m:oMathPara>
+    </w:p>
+    <w:p>
+      <w:pPr>
+        <w:pStyle w:val="BodyTextIndent"/>
+        <w:ind w:firstLine="567"/>
+        <w:jc w:val="both"/>
+        <w:rPr>
+          <w:rFonts w:cs="Times New Roman"/>
+          <w:i/>
+          <w:color w:val="000000"/>
+          <w:szCs w:val="24"/>
+          <w:lang w:val="uk-UA" w:eastAsia="en-US"/>
+        </w:rPr>
+      </w:pPr>
+      <w:r>
+        <w:rPr>
+          <w:rFonts w:cs="Times New Roman"/>
+          <w:color w:val="000000"/>
+          <w:szCs w:val="24"/>
+          <w:lang w:val="uk-UA" w:eastAsia="en-US"/>
+        </w:rPr>
+        <w:t xml:space="preserve">Де </w:t>
+      </w:r>
+      <m:oMath>
+        <m:sSub>
+          <m:sSubPr>
+            <m:ctrlPr>
+              <w:rPr>
+                <w:rFonts w:ascii="Cambria Math" w:hAnsi="Cambria Math" w:cs="Times New Roman"/>
+                <w:i/>
+                <w:color w:val="000000"/>
+                <w:szCs w:val="24"/>
+                <w:lang w:val="uk-UA" w:eastAsia="en-US"/>
+              </w:rPr>
+            </m:ctrlPr>
+          </m:sSubPr>
+          <m:e>
+            <m:r>
+              <w:rPr>
+                <w:rFonts w:ascii="Cambria Math" w:hAnsi="Cambria Math" w:cs="Times New Roman"/>
+                <w:color w:val="000000"/>
+                <w:szCs w:val="24"/>
+                <w:lang w:val="uk-UA" w:eastAsia="en-US"/>
+              </w:rPr>
+              <m:t>v</m:t>
+            </m:r>
+          </m:e>
+          <m:sub>
+            <m:r>
+              <w:rPr>
+                <w:rFonts w:ascii="Cambria Math" w:hAnsi="Cambria Math" w:cs="Times New Roman"/>
+                <w:color w:val="000000"/>
+                <w:szCs w:val="24"/>
+                <w:lang w:val="uk-UA" w:eastAsia="en-US"/>
+              </w:rPr>
+              <m:t>g</m:t>
+            </m:r>
+          </m:sub>
+        </m:sSub>
+      </m:oMath>
+      <w:r>
+        <w:rPr>
+          <w:rFonts w:eastAsiaTheme="minorEastAsia" w:cs="Times New Roman"/>
+          <w:color w:val="000000"/>
+          <w:szCs w:val="24"/>
+          <w:lang w:val="en-US" w:eastAsia="en-US"/>
+        </w:rPr>
+        <w:t xml:space="preserve"> – </w:t>
+      </w:r>
+      <w:r>
+        <w:rPr>
+          <w:rFonts w:eastAsiaTheme="minorEastAsia" w:cs="Times New Roman"/>
+          <w:color w:val="000000"/>
+          <w:szCs w:val="24"/>
+          <w:lang w:val="uk-UA" w:eastAsia="en-US"/>
+        </w:rPr>
+        <w:t xml:space="preserve">швидкість руху БПС відносно землі з урахуванням напрямку вітру, </w:t>
+      </w:r>
+      <m:oMath>
+        <m:r>
+          <w:rPr>
+            <w:rFonts w:ascii="Cambria Math" w:eastAsiaTheme="minorEastAsia" w:hAnsi="Cambria Math" w:cs="Times New Roman"/>
+            <w:color w:val="000000"/>
+            <w:szCs w:val="24"/>
+            <w:lang w:val="uk-UA" w:eastAsia="en-US"/>
+          </w:rPr>
+          <m:t>d(e)</m:t>
+        </m:r>
+      </m:oMath>
+      <w:r>
+        <w:rPr>
+          <w:rFonts w:eastAsiaTheme="minorEastAsia" w:cs="Times New Roman"/>
+          <w:color w:val="000000"/>
+          <w:szCs w:val="24"/>
+          <w:lang w:val="uk-UA" w:eastAsia="en-US"/>
+        </w:rPr>
+        <w:t xml:space="preserve"> </w:t>
+      </w:r>
+      <w:r>
+        <w:rPr>
+          <w:rFonts w:eastAsiaTheme="minorEastAsia" w:cs="Times New Roman"/>
+          <w:color w:val="000000"/>
+          <w:szCs w:val="24"/>
+          <w:lang w:val="en-US" w:eastAsia="en-US"/>
+        </w:rPr>
+        <w:t xml:space="preserve">– </w:t>
+      </w:r>
+      <w:r>
+        <w:rPr>
+          <w:rFonts w:eastAsiaTheme="minorEastAsia" w:cs="Times New Roman"/>
+          <w:color w:val="000000"/>
+          <w:szCs w:val="24"/>
+          <w:lang w:val="uk-UA" w:eastAsia="en-US"/>
+        </w:rPr>
+        <w:t xml:space="preserve">довжина ребра. </w:t>
+      </w:r>
+      <w:bookmarkStart w:id="0" w:name="_GoBack"/>
+      <w:bookmarkEnd w:id="0"/>
     </w:p>
     <w:p>
       <w:pPr>
@@ -2106,6 +3649,16 @@
       <w:lang w:eastAsia="pl-PL"/>
     </w:rPr>
   </w:style>
+  <w:style w:type="character" w:styleId="PlaceholderText">
+    <w:name w:val="Placeholder Text"/>
+    <w:basedOn w:val="DefaultParagraphFont"/>
+    <w:uiPriority w:val="99"/>
+    <w:semiHidden/>
+    <w:rsid w:val="00570D22"/>
+    <w:rPr>
+      <w:color w:val="808080"/>
+    </w:rPr>
+  </w:style>
 </w:styles>
 </file>
 

</xml_diff>

<commit_message>
added some new formulas to conference paper
</commit_message>
<xml_diff>
--- a/knowledgebase/conference_papers/wip/Тези_Українець_ІТОНТ.docx
+++ b/knowledgebase/conference_papers/wip/Тези_Українець_ІТОНТ.docx
@@ -382,7 +382,6 @@
           <w:lang w:val="en-GB"/>
         </w:rPr>
       </w:pPr>
-      <w:proofErr w:type="spellStart"/>
       <w:r>
         <w:rPr>
           <w:rFonts w:ascii="Times New Roman CYR" w:hAnsi="Times New Roman CYR" w:cs="Times New Roman CYR"/>
@@ -393,46 +392,7 @@
           <w:szCs w:val="24"/>
           <w:lang w:val="en-GB"/>
         </w:rPr>
-        <w:t>Kovbasiuk</w:t>
-      </w:r>
-      <w:proofErr w:type="spellEnd"/>
-      <w:r>
-        <w:rPr>
-          <w:rFonts w:ascii="Times New Roman CYR" w:hAnsi="Times New Roman CYR" w:cs="Times New Roman CYR"/>
-          <w:b/>
-          <w:bCs/>
-          <w:color w:val="000000"/>
-          <w:sz w:val="24"/>
-          <w:szCs w:val="24"/>
-          <w:lang w:val="en-GB"/>
-        </w:rPr>
-        <w:t xml:space="preserve"> S., </w:t>
-      </w:r>
-      <w:proofErr w:type="spellStart"/>
-      <w:r>
-        <w:rPr>
-          <w:rFonts w:ascii="Times New Roman CYR" w:hAnsi="Times New Roman CYR" w:cs="Times New Roman CYR"/>
-          <w:b/>
-          <w:bCs/>
-          <w:color w:val="000000"/>
-          <w:sz w:val="24"/>
-          <w:szCs w:val="24"/>
-          <w:lang w:val="en-GB"/>
-        </w:rPr>
-        <w:t>Ukrainets</w:t>
-      </w:r>
-      <w:proofErr w:type="spellEnd"/>
-      <w:r>
-        <w:rPr>
-          <w:rFonts w:ascii="Times New Roman CYR" w:hAnsi="Times New Roman CYR" w:cs="Times New Roman CYR"/>
-          <w:b/>
-          <w:bCs/>
-          <w:color w:val="000000"/>
-          <w:sz w:val="24"/>
-          <w:szCs w:val="24"/>
-          <w:lang w:val="en-GB"/>
-        </w:rPr>
-        <w:t xml:space="preserve"> M.</w:t>
+        <w:t>Kovbasiuk S., Ukrainets M.</w:t>
       </w:r>
     </w:p>
     <w:p>
@@ -608,25 +568,7 @@
           <w:szCs w:val="24"/>
           <w:lang w:val="uk-UA" w:eastAsia="en-US"/>
         </w:rPr>
-        <w:t xml:space="preserve"> (БПС) у складі безпілотних авіаційних комплексів (</w:t>
-      </w:r>
-      <w:proofErr w:type="spellStart"/>
-      <w:r>
-        <w:rPr>
-          <w:rFonts w:ascii="Times New Roman CYR" w:hAnsi="Times New Roman CYR" w:cs="Times New Roman CYR"/>
-          <w:szCs w:val="24"/>
-          <w:lang w:val="uk-UA" w:eastAsia="en-US"/>
-        </w:rPr>
-        <w:t>БпАК</w:t>
-      </w:r>
-      <w:proofErr w:type="spellEnd"/>
-      <w:r>
-        <w:rPr>
-          <w:rFonts w:ascii="Times New Roman CYR" w:hAnsi="Times New Roman CYR" w:cs="Times New Roman CYR"/>
-          <w:szCs w:val="24"/>
-          <w:lang w:val="uk-UA" w:eastAsia="en-US"/>
-        </w:rPr>
-        <w:t>)</w:t>
+        <w:t xml:space="preserve"> (БПС) у складі безпілотних авіаційних комплексів (БпАК)</w:t>
       </w:r>
       <w:r>
         <w:rPr>
@@ -840,25 +782,7 @@
           <w:szCs w:val="24"/>
           <w:lang w:val="uk-UA" w:eastAsia="en-US"/>
         </w:rPr>
-        <w:t xml:space="preserve"> вирішує два </w:t>
-      </w:r>
-      <w:proofErr w:type="spellStart"/>
-      <w:r>
-        <w:rPr>
-          <w:rFonts w:ascii="Times New Roman CYR" w:hAnsi="Times New Roman CYR" w:cs="Times New Roman CYR"/>
-          <w:szCs w:val="24"/>
-          <w:lang w:val="uk-UA" w:eastAsia="en-US"/>
-        </w:rPr>
-        <w:t>підзавдання</w:t>
-      </w:r>
-      <w:proofErr w:type="spellEnd"/>
-      <w:r>
-        <w:rPr>
-          <w:rFonts w:ascii="Times New Roman CYR" w:hAnsi="Times New Roman CYR" w:cs="Times New Roman CYR"/>
-          <w:szCs w:val="24"/>
-          <w:lang w:val="uk-UA" w:eastAsia="en-US"/>
-        </w:rPr>
-        <w:t xml:space="preserve">: </w:t>
+        <w:t xml:space="preserve"> вирішує два підзавдання: </w:t>
       </w:r>
       <w:r>
         <w:rPr>
@@ -898,25 +822,7 @@
           <w:szCs w:val="24"/>
           <w:lang w:val="uk-UA" w:eastAsia="en-US"/>
         </w:rPr>
-        <w:t xml:space="preserve">Одним з найбільш поширених підходів до планування маршруту руху БПС в складі </w:t>
-      </w:r>
-      <w:proofErr w:type="spellStart"/>
-      <w:r>
-        <w:rPr>
-          <w:rFonts w:ascii="Times New Roman CYR" w:hAnsi="Times New Roman CYR" w:cs="Times New Roman CYR"/>
-          <w:szCs w:val="24"/>
-          <w:lang w:val="uk-UA" w:eastAsia="en-US"/>
-        </w:rPr>
-        <w:t>БпАК</w:t>
-      </w:r>
-      <w:proofErr w:type="spellEnd"/>
-      <w:r>
-        <w:rPr>
-          <w:rFonts w:ascii="Times New Roman CYR" w:hAnsi="Times New Roman CYR" w:cs="Times New Roman CYR"/>
-          <w:szCs w:val="24"/>
-          <w:lang w:val="uk-UA" w:eastAsia="en-US"/>
-        </w:rPr>
-        <w:t xml:space="preserve"> є ручна побудова маршруту</w:t>
+        <w:t>Одним з найбільш поширених підходів до планування маршруту руху БПС в складі БпАК є ручна побудова маршруту</w:t>
       </w:r>
       <w:r>
         <w:rPr>
@@ -1158,25 +1064,7 @@
           <w:szCs w:val="24"/>
           <w:lang w:val="uk-UA" w:eastAsia="en-US"/>
         </w:rPr>
-        <w:t xml:space="preserve">пошуку оптимального маршруту БПС в складі </w:t>
-      </w:r>
-      <w:proofErr w:type="spellStart"/>
-      <w:r>
-        <w:rPr>
-          <w:rFonts w:ascii="Times New Roman CYR" w:hAnsi="Times New Roman CYR" w:cs="Times New Roman CYR"/>
-          <w:szCs w:val="24"/>
-          <w:lang w:val="uk-UA" w:eastAsia="en-US"/>
-        </w:rPr>
-        <w:t>БпАК</w:t>
-      </w:r>
-      <w:proofErr w:type="spellEnd"/>
-      <w:r>
-        <w:rPr>
-          <w:rFonts w:ascii="Times New Roman CYR" w:hAnsi="Times New Roman CYR" w:cs="Times New Roman CYR"/>
-          <w:szCs w:val="24"/>
-          <w:lang w:val="uk-UA" w:eastAsia="en-US"/>
-        </w:rPr>
-        <w:t xml:space="preserve"> на основі різнорідних даних</w:t>
+        <w:t>пошуку оптимального маршруту БПС в складі БпАК на основі різнорідних даних</w:t>
       </w:r>
       <w:r>
         <w:rPr>
@@ -1238,25 +1126,7 @@
           <w:szCs w:val="24"/>
           <w:lang w:val="uk-UA" w:eastAsia="en-US"/>
         </w:rPr>
-        <w:t xml:space="preserve"> Виконання завдання покладеного на БПС в складі </w:t>
-      </w:r>
-      <w:proofErr w:type="spellStart"/>
-      <w:r>
-        <w:rPr>
-          <w:rFonts w:ascii="Times New Roman CYR" w:hAnsi="Times New Roman CYR" w:cs="Times New Roman CYR"/>
-          <w:szCs w:val="24"/>
-          <w:lang w:val="uk-UA" w:eastAsia="en-US"/>
-        </w:rPr>
-        <w:t>БпАК</w:t>
-      </w:r>
-      <w:proofErr w:type="spellEnd"/>
-      <w:r>
-        <w:rPr>
-          <w:rFonts w:ascii="Times New Roman CYR" w:hAnsi="Times New Roman CYR" w:cs="Times New Roman CYR"/>
-          <w:szCs w:val="24"/>
-          <w:lang w:val="uk-UA" w:eastAsia="en-US"/>
-        </w:rPr>
-        <w:t xml:space="preserve"> </w:t>
+        <w:t xml:space="preserve"> Виконання завдання покладеного на БПС в складі БпАК </w:t>
       </w:r>
       <w:r>
         <w:rPr>
@@ -1328,25 +1198,7 @@
           <w:szCs w:val="24"/>
           <w:lang w:val="uk-UA" w:eastAsia="en-US"/>
         </w:rPr>
-        <w:t xml:space="preserve">застосовується гібридний підхід, який поєднує візуальну навігацію на основі </w:t>
-      </w:r>
-      <w:proofErr w:type="spellStart"/>
-      <w:r>
-        <w:rPr>
-          <w:rFonts w:ascii="Times New Roman CYR" w:hAnsi="Times New Roman CYR" w:cs="Times New Roman CYR"/>
-          <w:szCs w:val="24"/>
-          <w:lang w:val="uk-UA" w:eastAsia="en-US"/>
-        </w:rPr>
-        <w:t>геоприв’язаних</w:t>
-      </w:r>
-      <w:proofErr w:type="spellEnd"/>
-      <w:r>
-        <w:rPr>
-          <w:rFonts w:ascii="Times New Roman CYR" w:hAnsi="Times New Roman CYR" w:cs="Times New Roman CYR"/>
-          <w:szCs w:val="24"/>
-          <w:lang w:val="uk-UA" w:eastAsia="en-US"/>
-        </w:rPr>
-        <w:t xml:space="preserve"> супутникових знімків та </w:t>
+        <w:t xml:space="preserve">застосовується гібридний підхід, який поєднує візуальну навігацію на основі геоприв’язаних супутникових знімків та </w:t>
       </w:r>
       <w:r>
         <w:rPr>
@@ -1601,25 +1453,7 @@
           <w:szCs w:val="24"/>
           <w:lang w:val="uk-UA" w:eastAsia="en-US"/>
         </w:rPr>
-        <w:t xml:space="preserve">: </w:t>
-      </w:r>
-      <w:proofErr w:type="spellStart"/>
-      <w:r>
-        <w:rPr>
-          <w:rFonts w:ascii="Times New Roman CYR" w:hAnsi="Times New Roman CYR" w:cs="Times New Roman CYR"/>
-          <w:szCs w:val="24"/>
-          <w:lang w:val="uk-UA" w:eastAsia="en-US"/>
-        </w:rPr>
-        <w:t>геоприв’язаний</w:t>
-      </w:r>
-      <w:proofErr w:type="spellEnd"/>
-      <w:r>
-        <w:rPr>
-          <w:rFonts w:ascii="Times New Roman CYR" w:hAnsi="Times New Roman CYR" w:cs="Times New Roman CYR"/>
-          <w:szCs w:val="24"/>
-          <w:lang w:val="uk-UA" w:eastAsia="en-US"/>
-        </w:rPr>
-        <w:t xml:space="preserve"> супутниковий знімок, карта висот, карта вітру, </w:t>
+        <w:t xml:space="preserve">: геоприв’язаний супутниковий знімок, карта висот, карта вітру, </w:t>
       </w:r>
       <w:r>
         <w:rPr>
@@ -2111,25 +1945,7 @@
           <w:szCs w:val="24"/>
           <w:lang w:val="uk-UA" w:eastAsia="en-US"/>
         </w:rPr>
-        <w:t xml:space="preserve">Множина </w:t>
-      </w:r>
-      <w:proofErr w:type="spellStart"/>
-      <w:r>
-        <w:rPr>
-          <w:rFonts w:eastAsiaTheme="minorEastAsia" w:cs="Times New Roman"/>
-          <w:szCs w:val="24"/>
-          <w:lang w:val="uk-UA" w:eastAsia="en-US"/>
-        </w:rPr>
-        <w:t>ребер</w:t>
-      </w:r>
-      <w:proofErr w:type="spellEnd"/>
-      <w:r>
-        <w:rPr>
-          <w:rFonts w:eastAsiaTheme="minorEastAsia" w:cs="Times New Roman"/>
-          <w:szCs w:val="24"/>
-          <w:lang w:val="uk-UA" w:eastAsia="en-US"/>
-        </w:rPr>
-        <w:t xml:space="preserve"> маршруту:</w:t>
+        <w:t>Множина ребер маршруту:</w:t>
       </w:r>
     </w:p>
     <w:p>
@@ -2341,27 +2157,7 @@
           <w:szCs w:val="24"/>
           <w:lang w:val="uk-UA" w:eastAsia="en-US"/>
         </w:rPr>
-        <w:t xml:space="preserve">у важливість тривалості польоту, </w:t>
-      </w:r>
-      <w:proofErr w:type="spellStart"/>
-      <w:r>
-        <w:rPr>
-          <w:rFonts w:eastAsiaTheme="minorEastAsia" w:cs="Times New Roman"/>
-          <w:color w:val="000000"/>
-          <w:szCs w:val="24"/>
-          <w:lang w:val="uk-UA" w:eastAsia="en-US"/>
-        </w:rPr>
-        <w:t>запишемо</w:t>
-      </w:r>
-      <w:proofErr w:type="spellEnd"/>
-      <w:r>
-        <w:rPr>
-          <w:rFonts w:eastAsiaTheme="minorEastAsia" w:cs="Times New Roman"/>
-          <w:color w:val="000000"/>
-          <w:szCs w:val="24"/>
-          <w:lang w:val="uk-UA" w:eastAsia="en-US"/>
-        </w:rPr>
-        <w:t xml:space="preserve"> функцію для часу польоту:</w:t>
+        <w:t>у важливість тривалості польоту, запишемо функцію для часу польоту:</w:t>
       </w:r>
     </w:p>
     <w:p>
@@ -2497,8 +2293,50 @@
             </m:sub>
             <m:sup/>
             <m:e>
-              <m:f>
-                <m:fPr>
+              <m:r>
+                <w:rPr>
+                  <w:rFonts w:ascii="Cambria Math" w:hAnsi="Cambria Math" w:cs="Times New Roman"/>
+                  <w:color w:val="000000"/>
+                  <w:szCs w:val="24"/>
+                  <w:lang w:val="uk-UA" w:eastAsia="en-US"/>
+                </w:rPr>
+                <m:t>t(e)</m:t>
+              </m:r>
+            </m:e>
+          </m:nary>
+          <m:r>
+            <w:rPr>
+              <w:rFonts w:ascii="Cambria Math" w:hAnsi="Cambria Math" w:cs="Times New Roman"/>
+              <w:color w:val="000000"/>
+              <w:szCs w:val="24"/>
+              <w:lang w:val="uk-UA" w:eastAsia="en-US"/>
+            </w:rPr>
+            <m:t>=</m:t>
+          </m:r>
+          <m:f>
+            <m:fPr>
+              <m:ctrlPr>
+                <w:rPr>
+                  <w:rFonts w:ascii="Cambria Math" w:hAnsi="Cambria Math" w:cs="Times New Roman"/>
+                  <w:i/>
+                  <w:color w:val="000000"/>
+                  <w:szCs w:val="24"/>
+                  <w:lang w:val="uk-UA" w:eastAsia="en-US"/>
+                </w:rPr>
+              </m:ctrlPr>
+            </m:fPr>
+            <m:num>
+              <m:r>
+                <w:rPr>
+                  <w:rFonts w:ascii="Cambria Math" w:hAnsi="Cambria Math" w:cs="Times New Roman"/>
+                  <w:color w:val="000000"/>
+                  <w:szCs w:val="24"/>
+                  <w:lang w:val="uk-UA" w:eastAsia="en-US"/>
+                </w:rPr>
+                <m:t>d</m:t>
+              </m:r>
+              <m:d>
+                <m:dPr>
                   <m:ctrlPr>
                     <w:rPr>
                       <w:rFonts w:ascii="Cambria Math" w:hAnsi="Cambria Math" w:cs="Times New Roman"/>
@@ -2508,8 +2346,8 @@
                       <w:lang w:val="uk-UA" w:eastAsia="en-US"/>
                     </w:rPr>
                   </m:ctrlPr>
-                </m:fPr>
-                <m:num>
+                </m:dPr>
+                <m:e>
                   <m:r>
                     <w:rPr>
                       <w:rFonts w:ascii="Cambria Math" w:hAnsi="Cambria Math" w:cs="Times New Roman"/>
@@ -2517,69 +2355,25 @@
                       <w:szCs w:val="24"/>
                       <w:lang w:val="uk-UA" w:eastAsia="en-US"/>
                     </w:rPr>
-                    <m:t>d</m:t>
+                    <m:t>e</m:t>
                   </m:r>
-                  <m:d>
-                    <m:dPr>
-                      <m:ctrlPr>
-                        <w:rPr>
-                          <w:rFonts w:ascii="Cambria Math" w:hAnsi="Cambria Math" w:cs="Times New Roman"/>
-                          <w:i/>
-                          <w:color w:val="000000"/>
-                          <w:szCs w:val="24"/>
-                          <w:lang w:val="uk-UA" w:eastAsia="en-US"/>
-                        </w:rPr>
-                      </m:ctrlPr>
-                    </m:dPr>
-                    <m:e>
-                      <m:r>
-                        <w:rPr>
-                          <w:rFonts w:ascii="Cambria Math" w:hAnsi="Cambria Math" w:cs="Times New Roman"/>
-                          <w:color w:val="000000"/>
-                          <w:szCs w:val="24"/>
-                          <w:lang w:val="uk-UA" w:eastAsia="en-US"/>
-                        </w:rPr>
-                        <m:t>e</m:t>
-                      </m:r>
-                    </m:e>
-                  </m:d>
-                </m:num>
-                <m:den>
-                  <m:sSub>
-                    <m:sSubPr>
-                      <m:ctrlPr>
-                        <w:rPr>
-                          <w:rFonts w:ascii="Cambria Math" w:hAnsi="Cambria Math" w:cs="Times New Roman"/>
-                          <w:i/>
-                          <w:color w:val="000000"/>
-                          <w:szCs w:val="24"/>
-                          <w:lang w:val="uk-UA" w:eastAsia="en-US"/>
-                        </w:rPr>
-                      </m:ctrlPr>
-                    </m:sSubPr>
-                    <m:e>
-                      <m:r>
-                        <w:rPr>
-                          <w:rFonts w:ascii="Cambria Math" w:hAnsi="Cambria Math" w:cs="Times New Roman"/>
-                          <w:color w:val="000000"/>
-                          <w:szCs w:val="24"/>
-                          <w:lang w:val="uk-UA" w:eastAsia="en-US"/>
-                        </w:rPr>
-                        <m:t>v</m:t>
-                      </m:r>
-                    </m:e>
-                    <m:sub>
-                      <m:r>
-                        <w:rPr>
-                          <w:rFonts w:ascii="Cambria Math" w:hAnsi="Cambria Math" w:cs="Times New Roman"/>
-                          <w:color w:val="000000"/>
-                          <w:szCs w:val="24"/>
-                          <w:lang w:val="uk-UA" w:eastAsia="en-US"/>
-                        </w:rPr>
-                        <m:t>g</m:t>
-                      </m:r>
-                    </m:sub>
-                  </m:sSub>
+                </m:e>
+              </m:d>
+            </m:num>
+            <m:den>
+              <m:sSub>
+                <m:sSubPr>
+                  <m:ctrlPr>
+                    <w:rPr>
+                      <w:rFonts w:ascii="Cambria Math" w:hAnsi="Cambria Math" w:cs="Times New Roman"/>
+                      <w:i/>
+                      <w:color w:val="000000"/>
+                      <w:szCs w:val="24"/>
+                      <w:lang w:val="uk-UA" w:eastAsia="en-US"/>
+                    </w:rPr>
+                  </m:ctrlPr>
+                </m:sSubPr>
+                <m:e>
                   <m:r>
                     <w:rPr>
                       <w:rFonts w:ascii="Cambria Math" w:hAnsi="Cambria Math" w:cs="Times New Roman"/>
@@ -2587,12 +2381,32 @@
                       <w:szCs w:val="24"/>
                       <w:lang w:val="uk-UA" w:eastAsia="en-US"/>
                     </w:rPr>
-                    <m:t>(e)</m:t>
+                    <m:t>v</m:t>
                   </m:r>
-                </m:den>
-              </m:f>
-            </m:e>
-          </m:nary>
+                </m:e>
+                <m:sub>
+                  <m:r>
+                    <w:rPr>
+                      <w:rFonts w:ascii="Cambria Math" w:hAnsi="Cambria Math" w:cs="Times New Roman"/>
+                      <w:color w:val="000000"/>
+                      <w:szCs w:val="24"/>
+                      <w:lang w:val="uk-UA" w:eastAsia="en-US"/>
+                    </w:rPr>
+                    <m:t>g</m:t>
+                  </m:r>
+                </m:sub>
+              </m:sSub>
+              <m:r>
+                <w:rPr>
+                  <w:rFonts w:ascii="Cambria Math" w:hAnsi="Cambria Math" w:cs="Times New Roman"/>
+                  <w:color w:val="000000"/>
+                  <w:szCs w:val="24"/>
+                  <w:lang w:val="uk-UA" w:eastAsia="en-US"/>
+                </w:rPr>
+                <m:t>(e)</m:t>
+              </m:r>
+            </m:den>
+          </m:f>
           <m:r>
             <w:rPr>
               <w:rFonts w:ascii="Cambria Math" w:eastAsiaTheme="minorEastAsia" w:hAnsi="Cambria Math" w:cs="Times New Roman"/>
@@ -2859,8 +2673,7 @@
         <w:ind w:firstLine="567"/>
         <w:jc w:val="both"/>
         <w:rPr>
-          <w:rFonts w:cs="Times New Roman"/>
-          <w:i/>
+          <w:rFonts w:eastAsiaTheme="minorEastAsia" w:cs="Times New Roman"/>
           <w:color w:val="000000"/>
           <w:szCs w:val="24"/>
           <w:lang w:val="uk-UA" w:eastAsia="en-US"/>
@@ -2928,7 +2741,142 @@
           <w:szCs w:val="24"/>
           <w:lang w:val="uk-UA" w:eastAsia="en-US"/>
         </w:rPr>
-        <w:t xml:space="preserve">швидкість руху БПС відносно землі з урахуванням напрямку вітру, </w:t>
+        <w:t xml:space="preserve">швидкість руху БПС відносно землі з урахуванням </w:t>
+      </w:r>
+      <w:r>
+        <w:rPr>
+          <w:rFonts w:eastAsiaTheme="minorEastAsia" w:cs="Times New Roman"/>
+          <w:color w:val="000000"/>
+          <w:szCs w:val="24"/>
+          <w:lang w:val="uk-UA" w:eastAsia="en-US"/>
+        </w:rPr>
+        <w:t>швидкості</w:t>
+      </w:r>
+      <w:r>
+        <w:rPr>
+          <w:rFonts w:eastAsiaTheme="minorEastAsia" w:cs="Times New Roman"/>
+          <w:color w:val="000000"/>
+          <w:szCs w:val="24"/>
+          <w:lang w:val="uk-UA" w:eastAsia="en-US"/>
+        </w:rPr>
+        <w:t xml:space="preserve"> вітру</w:t>
+      </w:r>
+      <w:r>
+        <w:rPr>
+          <w:rFonts w:eastAsiaTheme="minorEastAsia" w:cs="Times New Roman"/>
+          <w:color w:val="000000"/>
+          <w:szCs w:val="24"/>
+          <w:lang w:val="en-US" w:eastAsia="en-US"/>
+        </w:rPr>
+        <w:t xml:space="preserve"> </w:t>
+      </w:r>
+      <w:r>
+        <w:rPr>
+          <w:rFonts w:eastAsiaTheme="minorEastAsia" w:cs="Times New Roman"/>
+          <w:color w:val="000000"/>
+          <w:szCs w:val="24"/>
+          <w:lang w:val="en-US" w:eastAsia="en-US"/>
+        </w:rPr>
+        <w:t>(</w:t>
+      </w:r>
+      <m:oMath>
+        <m:sSub>
+          <m:sSubPr>
+            <m:ctrlPr>
+              <w:rPr>
+                <w:rFonts w:ascii="Cambria Math" w:eastAsiaTheme="minorEastAsia" w:hAnsi="Cambria Math" w:cs="Times New Roman"/>
+                <w:i/>
+                <w:color w:val="000000"/>
+                <w:szCs w:val="24"/>
+                <w:lang w:val="en-US" w:eastAsia="en-US"/>
+              </w:rPr>
+            </m:ctrlPr>
+          </m:sSubPr>
+          <m:e>
+            <m:r>
+              <w:rPr>
+                <w:rFonts w:ascii="Cambria Math" w:eastAsiaTheme="minorEastAsia" w:hAnsi="Cambria Math" w:cs="Times New Roman"/>
+                <w:color w:val="000000"/>
+                <w:szCs w:val="24"/>
+                <w:lang w:val="en-US" w:eastAsia="en-US"/>
+              </w:rPr>
+              <m:t>u</m:t>
+            </m:r>
+          </m:e>
+          <m:sub>
+            <m:r>
+              <w:rPr>
+                <w:rFonts w:ascii="Cambria Math" w:eastAsiaTheme="minorEastAsia" w:hAnsi="Cambria Math" w:cs="Times New Roman"/>
+                <w:color w:val="000000"/>
+                <w:szCs w:val="24"/>
+                <w:lang w:val="en-US" w:eastAsia="en-US"/>
+              </w:rPr>
+              <m:t>cross</m:t>
+            </m:r>
+          </m:sub>
+        </m:sSub>
+        <m:r>
+          <w:rPr>
+            <w:rFonts w:ascii="Cambria Math" w:eastAsiaTheme="minorEastAsia" w:hAnsi="Cambria Math" w:cs="Times New Roman"/>
+            <w:color w:val="000000"/>
+            <w:szCs w:val="24"/>
+            <w:lang w:val="en-US" w:eastAsia="en-US"/>
+          </w:rPr>
+          <m:t xml:space="preserve">, </m:t>
+        </m:r>
+        <m:sSub>
+          <m:sSubPr>
+            <m:ctrlPr>
+              <w:rPr>
+                <w:rFonts w:ascii="Cambria Math" w:eastAsiaTheme="minorEastAsia" w:hAnsi="Cambria Math" w:cs="Times New Roman"/>
+                <w:i/>
+                <w:color w:val="000000"/>
+                <w:szCs w:val="24"/>
+                <w:lang w:val="en-US" w:eastAsia="en-US"/>
+              </w:rPr>
+            </m:ctrlPr>
+          </m:sSubPr>
+          <m:e>
+            <m:r>
+              <w:rPr>
+                <w:rFonts w:ascii="Cambria Math" w:eastAsiaTheme="minorEastAsia" w:hAnsi="Cambria Math" w:cs="Times New Roman"/>
+                <w:color w:val="000000"/>
+                <w:szCs w:val="24"/>
+                <w:lang w:val="en-US" w:eastAsia="en-US"/>
+              </w:rPr>
+              <m:t>u</m:t>
+            </m:r>
+          </m:e>
+          <m:sub>
+            <m:r>
+              <w:rPr>
+                <w:rFonts w:ascii="Cambria Math" w:eastAsiaTheme="minorEastAsia" w:hAnsi="Cambria Math" w:cs="Times New Roman"/>
+                <w:color w:val="000000"/>
+                <w:szCs w:val="24"/>
+                <w:lang w:val="en-US" w:eastAsia="en-US"/>
+              </w:rPr>
+              <m:t>along</m:t>
+            </m:r>
+          </m:sub>
+        </m:sSub>
+      </m:oMath>
+      <w:r>
+        <w:rPr>
+          <w:rFonts w:eastAsiaTheme="minorEastAsia" w:cs="Times New Roman"/>
+          <w:color w:val="000000"/>
+          <w:szCs w:val="24"/>
+          <w:lang w:val="en-US" w:eastAsia="en-US"/>
+        </w:rPr>
+        <w:t>)</w:t>
+      </w:r>
+      <w:r>
+        <w:rPr>
+          <w:rFonts w:eastAsiaTheme="minorEastAsia" w:cs="Times New Roman"/>
+          <w:color w:val="000000"/>
+          <w:szCs w:val="24"/>
+          <w:lang w:val="uk-UA" w:eastAsia="en-US"/>
+        </w:rPr>
+        <w:t xml:space="preserve">, </w:t>
       </w:r>
       <m:oMath>
         <m:r>
@@ -2967,6 +2915,440 @@
           <w:lang w:val="uk-UA" w:eastAsia="en-US"/>
         </w:rPr>
         <w:t xml:space="preserve">довжина ребра. </w:t>
+      </w:r>
+      <w:r>
+        <w:rPr>
+          <w:rFonts w:eastAsiaTheme="minorEastAsia" w:cs="Times New Roman"/>
+          <w:color w:val="000000"/>
+          <w:szCs w:val="24"/>
+          <w:lang w:val="uk-UA" w:eastAsia="en-US"/>
+        </w:rPr>
+        <w:t xml:space="preserve">Наступним опишемо критерій насиченості візуальними ознаками, який визначає наскільки багато є візуальних орієнтирів </w:t>
+      </w:r>
+      <w:r>
+        <w:rPr>
+          <w:rFonts w:eastAsiaTheme="minorEastAsia" w:cs="Times New Roman"/>
+          <w:color w:val="000000"/>
+          <w:szCs w:val="24"/>
+          <w:lang w:val="uk-UA" w:eastAsia="en-US"/>
+        </w:rPr>
+        <w:t>на по</w:t>
+      </w:r>
+      <w:r>
+        <w:rPr>
+          <w:rFonts w:eastAsiaTheme="minorEastAsia" w:cs="Times New Roman"/>
+          <w:color w:val="000000"/>
+          <w:szCs w:val="24"/>
+          <w:lang w:val="uk-UA" w:eastAsia="en-US"/>
+        </w:rPr>
+        <w:t>верхні над якою пролягає ребро:</w:t>
+      </w:r>
+    </w:p>
+    <w:p>
+      <w:pPr>
+        <w:pStyle w:val="BodyTextIndent"/>
+        <w:ind w:firstLine="567"/>
+        <w:jc w:val="both"/>
+        <w:rPr>
+          <w:rFonts w:eastAsiaTheme="minorEastAsia" w:cs="Times New Roman"/>
+          <w:i/>
+          <w:color w:val="000000"/>
+          <w:szCs w:val="24"/>
+          <w:lang w:val="en-US" w:eastAsia="en-US"/>
+        </w:rPr>
+      </w:pPr>
+      <m:oMathPara>
+        <m:oMath>
+          <m:sSub>
+            <m:sSubPr>
+              <m:ctrlPr>
+                <w:rPr>
+                  <w:rFonts w:ascii="Cambria Math" w:hAnsi="Cambria Math" w:cs="Times New Roman"/>
+                  <w:i/>
+                  <w:color w:val="000000"/>
+                  <w:szCs w:val="24"/>
+                  <w:lang w:val="uk-UA" w:eastAsia="en-US"/>
+                </w:rPr>
+              </m:ctrlPr>
+            </m:sSubPr>
+            <m:e>
+              <m:r>
+                <w:rPr>
+                  <w:rFonts w:ascii="Cambria Math" w:hAnsi="Cambria Math" w:cs="Times New Roman"/>
+                  <w:color w:val="000000"/>
+                  <w:szCs w:val="24"/>
+                  <w:lang w:val="uk-UA" w:eastAsia="en-US"/>
+                </w:rPr>
+                <m:t>f</m:t>
+              </m:r>
+            </m:e>
+            <m:sub>
+              <m:r>
+                <w:rPr>
+                  <w:rFonts w:ascii="Cambria Math" w:hAnsi="Cambria Math" w:cs="Times New Roman"/>
+                  <w:color w:val="000000"/>
+                  <w:szCs w:val="24"/>
+                  <w:lang w:val="uk-UA" w:eastAsia="en-US"/>
+                </w:rPr>
+                <m:t>2</m:t>
+              </m:r>
+            </m:sub>
+          </m:sSub>
+          <m:d>
+            <m:dPr>
+              <m:ctrlPr>
+                <w:rPr>
+                  <w:rFonts w:ascii="Cambria Math" w:hAnsi="Cambria Math" w:cs="Times New Roman"/>
+                  <w:i/>
+                  <w:color w:val="000000"/>
+                  <w:szCs w:val="24"/>
+                  <w:lang w:val="uk-UA" w:eastAsia="en-US"/>
+                </w:rPr>
+              </m:ctrlPr>
+            </m:dPr>
+            <m:e>
+              <m:r>
+                <w:rPr>
+                  <w:rFonts w:ascii="Cambria Math" w:hAnsi="Cambria Math" w:cs="Times New Roman"/>
+                  <w:color w:val="000000"/>
+                  <w:szCs w:val="24"/>
+                  <w:lang w:val="uk-UA" w:eastAsia="en-US"/>
+                </w:rPr>
+                <m:t>P</m:t>
+              </m:r>
+            </m:e>
+          </m:d>
+          <m:r>
+            <w:rPr>
+              <w:rFonts w:ascii="Cambria Math" w:hAnsi="Cambria Math" w:cs="Times New Roman"/>
+              <w:color w:val="000000"/>
+              <w:szCs w:val="24"/>
+              <w:lang w:val="uk-UA" w:eastAsia="en-US"/>
+            </w:rPr>
+            <m:t>=</m:t>
+          </m:r>
+          <m:nary>
+            <m:naryPr>
+              <m:chr m:val="∑"/>
+              <m:limLoc m:val="undOvr"/>
+              <m:supHide m:val="1"/>
+              <m:ctrlPr>
+                <w:rPr>
+                  <w:rFonts w:ascii="Cambria Math" w:hAnsi="Cambria Math" w:cs="Times New Roman"/>
+                  <w:i/>
+                  <w:color w:val="000000"/>
+                  <w:szCs w:val="24"/>
+                  <w:lang w:val="uk-UA" w:eastAsia="en-US"/>
+                </w:rPr>
+              </m:ctrlPr>
+            </m:naryPr>
+            <m:sub>
+              <m:r>
+                <w:rPr>
+                  <w:rFonts w:ascii="Cambria Math" w:hAnsi="Cambria Math" w:cs="Times New Roman"/>
+                  <w:color w:val="000000"/>
+                  <w:szCs w:val="24"/>
+                  <w:lang w:val="uk-UA" w:eastAsia="en-US"/>
+                </w:rPr>
+                <m:t>e∈E</m:t>
+              </m:r>
+              <m:d>
+                <m:dPr>
+                  <m:ctrlPr>
+                    <w:rPr>
+                      <w:rFonts w:ascii="Cambria Math" w:hAnsi="Cambria Math" w:cs="Times New Roman"/>
+                      <w:i/>
+                      <w:color w:val="000000"/>
+                      <w:szCs w:val="24"/>
+                      <w:lang w:val="uk-UA" w:eastAsia="en-US"/>
+                    </w:rPr>
+                  </m:ctrlPr>
+                </m:dPr>
+                <m:e>
+                  <m:r>
+                    <w:rPr>
+                      <w:rFonts w:ascii="Cambria Math" w:hAnsi="Cambria Math" w:cs="Times New Roman"/>
+                      <w:color w:val="000000"/>
+                      <w:szCs w:val="24"/>
+                      <w:lang w:val="uk-UA" w:eastAsia="en-US"/>
+                    </w:rPr>
+                    <m:t>P</m:t>
+                  </m:r>
+                </m:e>
+              </m:d>
+            </m:sub>
+            <m:sup/>
+            <m:e>
+              <m:sSub>
+                <m:sSubPr>
+                  <m:ctrlPr>
+                    <w:rPr>
+                      <w:rFonts w:ascii="Cambria Math" w:hAnsi="Cambria Math" w:cs="Times New Roman"/>
+                      <w:i/>
+                      <w:color w:val="000000"/>
+                      <w:szCs w:val="24"/>
+                      <w:lang w:val="uk-UA" w:eastAsia="en-US"/>
+                    </w:rPr>
+                  </m:ctrlPr>
+                </m:sSubPr>
+                <m:e>
+                  <m:r>
+                    <w:rPr>
+                      <w:rFonts w:ascii="Cambria Math" w:hAnsi="Cambria Math" w:cs="Times New Roman"/>
+                      <w:color w:val="000000"/>
+                      <w:szCs w:val="24"/>
+                      <w:lang w:val="uk-UA" w:eastAsia="en-US"/>
+                    </w:rPr>
+                    <m:t>φ</m:t>
+                  </m:r>
+                </m:e>
+                <m:sub>
+                  <m:r>
+                    <w:rPr>
+                      <w:rFonts w:ascii="Cambria Math" w:hAnsi="Cambria Math" w:cs="Times New Roman"/>
+                      <w:color w:val="000000"/>
+                      <w:szCs w:val="24"/>
+                      <w:lang w:val="uk-UA" w:eastAsia="en-US"/>
+                    </w:rPr>
+                    <m:t>vis</m:t>
+                  </m:r>
+                </m:sub>
+              </m:sSub>
+              <m:r>
+                <w:rPr>
+                  <w:rFonts w:ascii="Cambria Math" w:hAnsi="Cambria Math" w:cs="Times New Roman"/>
+                  <w:color w:val="000000"/>
+                  <w:szCs w:val="24"/>
+                  <w:lang w:val="uk-UA" w:eastAsia="en-US"/>
+                </w:rPr>
+                <m:t>(</m:t>
+              </m:r>
+              <m:r>
+                <w:rPr>
+                  <w:rFonts w:ascii="Cambria Math" w:hAnsi="Cambria Math" w:cs="Times New Roman"/>
+                  <w:color w:val="000000"/>
+                  <w:szCs w:val="24"/>
+                  <w:lang w:val="en-US" w:eastAsia="en-US"/>
+                </w:rPr>
+                <m:t>e</m:t>
+              </m:r>
+              <m:r>
+                <w:rPr>
+                  <w:rFonts w:ascii="Cambria Math" w:hAnsi="Cambria Math" w:cs="Times New Roman"/>
+                  <w:color w:val="000000"/>
+                  <w:szCs w:val="24"/>
+                  <w:lang w:val="uk-UA" w:eastAsia="en-US"/>
+                </w:rPr>
+                <m:t>)</m:t>
+              </m:r>
+            </m:e>
+          </m:nary>
+          <m:r>
+            <w:rPr>
+              <w:rFonts w:ascii="Cambria Math" w:hAnsi="Cambria Math" w:cs="Times New Roman"/>
+              <w:color w:val="000000"/>
+              <w:szCs w:val="24"/>
+              <w:lang w:val="uk-UA" w:eastAsia="en-US"/>
+            </w:rPr>
+            <m:t>∙t</m:t>
+          </m:r>
+          <m:d>
+            <m:dPr>
+              <m:ctrlPr>
+                <w:rPr>
+                  <w:rFonts w:ascii="Cambria Math" w:hAnsi="Cambria Math" w:cs="Times New Roman"/>
+                  <w:i/>
+                  <w:color w:val="000000"/>
+                  <w:szCs w:val="24"/>
+                  <w:lang w:val="uk-UA" w:eastAsia="en-US"/>
+                </w:rPr>
+              </m:ctrlPr>
+            </m:dPr>
+            <m:e>
+              <m:r>
+                <w:rPr>
+                  <w:rFonts w:ascii="Cambria Math" w:hAnsi="Cambria Math" w:cs="Times New Roman"/>
+                  <w:color w:val="000000"/>
+                  <w:szCs w:val="24"/>
+                  <w:lang w:val="uk-UA" w:eastAsia="en-US"/>
+                </w:rPr>
+                <m:t>e</m:t>
+              </m:r>
+            </m:e>
+          </m:d>
+          <m:r>
+            <w:rPr>
+              <w:rFonts w:ascii="Cambria Math" w:eastAsiaTheme="minorEastAsia" w:hAnsi="Cambria Math" w:cs="Times New Roman"/>
+              <w:color w:val="000000"/>
+              <w:szCs w:val="24"/>
+              <w:lang w:val="uk-UA" w:eastAsia="en-US"/>
+            </w:rPr>
+            <m:t xml:space="preserve">,  </m:t>
+          </m:r>
+          <m:sSub>
+            <m:sSubPr>
+              <m:ctrlPr>
+                <w:rPr>
+                  <w:rFonts w:ascii="Cambria Math" w:hAnsi="Cambria Math" w:cs="Times New Roman"/>
+                  <w:i/>
+                  <w:color w:val="000000"/>
+                  <w:szCs w:val="24"/>
+                  <w:lang w:val="uk-UA" w:eastAsia="en-US"/>
+                </w:rPr>
+              </m:ctrlPr>
+            </m:sSubPr>
+            <m:e>
+              <m:r>
+                <w:rPr>
+                  <w:rFonts w:ascii="Cambria Math" w:hAnsi="Cambria Math" w:cs="Times New Roman"/>
+                  <w:color w:val="000000"/>
+                  <w:szCs w:val="24"/>
+                  <w:lang w:val="uk-UA" w:eastAsia="en-US"/>
+                </w:rPr>
+                <m:t>φ</m:t>
+              </m:r>
+            </m:e>
+            <m:sub>
+              <m:r>
+                <w:rPr>
+                  <w:rFonts w:ascii="Cambria Math" w:hAnsi="Cambria Math" w:cs="Times New Roman"/>
+                  <w:color w:val="000000"/>
+                  <w:szCs w:val="24"/>
+                  <w:lang w:val="uk-UA" w:eastAsia="en-US"/>
+                </w:rPr>
+                <m:t>vis</m:t>
+              </m:r>
+            </m:sub>
+          </m:sSub>
+          <m:r>
+            <w:rPr>
+              <w:rFonts w:ascii="Cambria Math" w:hAnsi="Cambria Math" w:cs="Times New Roman"/>
+              <w:color w:val="000000"/>
+              <w:szCs w:val="24"/>
+              <w:lang w:val="uk-UA" w:eastAsia="en-US"/>
+            </w:rPr>
+            <m:t>(e)</m:t>
+          </m:r>
+          <m:r>
+            <w:rPr>
+              <w:rFonts w:ascii="Cambria Math" w:hAnsi="Cambria Math" w:cs="Times New Roman"/>
+              <w:color w:val="000000"/>
+              <w:szCs w:val="24"/>
+              <w:lang w:val="uk-UA" w:eastAsia="en-US"/>
+            </w:rPr>
+            <m:t>∈</m:t>
+          </m:r>
+          <m:r>
+            <w:rPr>
+              <w:rFonts w:ascii="Cambria Math" w:hAnsi="Cambria Math" w:cs="Times New Roman"/>
+              <w:color w:val="000000"/>
+              <w:szCs w:val="24"/>
+              <w:lang w:val="en-US" w:eastAsia="en-US"/>
+            </w:rPr>
+            <m:t>[0,1]</m:t>
+          </m:r>
+        </m:oMath>
+      </m:oMathPara>
+    </w:p>
+    <w:p>
+      <w:pPr>
+        <w:pStyle w:val="BodyTextIndent"/>
+        <w:ind w:firstLine="567"/>
+        <w:jc w:val="both"/>
+        <w:rPr>
+          <w:rFonts w:cs="Times New Roman"/>
+          <w:color w:val="000000"/>
+          <w:szCs w:val="24"/>
+          <w:lang w:val="en-US" w:eastAsia="en-US"/>
+        </w:rPr>
+      </w:pPr>
+      <w:r>
+        <w:rPr>
+          <w:rFonts w:eastAsiaTheme="minorEastAsia" w:cs="Times New Roman"/>
+          <w:color w:val="000000"/>
+          <w:szCs w:val="24"/>
+          <w:lang w:val="uk-UA" w:eastAsia="en-US"/>
+        </w:rPr>
+        <w:t xml:space="preserve">Таким чином, чим довше БПС проводитиме часу над місцевістю з низькою насиченістю візуальними ознаками, тим </w:t>
+      </w:r>
+      <w:r>
+        <w:rPr>
+          <w:rFonts w:eastAsiaTheme="minorEastAsia" w:cs="Times New Roman"/>
+          <w:color w:val="000000"/>
+          <w:szCs w:val="24"/>
+          <w:lang w:val="uk-UA" w:eastAsia="en-US"/>
+        </w:rPr>
+        <w:t xml:space="preserve">гіршим буде значення </w:t>
+      </w:r>
+      <m:oMath>
+        <m:sSub>
+          <m:sSubPr>
+            <m:ctrlPr>
+              <w:rPr>
+                <w:rFonts w:ascii="Cambria Math" w:hAnsi="Cambria Math" w:cs="Times New Roman"/>
+                <w:i/>
+                <w:color w:val="000000"/>
+                <w:szCs w:val="24"/>
+                <w:lang w:val="uk-UA" w:eastAsia="en-US"/>
+              </w:rPr>
+            </m:ctrlPr>
+          </m:sSubPr>
+          <m:e>
+            <m:r>
+              <w:rPr>
+                <w:rFonts w:ascii="Cambria Math" w:hAnsi="Cambria Math" w:cs="Times New Roman"/>
+                <w:color w:val="000000"/>
+                <w:szCs w:val="24"/>
+                <w:lang w:val="uk-UA" w:eastAsia="en-US"/>
+              </w:rPr>
+              <m:t>f</m:t>
+            </m:r>
+          </m:e>
+          <m:sub>
+            <m:r>
+              <w:rPr>
+                <w:rFonts w:ascii="Cambria Math" w:hAnsi="Cambria Math" w:cs="Times New Roman"/>
+                <w:color w:val="000000"/>
+                <w:szCs w:val="24"/>
+                <w:lang w:val="uk-UA" w:eastAsia="en-US"/>
+              </w:rPr>
+              <m:t>2</m:t>
+            </m:r>
+          </m:sub>
+        </m:sSub>
+        <m:d>
+          <m:dPr>
+            <m:ctrlPr>
+              <w:rPr>
+                <w:rFonts w:ascii="Cambria Math" w:hAnsi="Cambria Math" w:cs="Times New Roman"/>
+                <w:i/>
+                <w:color w:val="000000"/>
+                <w:szCs w:val="24"/>
+                <w:lang w:val="uk-UA" w:eastAsia="en-US"/>
+              </w:rPr>
+            </m:ctrlPr>
+          </m:dPr>
+          <m:e>
+            <m:r>
+              <w:rPr>
+                <w:rFonts w:ascii="Cambria Math" w:hAnsi="Cambria Math" w:cs="Times New Roman"/>
+                <w:color w:val="000000"/>
+                <w:szCs w:val="24"/>
+                <w:lang w:val="uk-UA" w:eastAsia="en-US"/>
+              </w:rPr>
+              <m:t>P</m:t>
+            </m:r>
+          </m:e>
+        </m:d>
+      </m:oMath>
+      <w:r>
+        <w:rPr>
+          <w:rFonts w:eastAsiaTheme="minorEastAsia" w:cs="Times New Roman"/>
+          <w:color w:val="000000"/>
+          <w:szCs w:val="24"/>
+          <w:lang w:val="uk-UA" w:eastAsia="en-US"/>
+        </w:rPr>
+        <w:t>, відповідно, потрібно обирати такі ребра, де ризик погіршення визначення місцезнаходження буде мінімальним.</w:t>
       </w:r>
       <w:bookmarkStart w:id="0" w:name="_GoBack"/>
       <w:bookmarkEnd w:id="0"/>

</xml_diff>

<commit_message>
added some new formulas and changed existing one
</commit_message>
<xml_diff>
--- a/knowledgebase/conference_papers/wip/Тези_Українець_ІТОНТ.docx
+++ b/knowledgebase/conference_papers/wip/Тези_Українець_ІТОНТ.docx
@@ -382,6 +382,7 @@
           <w:lang w:val="en-GB"/>
         </w:rPr>
       </w:pPr>
+      <w:proofErr w:type="spellStart"/>
       <w:r>
         <w:rPr>
           <w:rFonts w:ascii="Times New Roman CYR" w:hAnsi="Times New Roman CYR" w:cs="Times New Roman CYR"/>
@@ -392,7 +393,46 @@
           <w:szCs w:val="24"/>
           <w:lang w:val="en-GB"/>
         </w:rPr>
-        <w:t>Kovbasiuk S., Ukrainets M.</w:t>
+        <w:t>Kovbasiuk</w:t>
+      </w:r>
+      <w:proofErr w:type="spellEnd"/>
+      <w:r>
+        <w:rPr>
+          <w:rFonts w:ascii="Times New Roman CYR" w:hAnsi="Times New Roman CYR" w:cs="Times New Roman CYR"/>
+          <w:b/>
+          <w:bCs/>
+          <w:color w:val="000000"/>
+          <w:sz w:val="24"/>
+          <w:szCs w:val="24"/>
+          <w:lang w:val="en-GB"/>
+        </w:rPr>
+        <w:t xml:space="preserve"> S., </w:t>
+      </w:r>
+      <w:proofErr w:type="spellStart"/>
+      <w:r>
+        <w:rPr>
+          <w:rFonts w:ascii="Times New Roman CYR" w:hAnsi="Times New Roman CYR" w:cs="Times New Roman CYR"/>
+          <w:b/>
+          <w:bCs/>
+          <w:color w:val="000000"/>
+          <w:sz w:val="24"/>
+          <w:szCs w:val="24"/>
+          <w:lang w:val="en-GB"/>
+        </w:rPr>
+        <w:t>Ukrainets</w:t>
+      </w:r>
+      <w:proofErr w:type="spellEnd"/>
+      <w:r>
+        <w:rPr>
+          <w:rFonts w:ascii="Times New Roman CYR" w:hAnsi="Times New Roman CYR" w:cs="Times New Roman CYR"/>
+          <w:b/>
+          <w:bCs/>
+          <w:color w:val="000000"/>
+          <w:sz w:val="24"/>
+          <w:szCs w:val="24"/>
+          <w:lang w:val="en-GB"/>
+        </w:rPr>
+        <w:t xml:space="preserve"> M.</w:t>
       </w:r>
     </w:p>
     <w:p>
@@ -568,7 +608,25 @@
           <w:szCs w:val="24"/>
           <w:lang w:val="uk-UA" w:eastAsia="en-US"/>
         </w:rPr>
-        <w:t xml:space="preserve"> (БПС) у складі безпілотних авіаційних комплексів (БпАК)</w:t>
+        <w:t xml:space="preserve"> (БПС) у складі безпілотних авіаційних комплексів (</w:t>
+      </w:r>
+      <w:proofErr w:type="spellStart"/>
+      <w:r>
+        <w:rPr>
+          <w:rFonts w:ascii="Times New Roman CYR" w:hAnsi="Times New Roman CYR" w:cs="Times New Roman CYR"/>
+          <w:szCs w:val="24"/>
+          <w:lang w:val="uk-UA" w:eastAsia="en-US"/>
+        </w:rPr>
+        <w:t>БпАК</w:t>
+      </w:r>
+      <w:proofErr w:type="spellEnd"/>
+      <w:r>
+        <w:rPr>
+          <w:rFonts w:ascii="Times New Roman CYR" w:hAnsi="Times New Roman CYR" w:cs="Times New Roman CYR"/>
+          <w:szCs w:val="24"/>
+          <w:lang w:val="uk-UA" w:eastAsia="en-US"/>
+        </w:rPr>
+        <w:t>)</w:t>
       </w:r>
       <w:r>
         <w:rPr>
@@ -782,7 +840,25 @@
           <w:szCs w:val="24"/>
           <w:lang w:val="uk-UA" w:eastAsia="en-US"/>
         </w:rPr>
-        <w:t xml:space="preserve"> вирішує два підзавдання: </w:t>
+        <w:t xml:space="preserve"> вирішує два </w:t>
+      </w:r>
+      <w:proofErr w:type="spellStart"/>
+      <w:r>
+        <w:rPr>
+          <w:rFonts w:ascii="Times New Roman CYR" w:hAnsi="Times New Roman CYR" w:cs="Times New Roman CYR"/>
+          <w:szCs w:val="24"/>
+          <w:lang w:val="uk-UA" w:eastAsia="en-US"/>
+        </w:rPr>
+        <w:t>підзавдання</w:t>
+      </w:r>
+      <w:proofErr w:type="spellEnd"/>
+      <w:r>
+        <w:rPr>
+          <w:rFonts w:ascii="Times New Roman CYR" w:hAnsi="Times New Roman CYR" w:cs="Times New Roman CYR"/>
+          <w:szCs w:val="24"/>
+          <w:lang w:val="uk-UA" w:eastAsia="en-US"/>
+        </w:rPr>
+        <w:t xml:space="preserve">: </w:t>
       </w:r>
       <w:r>
         <w:rPr>
@@ -822,7 +898,25 @@
           <w:szCs w:val="24"/>
           <w:lang w:val="uk-UA" w:eastAsia="en-US"/>
         </w:rPr>
-        <w:t>Одним з найбільш поширених підходів до планування маршруту руху БПС в складі БпАК є ручна побудова маршруту</w:t>
+        <w:t xml:space="preserve">Одним з найбільш поширених підходів до планування маршруту руху БПС в складі </w:t>
+      </w:r>
+      <w:proofErr w:type="spellStart"/>
+      <w:r>
+        <w:rPr>
+          <w:rFonts w:ascii="Times New Roman CYR" w:hAnsi="Times New Roman CYR" w:cs="Times New Roman CYR"/>
+          <w:szCs w:val="24"/>
+          <w:lang w:val="uk-UA" w:eastAsia="en-US"/>
+        </w:rPr>
+        <w:t>БпАК</w:t>
+      </w:r>
+      <w:proofErr w:type="spellEnd"/>
+      <w:r>
+        <w:rPr>
+          <w:rFonts w:ascii="Times New Roman CYR" w:hAnsi="Times New Roman CYR" w:cs="Times New Roman CYR"/>
+          <w:szCs w:val="24"/>
+          <w:lang w:val="uk-UA" w:eastAsia="en-US"/>
+        </w:rPr>
+        <w:t xml:space="preserve"> є ручна побудова маршруту</w:t>
       </w:r>
       <w:r>
         <w:rPr>
@@ -1064,7 +1158,25 @@
           <w:szCs w:val="24"/>
           <w:lang w:val="uk-UA" w:eastAsia="en-US"/>
         </w:rPr>
-        <w:t>пошуку оптимального маршруту БПС в складі БпАК на основі різнорідних даних</w:t>
+        <w:t xml:space="preserve">пошуку оптимального маршруту БПС в складі </w:t>
+      </w:r>
+      <w:proofErr w:type="spellStart"/>
+      <w:r>
+        <w:rPr>
+          <w:rFonts w:ascii="Times New Roman CYR" w:hAnsi="Times New Roman CYR" w:cs="Times New Roman CYR"/>
+          <w:szCs w:val="24"/>
+          <w:lang w:val="uk-UA" w:eastAsia="en-US"/>
+        </w:rPr>
+        <w:t>БпАК</w:t>
+      </w:r>
+      <w:proofErr w:type="spellEnd"/>
+      <w:r>
+        <w:rPr>
+          <w:rFonts w:ascii="Times New Roman CYR" w:hAnsi="Times New Roman CYR" w:cs="Times New Roman CYR"/>
+          <w:szCs w:val="24"/>
+          <w:lang w:val="uk-UA" w:eastAsia="en-US"/>
+        </w:rPr>
+        <w:t xml:space="preserve"> на основі різнорідних даних</w:t>
       </w:r>
       <w:r>
         <w:rPr>
@@ -1126,7 +1238,25 @@
           <w:szCs w:val="24"/>
           <w:lang w:val="uk-UA" w:eastAsia="en-US"/>
         </w:rPr>
-        <w:t xml:space="preserve"> Виконання завдання покладеного на БПС в складі БпАК </w:t>
+        <w:t xml:space="preserve"> Виконання завдання покладеного на БПС в складі </w:t>
+      </w:r>
+      <w:proofErr w:type="spellStart"/>
+      <w:r>
+        <w:rPr>
+          <w:rFonts w:ascii="Times New Roman CYR" w:hAnsi="Times New Roman CYR" w:cs="Times New Roman CYR"/>
+          <w:szCs w:val="24"/>
+          <w:lang w:val="uk-UA" w:eastAsia="en-US"/>
+        </w:rPr>
+        <w:t>БпАК</w:t>
+      </w:r>
+      <w:proofErr w:type="spellEnd"/>
+      <w:r>
+        <w:rPr>
+          <w:rFonts w:ascii="Times New Roman CYR" w:hAnsi="Times New Roman CYR" w:cs="Times New Roman CYR"/>
+          <w:szCs w:val="24"/>
+          <w:lang w:val="uk-UA" w:eastAsia="en-US"/>
+        </w:rPr>
+        <w:t xml:space="preserve"> </w:t>
       </w:r>
       <w:r>
         <w:rPr>
@@ -1198,7 +1328,25 @@
           <w:szCs w:val="24"/>
           <w:lang w:val="uk-UA" w:eastAsia="en-US"/>
         </w:rPr>
-        <w:t xml:space="preserve">застосовується гібридний підхід, який поєднує візуальну навігацію на основі геоприв’язаних супутникових знімків та </w:t>
+        <w:t xml:space="preserve">застосовується гібридний підхід, який поєднує візуальну навігацію на основі </w:t>
+      </w:r>
+      <w:proofErr w:type="spellStart"/>
+      <w:r>
+        <w:rPr>
+          <w:rFonts w:ascii="Times New Roman CYR" w:hAnsi="Times New Roman CYR" w:cs="Times New Roman CYR"/>
+          <w:szCs w:val="24"/>
+          <w:lang w:val="uk-UA" w:eastAsia="en-US"/>
+        </w:rPr>
+        <w:t>геоприв’язаних</w:t>
+      </w:r>
+      <w:proofErr w:type="spellEnd"/>
+      <w:r>
+        <w:rPr>
+          <w:rFonts w:ascii="Times New Roman CYR" w:hAnsi="Times New Roman CYR" w:cs="Times New Roman CYR"/>
+          <w:szCs w:val="24"/>
+          <w:lang w:val="uk-UA" w:eastAsia="en-US"/>
+        </w:rPr>
+        <w:t xml:space="preserve"> супутникових знімків та </w:t>
       </w:r>
       <w:r>
         <w:rPr>
@@ -1453,7 +1601,25 @@
           <w:szCs w:val="24"/>
           <w:lang w:val="uk-UA" w:eastAsia="en-US"/>
         </w:rPr>
-        <w:t xml:space="preserve">: геоприв’язаний супутниковий знімок, карта висот, карта вітру, </w:t>
+        <w:t xml:space="preserve">: </w:t>
+      </w:r>
+      <w:proofErr w:type="spellStart"/>
+      <w:r>
+        <w:rPr>
+          <w:rFonts w:ascii="Times New Roman CYR" w:hAnsi="Times New Roman CYR" w:cs="Times New Roman CYR"/>
+          <w:szCs w:val="24"/>
+          <w:lang w:val="uk-UA" w:eastAsia="en-US"/>
+        </w:rPr>
+        <w:t>геоприв’язаний</w:t>
+      </w:r>
+      <w:proofErr w:type="spellEnd"/>
+      <w:r>
+        <w:rPr>
+          <w:rFonts w:ascii="Times New Roman CYR" w:hAnsi="Times New Roman CYR" w:cs="Times New Roman CYR"/>
+          <w:szCs w:val="24"/>
+          <w:lang w:val="uk-UA" w:eastAsia="en-US"/>
+        </w:rPr>
+        <w:t xml:space="preserve"> супутниковий знімок, карта висот, карта вітру, </w:t>
       </w:r>
       <w:r>
         <w:rPr>
@@ -1945,7 +2111,25 @@
           <w:szCs w:val="24"/>
           <w:lang w:val="uk-UA" w:eastAsia="en-US"/>
         </w:rPr>
-        <w:t>Множина ребер маршруту:</w:t>
+        <w:t xml:space="preserve">Множина </w:t>
+      </w:r>
+      <w:proofErr w:type="spellStart"/>
+      <w:r>
+        <w:rPr>
+          <w:rFonts w:eastAsiaTheme="minorEastAsia" w:cs="Times New Roman"/>
+          <w:szCs w:val="24"/>
+          <w:lang w:val="uk-UA" w:eastAsia="en-US"/>
+        </w:rPr>
+        <w:t>ребер</w:t>
+      </w:r>
+      <w:proofErr w:type="spellEnd"/>
+      <w:r>
+        <w:rPr>
+          <w:rFonts w:eastAsiaTheme="minorEastAsia" w:cs="Times New Roman"/>
+          <w:szCs w:val="24"/>
+          <w:lang w:val="uk-UA" w:eastAsia="en-US"/>
+        </w:rPr>
+        <w:t xml:space="preserve"> маршруту:</w:t>
       </w:r>
     </w:p>
     <w:p>
@@ -2157,7 +2341,27 @@
           <w:szCs w:val="24"/>
           <w:lang w:val="uk-UA" w:eastAsia="en-US"/>
         </w:rPr>
-        <w:t>у важливість тривалості польоту, запишемо функцію для часу польоту:</w:t>
+        <w:t xml:space="preserve">у важливість тривалості польоту, </w:t>
+      </w:r>
+      <w:proofErr w:type="spellStart"/>
+      <w:r>
+        <w:rPr>
+          <w:rFonts w:eastAsiaTheme="minorEastAsia" w:cs="Times New Roman"/>
+          <w:color w:val="000000"/>
+          <w:szCs w:val="24"/>
+          <w:lang w:val="uk-UA" w:eastAsia="en-US"/>
+        </w:rPr>
+        <w:t>запишемо</w:t>
+      </w:r>
+      <w:proofErr w:type="spellEnd"/>
+      <w:r>
+        <w:rPr>
+          <w:rFonts w:eastAsiaTheme="minorEastAsia" w:cs="Times New Roman"/>
+          <w:color w:val="000000"/>
+          <w:szCs w:val="24"/>
+          <w:lang w:val="uk-UA" w:eastAsia="en-US"/>
+        </w:rPr>
+        <w:t xml:space="preserve"> функцію для часу польоту:</w:t>
       </w:r>
     </w:p>
     <w:p>
@@ -2313,8 +2517,10 @@
             </w:rPr>
             <m:t>=</m:t>
           </m:r>
-          <m:f>
-            <m:fPr>
+          <m:nary>
+            <m:naryPr>
+              <m:chr m:val="∑"/>
+              <m:limLoc m:val="undOvr"/>
               <m:ctrlPr>
                 <w:rPr>
                   <w:rFonts w:ascii="Cambria Math" w:hAnsi="Cambria Math" w:cs="Times New Roman"/>
@@ -2324,8 +2530,8 @@
                   <w:lang w:val="uk-UA" w:eastAsia="en-US"/>
                 </w:rPr>
               </m:ctrlPr>
-            </m:fPr>
-            <m:num>
+            </m:naryPr>
+            <m:sub>
               <m:r>
                 <w:rPr>
                   <w:rFonts w:ascii="Cambria Math" w:hAnsi="Cambria Math" w:cs="Times New Roman"/>
@@ -2333,7 +2539,7 @@
                   <w:szCs w:val="24"/>
                   <w:lang w:val="uk-UA" w:eastAsia="en-US"/>
                 </w:rPr>
-                <m:t>d</m:t>
+                <m:t>e∈E</m:t>
               </m:r>
               <m:d>
                 <m:dPr>
@@ -2355,14 +2561,15 @@
                       <w:szCs w:val="24"/>
                       <w:lang w:val="uk-UA" w:eastAsia="en-US"/>
                     </w:rPr>
-                    <m:t>e</m:t>
+                    <m:t>P</m:t>
                   </m:r>
                 </m:e>
               </m:d>
-            </m:num>
-            <m:den>
-              <m:sSub>
-                <m:sSubPr>
+            </m:sub>
+            <m:sup/>
+            <m:e>
+              <m:f>
+                <m:fPr>
                   <m:ctrlPr>
                     <w:rPr>
                       <w:rFonts w:ascii="Cambria Math" w:hAnsi="Cambria Math" w:cs="Times New Roman"/>
@@ -2372,8 +2579,8 @@
                       <w:lang w:val="uk-UA" w:eastAsia="en-US"/>
                     </w:rPr>
                   </m:ctrlPr>
-                </m:sSubPr>
-                <m:e>
+                </m:fPr>
+                <m:num>
                   <m:r>
                     <w:rPr>
                       <w:rFonts w:ascii="Cambria Math" w:hAnsi="Cambria Math" w:cs="Times New Roman"/>
@@ -2381,10 +2588,69 @@
                       <w:szCs w:val="24"/>
                       <w:lang w:val="uk-UA" w:eastAsia="en-US"/>
                     </w:rPr>
-                    <m:t>v</m:t>
+                    <m:t>d</m:t>
                   </m:r>
-                </m:e>
-                <m:sub>
+                  <m:d>
+                    <m:dPr>
+                      <m:ctrlPr>
+                        <w:rPr>
+                          <w:rFonts w:ascii="Cambria Math" w:hAnsi="Cambria Math" w:cs="Times New Roman"/>
+                          <w:i/>
+                          <w:color w:val="000000"/>
+                          <w:szCs w:val="24"/>
+                          <w:lang w:val="uk-UA" w:eastAsia="en-US"/>
+                        </w:rPr>
+                      </m:ctrlPr>
+                    </m:dPr>
+                    <m:e>
+                      <m:r>
+                        <w:rPr>
+                          <w:rFonts w:ascii="Cambria Math" w:hAnsi="Cambria Math" w:cs="Times New Roman"/>
+                          <w:color w:val="000000"/>
+                          <w:szCs w:val="24"/>
+                          <w:lang w:val="uk-UA" w:eastAsia="en-US"/>
+                        </w:rPr>
+                        <m:t>e</m:t>
+                      </m:r>
+                    </m:e>
+                  </m:d>
+                </m:num>
+                <m:den>
+                  <m:sSub>
+                    <m:sSubPr>
+                      <m:ctrlPr>
+                        <w:rPr>
+                          <w:rFonts w:ascii="Cambria Math" w:hAnsi="Cambria Math" w:cs="Times New Roman"/>
+                          <w:i/>
+                          <w:color w:val="000000"/>
+                          <w:szCs w:val="24"/>
+                          <w:lang w:val="uk-UA" w:eastAsia="en-US"/>
+                        </w:rPr>
+                      </m:ctrlPr>
+                    </m:sSubPr>
+                    <m:e>
+                      <m:r>
+                        <w:rPr>
+                          <w:rFonts w:ascii="Cambria Math" w:hAnsi="Cambria Math" w:cs="Times New Roman"/>
+                          <w:color w:val="000000"/>
+                          <w:szCs w:val="24"/>
+                          <w:lang w:val="uk-UA" w:eastAsia="en-US"/>
+                        </w:rPr>
+                        <m:t>v</m:t>
+                      </m:r>
+                    </m:e>
+                    <m:sub>
+                      <m:r>
+                        <w:rPr>
+                          <w:rFonts w:ascii="Cambria Math" w:hAnsi="Cambria Math" w:cs="Times New Roman"/>
+                          <w:color w:val="000000"/>
+                          <w:szCs w:val="24"/>
+                          <w:lang w:val="uk-UA" w:eastAsia="en-US"/>
+                        </w:rPr>
+                        <m:t>g</m:t>
+                      </m:r>
+                    </m:sub>
+                  </m:sSub>
                   <m:r>
                     <w:rPr>
                       <w:rFonts w:ascii="Cambria Math" w:hAnsi="Cambria Math" w:cs="Times New Roman"/>
@@ -2392,21 +2658,12 @@
                       <w:szCs w:val="24"/>
                       <w:lang w:val="uk-UA" w:eastAsia="en-US"/>
                     </w:rPr>
-                    <m:t>g</m:t>
+                    <m:t>(e)</m:t>
                   </m:r>
-                </m:sub>
-              </m:sSub>
-              <m:r>
-                <w:rPr>
-                  <w:rFonts w:ascii="Cambria Math" w:hAnsi="Cambria Math" w:cs="Times New Roman"/>
-                  <w:color w:val="000000"/>
-                  <w:szCs w:val="24"/>
-                  <w:lang w:val="uk-UA" w:eastAsia="en-US"/>
-                </w:rPr>
-                <m:t>(e)</m:t>
-              </m:r>
-            </m:den>
-          </m:f>
+                </m:den>
+              </m:f>
+            </m:e>
+          </m:nary>
           <m:r>
             <w:rPr>
               <w:rFonts w:ascii="Cambria Math" w:eastAsiaTheme="minorEastAsia" w:hAnsi="Cambria Math" w:cs="Times New Roman"/>
@@ -2923,7 +3180,34 @@
           <w:szCs w:val="24"/>
           <w:lang w:val="uk-UA" w:eastAsia="en-US"/>
         </w:rPr>
-        <w:t xml:space="preserve">Наступним опишемо критерій насиченості візуальними ознаками, який визначає наскільки багато є візуальних орієнтирів </w:t>
+        <w:t>Наступною</w:t>
+      </w:r>
+      <w:r>
+        <w:rPr>
+          <w:rFonts w:eastAsiaTheme="minorEastAsia" w:cs="Times New Roman"/>
+          <w:color w:val="000000"/>
+          <w:szCs w:val="24"/>
+          <w:lang w:val="uk-UA" w:eastAsia="en-US"/>
+        </w:rPr>
+        <w:t xml:space="preserve"> </w:t>
+      </w:r>
+      <w:r>
+        <w:rPr>
+          <w:rFonts w:eastAsiaTheme="minorEastAsia" w:cs="Times New Roman"/>
+          <w:color w:val="000000"/>
+          <w:szCs w:val="24"/>
+          <w:lang w:val="uk-UA" w:eastAsia="en-US"/>
+        </w:rPr>
+        <w:t>функцію для</w:t>
+      </w:r>
+      <w:r>
+        <w:rPr>
+          <w:rFonts w:eastAsiaTheme="minorEastAsia" w:cs="Times New Roman"/>
+          <w:color w:val="000000"/>
+          <w:szCs w:val="24"/>
+          <w:lang w:val="uk-UA" w:eastAsia="en-US"/>
+        </w:rPr>
+        <w:t xml:space="preserve"> насиченості візуальними ознаками, який визначає наскільки багато є візуальних орієнтирів </w:t>
       </w:r>
       <w:r>
         <w:rPr>
@@ -3079,41 +3363,176 @@
             </m:sub>
             <m:sup/>
             <m:e>
-              <m:sSub>
-                <m:sSubPr>
+              <m:func>
+                <m:funcPr>
                   <m:ctrlPr>
-                    <w:rPr>
-                      <w:rFonts w:ascii="Cambria Math" w:hAnsi="Cambria Math" w:cs="Times New Roman"/>
-                      <w:i/>
-                      <w:color w:val="000000"/>
-                      <w:szCs w:val="24"/>
-                      <w:lang w:val="uk-UA" w:eastAsia="en-US"/>
-                    </w:rPr>
-                  </m:ctrlPr>
-                </m:sSubPr>
-                <m:e>
-                  <m:r>
                     <w:rPr>
                       <w:rFonts w:ascii="Cambria Math" w:hAnsi="Cambria Math" w:cs="Times New Roman"/>
                       <w:color w:val="000000"/>
                       <w:szCs w:val="24"/>
                       <w:lang w:val="uk-UA" w:eastAsia="en-US"/>
                     </w:rPr>
-                    <m:t>φ</m:t>
-                  </m:r>
-                </m:e>
-                <m:sub>
+                  </m:ctrlPr>
+                </m:funcPr>
+                <m:fName>
                   <m:r>
+                    <m:rPr>
+                      <m:sty m:val="p"/>
+                    </m:rPr>
                     <w:rPr>
                       <w:rFonts w:ascii="Cambria Math" w:hAnsi="Cambria Math" w:cs="Times New Roman"/>
                       <w:color w:val="000000"/>
                       <w:szCs w:val="24"/>
                       <w:lang w:val="uk-UA" w:eastAsia="en-US"/>
                     </w:rPr>
-                    <m:t>vis</m:t>
+                    <m:t>max</m:t>
                   </m:r>
-                </m:sub>
-              </m:sSub>
+                </m:fName>
+                <m:e>
+                  <m:d>
+                    <m:dPr>
+                      <m:ctrlPr>
+                        <w:rPr>
+                          <w:rFonts w:ascii="Cambria Math" w:hAnsi="Cambria Math" w:cs="Times New Roman"/>
+                          <w:i/>
+                          <w:color w:val="000000"/>
+                          <w:szCs w:val="24"/>
+                          <w:lang w:val="uk-UA" w:eastAsia="en-US"/>
+                        </w:rPr>
+                      </m:ctrlPr>
+                    </m:dPr>
+                    <m:e>
+                      <m:sSub>
+                        <m:sSubPr>
+                          <m:ctrlPr>
+                            <w:rPr>
+                              <w:rFonts w:ascii="Cambria Math" w:hAnsi="Cambria Math" w:cs="Times New Roman"/>
+                              <w:i/>
+                              <w:color w:val="000000"/>
+                              <w:szCs w:val="24"/>
+                              <w:lang w:val="uk-UA" w:eastAsia="en-US"/>
+                            </w:rPr>
+                          </m:ctrlPr>
+                        </m:sSubPr>
+                        <m:e>
+                          <m:r>
+                            <w:rPr>
+                              <w:rFonts w:ascii="Cambria Math" w:hAnsi="Cambria Math" w:cs="Times New Roman"/>
+                              <w:color w:val="000000"/>
+                              <w:szCs w:val="24"/>
+                              <w:lang w:val="uk-UA" w:eastAsia="en-US"/>
+                            </w:rPr>
+                            <m:t>φ</m:t>
+                          </m:r>
+                        </m:e>
+                        <m:sub>
+                          <m:r>
+                            <w:rPr>
+                              <w:rFonts w:ascii="Cambria Math" w:hAnsi="Cambria Math" w:cs="Times New Roman"/>
+                              <w:color w:val="000000"/>
+                              <w:szCs w:val="24"/>
+                              <w:lang w:val="uk-UA" w:eastAsia="en-US"/>
+                            </w:rPr>
+                            <m:t>vis</m:t>
+                          </m:r>
+                        </m:sub>
+                      </m:sSub>
+                      <m:d>
+                        <m:dPr>
+                          <m:ctrlPr>
+                            <w:rPr>
+                              <w:rFonts w:ascii="Cambria Math" w:hAnsi="Cambria Math" w:cs="Times New Roman"/>
+                              <w:i/>
+                              <w:color w:val="000000"/>
+                              <w:szCs w:val="24"/>
+                              <w:lang w:val="uk-UA" w:eastAsia="en-US"/>
+                            </w:rPr>
+                          </m:ctrlPr>
+                        </m:dPr>
+                        <m:e>
+                          <m:r>
+                            <w:rPr>
+                              <w:rFonts w:ascii="Cambria Math" w:hAnsi="Cambria Math" w:cs="Times New Roman"/>
+                              <w:color w:val="000000"/>
+                              <w:szCs w:val="24"/>
+                              <w:lang w:val="en-US" w:eastAsia="en-US"/>
+                            </w:rPr>
+                            <m:t>e</m:t>
+                          </m:r>
+                        </m:e>
+                      </m:d>
+                      <m:r>
+                        <w:rPr>
+                          <w:rFonts w:ascii="Cambria Math" w:hAnsi="Cambria Math" w:cs="Times New Roman"/>
+                          <w:color w:val="000000"/>
+                          <w:szCs w:val="24"/>
+                          <w:lang w:val="uk-UA" w:eastAsia="en-US"/>
+                        </w:rPr>
+                        <m:t xml:space="preserve">, </m:t>
+                      </m:r>
+                      <m:sSub>
+                        <m:sSubPr>
+                          <m:ctrlPr>
+                            <w:rPr>
+                              <w:rFonts w:ascii="Cambria Math" w:hAnsi="Cambria Math" w:cs="Times New Roman"/>
+                              <w:i/>
+                              <w:color w:val="000000"/>
+                              <w:szCs w:val="24"/>
+                              <w:lang w:val="uk-UA" w:eastAsia="en-US"/>
+                            </w:rPr>
+                          </m:ctrlPr>
+                        </m:sSubPr>
+                        <m:e>
+                          <m:r>
+                            <w:rPr>
+                              <w:rFonts w:ascii="Cambria Math" w:hAnsi="Cambria Math" w:cs="Times New Roman"/>
+                              <w:color w:val="000000"/>
+                              <w:szCs w:val="24"/>
+                              <w:lang w:val="uk-UA" w:eastAsia="en-US"/>
+                            </w:rPr>
+                            <m:t>φ</m:t>
+                          </m:r>
+                        </m:e>
+                        <m:sub>
+                          <m:r>
+                            <w:rPr>
+                              <w:rFonts w:ascii="Cambria Math" w:hAnsi="Cambria Math" w:cs="Times New Roman"/>
+                              <w:color w:val="000000"/>
+                              <w:szCs w:val="24"/>
+                              <w:lang w:val="uk-UA" w:eastAsia="en-US"/>
+                            </w:rPr>
+                            <m:t>ter</m:t>
+                          </m:r>
+                        </m:sub>
+                      </m:sSub>
+                      <m:d>
+                        <m:dPr>
+                          <m:ctrlPr>
+                            <w:rPr>
+                              <w:rFonts w:ascii="Cambria Math" w:hAnsi="Cambria Math" w:cs="Times New Roman"/>
+                              <w:i/>
+                              <w:color w:val="000000"/>
+                              <w:szCs w:val="24"/>
+                              <w:lang w:val="uk-UA" w:eastAsia="en-US"/>
+                            </w:rPr>
+                          </m:ctrlPr>
+                        </m:dPr>
+                        <m:e>
+                          <m:r>
+                            <w:rPr>
+                              <w:rFonts w:ascii="Cambria Math" w:hAnsi="Cambria Math" w:cs="Times New Roman"/>
+                              <w:color w:val="000000"/>
+                              <w:szCs w:val="24"/>
+                              <w:lang w:val="en-US" w:eastAsia="en-US"/>
+                            </w:rPr>
+                            <m:t>e</m:t>
+                          </m:r>
+                        </m:e>
+                      </m:d>
+                    </m:e>
+                  </m:d>
+                </m:e>
+              </m:func>
               <m:r>
                 <w:rPr>
                   <w:rFonts w:ascii="Cambria Math" w:hAnsi="Cambria Math" w:cs="Times New Roman"/>
@@ -3121,25 +3540,7 @@
                   <w:szCs w:val="24"/>
                   <w:lang w:val="uk-UA" w:eastAsia="en-US"/>
                 </w:rPr>
-                <m:t>(</m:t>
-              </m:r>
-              <m:r>
-                <w:rPr>
-                  <w:rFonts w:ascii="Cambria Math" w:hAnsi="Cambria Math" w:cs="Times New Roman"/>
-                  <w:color w:val="000000"/>
-                  <w:szCs w:val="24"/>
-                  <w:lang w:val="en-US" w:eastAsia="en-US"/>
-                </w:rPr>
-                <m:t>e</m:t>
-              </m:r>
-              <m:r>
-                <w:rPr>
-                  <w:rFonts w:ascii="Cambria Math" w:hAnsi="Cambria Math" w:cs="Times New Roman"/>
-                  <w:color w:val="000000"/>
-                  <w:szCs w:val="24"/>
-                  <w:lang w:val="uk-UA" w:eastAsia="en-US"/>
-                </w:rPr>
-                <m:t>)</m:t>
+                <m:t xml:space="preserve"> </m:t>
               </m:r>
             </m:e>
           </m:nary>
@@ -3220,6 +3621,30 @@
               </m:r>
             </m:sub>
           </m:sSub>
+          <m:d>
+            <m:dPr>
+              <m:ctrlPr>
+                <w:rPr>
+                  <w:rFonts w:ascii="Cambria Math" w:hAnsi="Cambria Math" w:cs="Times New Roman"/>
+                  <w:i/>
+                  <w:color w:val="000000"/>
+                  <w:szCs w:val="24"/>
+                  <w:lang w:val="uk-UA" w:eastAsia="en-US"/>
+                </w:rPr>
+              </m:ctrlPr>
+            </m:dPr>
+            <m:e>
+              <m:r>
+                <w:rPr>
+                  <w:rFonts w:ascii="Cambria Math" w:hAnsi="Cambria Math" w:cs="Times New Roman"/>
+                  <w:color w:val="000000"/>
+                  <w:szCs w:val="24"/>
+                  <w:lang w:val="uk-UA" w:eastAsia="en-US"/>
+                </w:rPr>
+                <m:t>e</m:t>
+              </m:r>
+            </m:e>
+          </m:d>
           <m:r>
             <w:rPr>
               <w:rFonts w:ascii="Cambria Math" w:hAnsi="Cambria Math" w:cs="Times New Roman"/>
@@ -3227,8 +3652,67 @@
               <w:szCs w:val="24"/>
               <w:lang w:val="uk-UA" w:eastAsia="en-US"/>
             </w:rPr>
-            <m:t>(e)</m:t>
+            <m:t xml:space="preserve">, </m:t>
           </m:r>
+          <m:sSub>
+            <m:sSubPr>
+              <m:ctrlPr>
+                <w:rPr>
+                  <w:rFonts w:ascii="Cambria Math" w:hAnsi="Cambria Math" w:cs="Times New Roman"/>
+                  <w:i/>
+                  <w:color w:val="000000"/>
+                  <w:szCs w:val="24"/>
+                  <w:lang w:val="uk-UA" w:eastAsia="en-US"/>
+                </w:rPr>
+              </m:ctrlPr>
+            </m:sSubPr>
+            <m:e>
+              <m:r>
+                <w:rPr>
+                  <w:rFonts w:ascii="Cambria Math" w:hAnsi="Cambria Math" w:cs="Times New Roman"/>
+                  <w:color w:val="000000"/>
+                  <w:szCs w:val="24"/>
+                  <w:lang w:val="uk-UA" w:eastAsia="en-US"/>
+                </w:rPr>
+                <m:t>φ</m:t>
+              </m:r>
+            </m:e>
+            <m:sub>
+              <m:r>
+                <w:rPr>
+                  <w:rFonts w:ascii="Cambria Math" w:hAnsi="Cambria Math" w:cs="Times New Roman"/>
+                  <w:color w:val="000000"/>
+                  <w:szCs w:val="24"/>
+                  <w:lang w:val="uk-UA" w:eastAsia="en-US"/>
+                </w:rPr>
+                <m:t>ter</m:t>
+              </m:r>
+            </m:sub>
+          </m:sSub>
+          <m:d>
+            <m:dPr>
+              <m:ctrlPr>
+                <w:rPr>
+                  <w:rFonts w:ascii="Cambria Math" w:hAnsi="Cambria Math" w:cs="Times New Roman"/>
+                  <w:i/>
+                  <w:color w:val="000000"/>
+                  <w:szCs w:val="24"/>
+                  <w:lang w:val="uk-UA" w:eastAsia="en-US"/>
+                </w:rPr>
+              </m:ctrlPr>
+            </m:dPr>
+            <m:e>
+              <m:r>
+                <w:rPr>
+                  <w:rFonts w:ascii="Cambria Math" w:hAnsi="Cambria Math" w:cs="Times New Roman"/>
+                  <w:color w:val="000000"/>
+                  <w:szCs w:val="24"/>
+                  <w:lang w:val="en-US" w:eastAsia="en-US"/>
+                </w:rPr>
+                <m:t>e</m:t>
+              </m:r>
+            </m:e>
+          </m:d>
           <m:r>
             <w:rPr>
               <w:rFonts w:ascii="Cambria Math" w:hAnsi="Cambria Math" w:cs="Times New Roman"/>
@@ -3238,15 +3722,32 @@
             </w:rPr>
             <m:t>∈</m:t>
           </m:r>
-          <m:r>
-            <w:rPr>
-              <w:rFonts w:ascii="Cambria Math" w:hAnsi="Cambria Math" w:cs="Times New Roman"/>
-              <w:color w:val="000000"/>
-              <w:szCs w:val="24"/>
-              <w:lang w:val="en-US" w:eastAsia="en-US"/>
-            </w:rPr>
-            <m:t>[0,1]</m:t>
-          </m:r>
+          <m:d>
+            <m:dPr>
+              <m:begChr m:val="["/>
+              <m:endChr m:val="]"/>
+              <m:ctrlPr>
+                <w:rPr>
+                  <w:rFonts w:ascii="Cambria Math" w:hAnsi="Cambria Math" w:cs="Times New Roman"/>
+                  <w:i/>
+                  <w:color w:val="000000"/>
+                  <w:szCs w:val="24"/>
+                  <w:lang w:val="en-US" w:eastAsia="en-US"/>
+                </w:rPr>
+              </m:ctrlPr>
+            </m:dPr>
+            <m:e>
+              <m:r>
+                <w:rPr>
+                  <w:rFonts w:ascii="Cambria Math" w:hAnsi="Cambria Math" w:cs="Times New Roman"/>
+                  <w:color w:val="000000"/>
+                  <w:szCs w:val="24"/>
+                  <w:lang w:val="en-US" w:eastAsia="en-US"/>
+                </w:rPr>
+                <m:t>0,1</m:t>
+              </m:r>
+            </m:e>
+          </m:d>
         </m:oMath>
       </m:oMathPara>
     </w:p>
@@ -3256,12 +3757,100 @@
         <w:ind w:firstLine="567"/>
         <w:jc w:val="both"/>
         <w:rPr>
-          <w:rFonts w:cs="Times New Roman"/>
+          <w:rFonts w:eastAsiaTheme="minorEastAsia" w:cs="Times New Roman"/>
+          <w:color w:val="000000"/>
+          <w:szCs w:val="24"/>
+          <w:lang w:val="uk-UA" w:eastAsia="en-US"/>
+        </w:rPr>
+      </w:pPr>
+      <w:r>
+        <w:rPr>
+          <w:rFonts w:eastAsiaTheme="minorEastAsia" w:cs="Times New Roman"/>
+          <w:color w:val="000000"/>
+          <w:szCs w:val="24"/>
+          <w:lang w:val="uk-UA" w:eastAsia="en-US"/>
+        </w:rPr>
+        <w:t>Таким чином, чим довше БПС проводитиме часу над місцевістю з низькою насиченістю візуальними ознаками</w:t>
+      </w:r>
+      <w:r>
+        <w:rPr>
+          <w:rFonts w:eastAsiaTheme="minorEastAsia" w:cs="Times New Roman"/>
+          <w:color w:val="000000"/>
+          <w:szCs w:val="24"/>
+          <w:lang w:val="uk-UA" w:eastAsia="en-US"/>
+        </w:rPr>
+        <w:t xml:space="preserve"> </w:t>
+      </w:r>
+      <m:oMath>
+        <m:sSub>
+          <m:sSubPr>
+            <m:ctrlPr>
+              <w:rPr>
+                <w:rFonts w:ascii="Cambria Math" w:hAnsi="Cambria Math" w:cs="Times New Roman"/>
+                <w:i/>
+                <w:color w:val="000000"/>
+                <w:szCs w:val="24"/>
+                <w:lang w:val="uk-UA" w:eastAsia="en-US"/>
+              </w:rPr>
+            </m:ctrlPr>
+          </m:sSubPr>
+          <m:e>
+            <m:r>
+              <w:rPr>
+                <w:rFonts w:ascii="Cambria Math" w:hAnsi="Cambria Math" w:cs="Times New Roman"/>
+                <w:color w:val="000000"/>
+                <w:szCs w:val="24"/>
+                <w:lang w:val="uk-UA" w:eastAsia="en-US"/>
+              </w:rPr>
+              <m:t>φ</m:t>
+            </m:r>
+          </m:e>
+          <m:sub>
+            <m:r>
+              <w:rPr>
+                <w:rFonts w:ascii="Cambria Math" w:hAnsi="Cambria Math" w:cs="Times New Roman"/>
+                <w:color w:val="000000"/>
+                <w:szCs w:val="24"/>
+                <w:lang w:val="uk-UA" w:eastAsia="en-US"/>
+              </w:rPr>
+              <m:t>vis</m:t>
+            </m:r>
+          </m:sub>
+        </m:sSub>
+        <m:d>
+          <m:dPr>
+            <m:ctrlPr>
+              <w:rPr>
+                <w:rFonts w:ascii="Cambria Math" w:hAnsi="Cambria Math" w:cs="Times New Roman"/>
+                <w:i/>
+                <w:color w:val="000000"/>
+                <w:szCs w:val="24"/>
+                <w:lang w:val="uk-UA" w:eastAsia="en-US"/>
+              </w:rPr>
+            </m:ctrlPr>
+          </m:dPr>
+          <m:e>
+            <m:r>
+              <w:rPr>
+                <w:rFonts w:ascii="Cambria Math" w:hAnsi="Cambria Math" w:cs="Times New Roman"/>
+                <w:color w:val="000000"/>
+                <w:szCs w:val="24"/>
+                <w:lang w:val="uk-UA" w:eastAsia="en-US"/>
+              </w:rPr>
+              <m:t>e</m:t>
+            </m:r>
+          </m:e>
+        </m:d>
+      </m:oMath>
+      <w:r>
+        <w:rPr>
+          <w:rFonts w:eastAsiaTheme="minorEastAsia" w:cs="Times New Roman"/>
           <w:color w:val="000000"/>
           <w:szCs w:val="24"/>
           <w:lang w:val="en-US" w:eastAsia="en-US"/>
         </w:rPr>
-      </w:pPr>
+        <w:t xml:space="preserve"> </w:t>
+      </w:r>
       <w:r>
         <w:rPr>
           <w:rFonts w:eastAsiaTheme="minorEastAsia" w:cs="Times New Roman"/>
@@ -3269,7 +3858,95 @@
           <w:szCs w:val="24"/>
           <w:lang w:val="uk-UA" w:eastAsia="en-US"/>
         </w:rPr>
-        <w:t xml:space="preserve">Таким чином, чим довше БПС проводитиме часу над місцевістю з низькою насиченістю візуальними ознаками, тим </w:t>
+        <w:t xml:space="preserve">та </w:t>
+      </w:r>
+      <w:r>
+        <w:rPr>
+          <w:rFonts w:eastAsiaTheme="minorEastAsia" w:cs="Times New Roman"/>
+          <w:color w:val="000000"/>
+          <w:szCs w:val="24"/>
+          <w:lang w:val="uk-UA" w:eastAsia="en-US"/>
+        </w:rPr>
+        <w:t xml:space="preserve">перепадами </w:t>
+      </w:r>
+      <w:r>
+        <w:rPr>
+          <w:rFonts w:eastAsiaTheme="minorEastAsia" w:cs="Times New Roman"/>
+          <w:color w:val="000000"/>
+          <w:szCs w:val="24"/>
+          <w:lang w:val="uk-UA" w:eastAsia="en-US"/>
+        </w:rPr>
+        <w:t xml:space="preserve">висот земної поверхні </w:t>
+      </w:r>
+      <m:oMath>
+        <m:sSub>
+          <m:sSubPr>
+            <m:ctrlPr>
+              <w:rPr>
+                <w:rFonts w:ascii="Cambria Math" w:hAnsi="Cambria Math" w:cs="Times New Roman"/>
+                <w:i/>
+                <w:color w:val="000000"/>
+                <w:szCs w:val="24"/>
+                <w:lang w:val="uk-UA" w:eastAsia="en-US"/>
+              </w:rPr>
+            </m:ctrlPr>
+          </m:sSubPr>
+          <m:e>
+            <m:r>
+              <w:rPr>
+                <w:rFonts w:ascii="Cambria Math" w:hAnsi="Cambria Math" w:cs="Times New Roman"/>
+                <w:color w:val="000000"/>
+                <w:szCs w:val="24"/>
+                <w:lang w:val="uk-UA" w:eastAsia="en-US"/>
+              </w:rPr>
+              <m:t>φ</m:t>
+            </m:r>
+          </m:e>
+          <m:sub>
+            <m:r>
+              <w:rPr>
+                <w:rFonts w:ascii="Cambria Math" w:hAnsi="Cambria Math" w:cs="Times New Roman"/>
+                <w:color w:val="000000"/>
+                <w:szCs w:val="24"/>
+                <w:lang w:val="uk-UA" w:eastAsia="en-US"/>
+              </w:rPr>
+              <m:t>ter</m:t>
+            </m:r>
+          </m:sub>
+        </m:sSub>
+        <m:d>
+          <m:dPr>
+            <m:ctrlPr>
+              <w:rPr>
+                <w:rFonts w:ascii="Cambria Math" w:hAnsi="Cambria Math" w:cs="Times New Roman"/>
+                <w:i/>
+                <w:color w:val="000000"/>
+                <w:szCs w:val="24"/>
+                <w:lang w:val="uk-UA" w:eastAsia="en-US"/>
+              </w:rPr>
+            </m:ctrlPr>
+          </m:dPr>
+          <m:e>
+            <m:r>
+              <w:rPr>
+                <w:rFonts w:ascii="Cambria Math" w:hAnsi="Cambria Math" w:cs="Times New Roman"/>
+                <w:color w:val="000000"/>
+                <w:szCs w:val="24"/>
+                <w:lang w:val="en-US" w:eastAsia="en-US"/>
+              </w:rPr>
+              <m:t>e</m:t>
+            </m:r>
+          </m:e>
+        </m:d>
+      </m:oMath>
+      <w:r>
+        <w:rPr>
+          <w:rFonts w:eastAsiaTheme="minorEastAsia" w:cs="Times New Roman"/>
+          <w:color w:val="000000"/>
+          <w:szCs w:val="24"/>
+          <w:lang w:val="uk-UA" w:eastAsia="en-US"/>
+        </w:rPr>
+        <w:t xml:space="preserve">, тим </w:t>
       </w:r>
       <w:r>
         <w:rPr>
@@ -3350,8 +4027,568 @@
         </w:rPr>
         <w:t>, відповідно, потрібно обирати такі ребра, де ризик погіршення визначення місцезнаходження буде мінімальним.</w:t>
       </w:r>
+      <w:r>
+        <w:rPr>
+          <w:rFonts w:eastAsiaTheme="minorEastAsia" w:cs="Times New Roman"/>
+          <w:color w:val="000000"/>
+          <w:szCs w:val="24"/>
+          <w:lang w:val="en-US" w:eastAsia="en-US"/>
+        </w:rPr>
+        <w:t xml:space="preserve"> </w:t>
+      </w:r>
+      <w:r>
+        <w:rPr>
+          <w:rFonts w:eastAsiaTheme="minorEastAsia" w:cs="Times New Roman"/>
+          <w:color w:val="000000"/>
+          <w:szCs w:val="24"/>
+          <w:lang w:val="uk-UA" w:eastAsia="en-US"/>
+        </w:rPr>
+        <w:t>Так як підхід до визначення місцезнаходження БПС покладається на візуальні дані отримані з бортової камери, то слід обирати такі ребра, де погіршення видимості буде мінімальним</w:t>
+      </w:r>
+      <w:r>
+        <w:rPr>
+          <w:rFonts w:eastAsiaTheme="minorEastAsia" w:cs="Times New Roman"/>
+          <w:color w:val="000000"/>
+          <w:szCs w:val="24"/>
+          <w:lang w:val="en-US" w:eastAsia="en-US"/>
+        </w:rPr>
+        <w:t xml:space="preserve">, </w:t>
+      </w:r>
+      <w:proofErr w:type="spellStart"/>
+      <w:r>
+        <w:rPr>
+          <w:rFonts w:eastAsiaTheme="minorEastAsia" w:cs="Times New Roman"/>
+          <w:color w:val="000000"/>
+          <w:szCs w:val="24"/>
+          <w:lang w:val="uk-UA" w:eastAsia="en-US"/>
+        </w:rPr>
+        <w:t>запишемо</w:t>
+      </w:r>
+      <w:proofErr w:type="spellEnd"/>
+      <w:r>
+        <w:rPr>
+          <w:rFonts w:eastAsiaTheme="minorEastAsia" w:cs="Times New Roman"/>
+          <w:color w:val="000000"/>
+          <w:szCs w:val="24"/>
+          <w:lang w:val="uk-UA" w:eastAsia="en-US"/>
+        </w:rPr>
+        <w:t xml:space="preserve"> функцію для видимості</w:t>
+      </w:r>
+      <w:r>
+        <w:rPr>
+          <w:rFonts w:eastAsiaTheme="minorEastAsia" w:cs="Times New Roman"/>
+          <w:color w:val="000000"/>
+          <w:szCs w:val="24"/>
+          <w:lang w:val="uk-UA" w:eastAsia="en-US"/>
+        </w:rPr>
+        <w:t>:</w:t>
+      </w:r>
+    </w:p>
+    <w:p>
+      <w:pPr>
+        <w:pStyle w:val="BodyTextIndent"/>
+        <w:ind w:firstLine="567"/>
+        <w:jc w:val="both"/>
+        <w:rPr>
+          <w:rFonts w:eastAsiaTheme="minorEastAsia" w:cs="Times New Roman"/>
+          <w:color w:val="000000"/>
+          <w:szCs w:val="24"/>
+          <w:lang w:val="uk-UA" w:eastAsia="en-US"/>
+        </w:rPr>
+      </w:pPr>
+      <m:oMathPara>
+        <m:oMath>
+          <m:sSub>
+            <m:sSubPr>
+              <m:ctrlPr>
+                <w:rPr>
+                  <w:rFonts w:ascii="Cambria Math" w:hAnsi="Cambria Math" w:cs="Times New Roman"/>
+                  <w:i/>
+                  <w:color w:val="000000"/>
+                  <w:szCs w:val="24"/>
+                  <w:lang w:val="uk-UA" w:eastAsia="en-US"/>
+                </w:rPr>
+              </m:ctrlPr>
+            </m:sSubPr>
+            <m:e>
+              <m:r>
+                <w:rPr>
+                  <w:rFonts w:ascii="Cambria Math" w:hAnsi="Cambria Math" w:cs="Times New Roman"/>
+                  <w:color w:val="000000"/>
+                  <w:szCs w:val="24"/>
+                  <w:lang w:val="uk-UA" w:eastAsia="en-US"/>
+                </w:rPr>
+                <m:t>f</m:t>
+              </m:r>
+            </m:e>
+            <m:sub>
+              <m:r>
+                <w:rPr>
+                  <w:rFonts w:ascii="Cambria Math" w:hAnsi="Cambria Math" w:cs="Times New Roman"/>
+                  <w:color w:val="000000"/>
+                  <w:szCs w:val="24"/>
+                  <w:lang w:val="uk-UA" w:eastAsia="en-US"/>
+                </w:rPr>
+                <m:t>3</m:t>
+              </m:r>
+            </m:sub>
+          </m:sSub>
+          <m:d>
+            <m:dPr>
+              <m:ctrlPr>
+                <w:rPr>
+                  <w:rFonts w:ascii="Cambria Math" w:hAnsi="Cambria Math" w:cs="Times New Roman"/>
+                  <w:i/>
+                  <w:color w:val="000000"/>
+                  <w:szCs w:val="24"/>
+                  <w:lang w:val="uk-UA" w:eastAsia="en-US"/>
+                </w:rPr>
+              </m:ctrlPr>
+            </m:dPr>
+            <m:e>
+              <m:r>
+                <w:rPr>
+                  <w:rFonts w:ascii="Cambria Math" w:hAnsi="Cambria Math" w:cs="Times New Roman"/>
+                  <w:color w:val="000000"/>
+                  <w:szCs w:val="24"/>
+                  <w:lang w:val="uk-UA" w:eastAsia="en-US"/>
+                </w:rPr>
+                <m:t>P</m:t>
+              </m:r>
+            </m:e>
+          </m:d>
+          <m:r>
+            <w:rPr>
+              <w:rFonts w:ascii="Cambria Math" w:hAnsi="Cambria Math" w:cs="Times New Roman"/>
+              <w:color w:val="000000"/>
+              <w:szCs w:val="24"/>
+              <w:lang w:val="uk-UA" w:eastAsia="en-US"/>
+            </w:rPr>
+            <m:t xml:space="preserve">= </m:t>
+          </m:r>
+          <m:nary>
+            <m:naryPr>
+              <m:chr m:val="∑"/>
+              <m:limLoc m:val="undOvr"/>
+              <m:supHide m:val="1"/>
+              <m:ctrlPr>
+                <w:rPr>
+                  <w:rFonts w:ascii="Cambria Math" w:hAnsi="Cambria Math" w:cs="Times New Roman"/>
+                  <w:i/>
+                  <w:color w:val="000000"/>
+                  <w:szCs w:val="24"/>
+                  <w:lang w:val="uk-UA" w:eastAsia="en-US"/>
+                </w:rPr>
+              </m:ctrlPr>
+            </m:naryPr>
+            <m:sub>
+              <m:r>
+                <w:rPr>
+                  <w:rFonts w:ascii="Cambria Math" w:hAnsi="Cambria Math" w:cs="Times New Roman"/>
+                  <w:color w:val="000000"/>
+                  <w:szCs w:val="24"/>
+                  <w:lang w:val="uk-UA" w:eastAsia="en-US"/>
+                </w:rPr>
+                <m:t>e∈E</m:t>
+              </m:r>
+              <m:d>
+                <m:dPr>
+                  <m:ctrlPr>
+                    <w:rPr>
+                      <w:rFonts w:ascii="Cambria Math" w:hAnsi="Cambria Math" w:cs="Times New Roman"/>
+                      <w:i/>
+                      <w:color w:val="000000"/>
+                      <w:szCs w:val="24"/>
+                      <w:lang w:val="uk-UA" w:eastAsia="en-US"/>
+                    </w:rPr>
+                  </m:ctrlPr>
+                </m:dPr>
+                <m:e>
+                  <m:r>
+                    <w:rPr>
+                      <w:rFonts w:ascii="Cambria Math" w:hAnsi="Cambria Math" w:cs="Times New Roman"/>
+                      <w:color w:val="000000"/>
+                      <w:szCs w:val="24"/>
+                      <w:lang w:val="uk-UA" w:eastAsia="en-US"/>
+                    </w:rPr>
+                    <m:t>P</m:t>
+                  </m:r>
+                </m:e>
+              </m:d>
+            </m:sub>
+            <m:sup/>
+            <m:e>
+              <m:sSub>
+                <m:sSubPr>
+                  <m:ctrlPr>
+                    <w:rPr>
+                      <w:rFonts w:ascii="Cambria Math" w:hAnsi="Cambria Math" w:cs="Times New Roman"/>
+                      <w:i/>
+                      <w:color w:val="000000"/>
+                      <w:szCs w:val="24"/>
+                      <w:lang w:val="uk-UA" w:eastAsia="en-US"/>
+                    </w:rPr>
+                  </m:ctrlPr>
+                </m:sSubPr>
+                <m:e>
+                  <m:r>
+                    <w:rPr>
+                      <w:rFonts w:ascii="Cambria Math" w:hAnsi="Cambria Math" w:cs="Times New Roman"/>
+                      <w:color w:val="000000"/>
+                      <w:szCs w:val="24"/>
+                      <w:lang w:val="uk-UA" w:eastAsia="en-US"/>
+                    </w:rPr>
+                    <m:t>φ</m:t>
+                  </m:r>
+                </m:e>
+                <m:sub>
+                  <m:r>
+                    <w:rPr>
+                      <w:rFonts w:ascii="Cambria Math" w:hAnsi="Cambria Math" w:cs="Times New Roman"/>
+                      <w:color w:val="000000"/>
+                      <w:szCs w:val="24"/>
+                      <w:lang w:val="uk-UA" w:eastAsia="en-US"/>
+                    </w:rPr>
+                    <m:t>v</m:t>
+                  </m:r>
+                  <m:r>
+                    <w:rPr>
+                      <w:rFonts w:ascii="Cambria Math" w:hAnsi="Cambria Math" w:cs="Times New Roman"/>
+                      <w:color w:val="000000"/>
+                      <w:szCs w:val="24"/>
+                      <w:lang w:val="en-US" w:eastAsia="en-US"/>
+                    </w:rPr>
+                    <m:t>sb</m:t>
+                  </m:r>
+                </m:sub>
+              </m:sSub>
+              <m:d>
+                <m:dPr>
+                  <m:ctrlPr>
+                    <w:rPr>
+                      <w:rFonts w:ascii="Cambria Math" w:hAnsi="Cambria Math" w:cs="Times New Roman"/>
+                      <w:i/>
+                      <w:color w:val="000000"/>
+                      <w:szCs w:val="24"/>
+                      <w:lang w:val="uk-UA" w:eastAsia="en-US"/>
+                    </w:rPr>
+                  </m:ctrlPr>
+                </m:dPr>
+                <m:e>
+                  <m:r>
+                    <w:rPr>
+                      <w:rFonts w:ascii="Cambria Math" w:hAnsi="Cambria Math" w:cs="Times New Roman"/>
+                      <w:color w:val="000000"/>
+                      <w:szCs w:val="24"/>
+                      <w:lang w:val="uk-UA" w:eastAsia="en-US"/>
+                    </w:rPr>
+                    <m:t>e</m:t>
+                  </m:r>
+                </m:e>
+              </m:d>
+              <m:r>
+                <w:rPr>
+                  <w:rFonts w:ascii="Cambria Math" w:hAnsi="Cambria Math" w:cs="Times New Roman"/>
+                  <w:color w:val="000000"/>
+                  <w:szCs w:val="24"/>
+                  <w:lang w:val="uk-UA" w:eastAsia="en-US"/>
+                </w:rPr>
+                <m:t>∙t</m:t>
+              </m:r>
+              <m:d>
+                <m:dPr>
+                  <m:ctrlPr>
+                    <w:rPr>
+                      <w:rFonts w:ascii="Cambria Math" w:hAnsi="Cambria Math" w:cs="Times New Roman"/>
+                      <w:i/>
+                      <w:color w:val="000000"/>
+                      <w:szCs w:val="24"/>
+                      <w:lang w:val="uk-UA" w:eastAsia="en-US"/>
+                    </w:rPr>
+                  </m:ctrlPr>
+                </m:dPr>
+                <m:e>
+                  <m:r>
+                    <w:rPr>
+                      <w:rFonts w:ascii="Cambria Math" w:hAnsi="Cambria Math" w:cs="Times New Roman"/>
+                      <w:color w:val="000000"/>
+                      <w:szCs w:val="24"/>
+                      <w:lang w:val="uk-UA" w:eastAsia="en-US"/>
+                    </w:rPr>
+                    <m:t>e</m:t>
+                  </m:r>
+                </m:e>
+              </m:d>
+              <m:r>
+                <w:rPr>
+                  <w:rFonts w:ascii="Cambria Math" w:hAnsi="Cambria Math" w:cs="Times New Roman"/>
+                  <w:color w:val="000000"/>
+                  <w:szCs w:val="24"/>
+                  <w:lang w:val="uk-UA" w:eastAsia="en-US"/>
+                </w:rPr>
+                <m:t xml:space="preserve">,   </m:t>
+              </m:r>
+              <m:sSub>
+                <m:sSubPr>
+                  <m:ctrlPr>
+                    <w:rPr>
+                      <w:rFonts w:ascii="Cambria Math" w:hAnsi="Cambria Math" w:cs="Times New Roman"/>
+                      <w:i/>
+                      <w:color w:val="000000"/>
+                      <w:szCs w:val="24"/>
+                      <w:lang w:val="uk-UA" w:eastAsia="en-US"/>
+                    </w:rPr>
+                  </m:ctrlPr>
+                </m:sSubPr>
+                <m:e>
+                  <m:r>
+                    <w:rPr>
+                      <w:rFonts w:ascii="Cambria Math" w:hAnsi="Cambria Math" w:cs="Times New Roman"/>
+                      <w:color w:val="000000"/>
+                      <w:szCs w:val="24"/>
+                      <w:lang w:val="uk-UA" w:eastAsia="en-US"/>
+                    </w:rPr>
+                    <m:t>φ</m:t>
+                  </m:r>
+                </m:e>
+                <m:sub>
+                  <m:r>
+                    <w:rPr>
+                      <w:rFonts w:ascii="Cambria Math" w:hAnsi="Cambria Math" w:cs="Times New Roman"/>
+                      <w:color w:val="000000"/>
+                      <w:szCs w:val="24"/>
+                      <w:lang w:val="uk-UA" w:eastAsia="en-US"/>
+                    </w:rPr>
+                    <m:t>v</m:t>
+                  </m:r>
+                  <m:r>
+                    <w:rPr>
+                      <w:rFonts w:ascii="Cambria Math" w:hAnsi="Cambria Math" w:cs="Times New Roman"/>
+                      <w:color w:val="000000"/>
+                      <w:szCs w:val="24"/>
+                      <w:lang w:val="en-US" w:eastAsia="en-US"/>
+                    </w:rPr>
+                    <m:t>sb</m:t>
+                  </m:r>
+                </m:sub>
+              </m:sSub>
+              <m:d>
+                <m:dPr>
+                  <m:ctrlPr>
+                    <w:rPr>
+                      <w:rFonts w:ascii="Cambria Math" w:hAnsi="Cambria Math" w:cs="Times New Roman"/>
+                      <w:i/>
+                      <w:color w:val="000000"/>
+                      <w:szCs w:val="24"/>
+                      <w:lang w:val="uk-UA" w:eastAsia="en-US"/>
+                    </w:rPr>
+                  </m:ctrlPr>
+                </m:dPr>
+                <m:e>
+                  <m:r>
+                    <w:rPr>
+                      <w:rFonts w:ascii="Cambria Math" w:hAnsi="Cambria Math" w:cs="Times New Roman"/>
+                      <w:color w:val="000000"/>
+                      <w:szCs w:val="24"/>
+                      <w:lang w:val="uk-UA" w:eastAsia="en-US"/>
+                    </w:rPr>
+                    <m:t>e</m:t>
+                  </m:r>
+                </m:e>
+              </m:d>
+            </m:e>
+          </m:nary>
+          <m:r>
+            <w:rPr>
+              <w:rFonts w:ascii="Cambria Math" w:hAnsi="Cambria Math" w:cs="Times New Roman"/>
+              <w:color w:val="000000"/>
+              <w:szCs w:val="24"/>
+              <w:lang w:val="uk-UA" w:eastAsia="en-US"/>
+            </w:rPr>
+            <m:t>∈</m:t>
+          </m:r>
+          <m:r>
+            <w:rPr>
+              <w:rFonts w:ascii="Cambria Math" w:hAnsi="Cambria Math" w:cs="Times New Roman"/>
+              <w:color w:val="000000"/>
+              <w:szCs w:val="24"/>
+              <w:lang w:val="uk-UA" w:eastAsia="en-US"/>
+            </w:rPr>
+            <m:t>[0,1]</m:t>
+          </m:r>
+        </m:oMath>
+      </m:oMathPara>
       <w:bookmarkStart w:id="0" w:name="_GoBack"/>
       <w:bookmarkEnd w:id="0"/>
+    </w:p>
+    <w:p>
+      <w:pPr>
+        <w:pStyle w:val="BodyTextIndent"/>
+        <w:ind w:firstLine="567"/>
+        <w:jc w:val="both"/>
+        <w:rPr>
+          <w:rFonts w:cs="Times New Roman"/>
+          <w:color w:val="000000"/>
+          <w:szCs w:val="24"/>
+          <w:lang w:val="uk-UA" w:eastAsia="en-US"/>
+        </w:rPr>
+      </w:pPr>
+      <w:r>
+        <w:rPr>
+          <w:rFonts w:cs="Times New Roman"/>
+          <w:color w:val="000000"/>
+          <w:szCs w:val="24"/>
+          <w:lang w:val="uk-UA" w:eastAsia="en-US"/>
+        </w:rPr>
+        <w:t xml:space="preserve">Таким чином, </w:t>
+      </w:r>
+      <w:r>
+        <w:rPr>
+          <w:rFonts w:cs="Times New Roman"/>
+          <w:color w:val="000000"/>
+          <w:szCs w:val="24"/>
+          <w:lang w:val="uk-UA" w:eastAsia="en-US"/>
+        </w:rPr>
+        <w:t>слід</w:t>
+      </w:r>
+      <w:r>
+        <w:rPr>
+          <w:rFonts w:cs="Times New Roman"/>
+          <w:color w:val="000000"/>
+          <w:szCs w:val="24"/>
+          <w:lang w:val="uk-UA" w:eastAsia="en-US"/>
+        </w:rPr>
+        <w:t xml:space="preserve"> </w:t>
+      </w:r>
+      <w:r>
+        <w:rPr>
+          <w:rFonts w:cs="Times New Roman"/>
+          <w:color w:val="000000"/>
+          <w:szCs w:val="24"/>
+          <w:highlight w:val="yellow"/>
+          <w:lang w:val="uk-UA" w:eastAsia="en-US"/>
+        </w:rPr>
+        <w:t>мінімізувати (максимізувати)</w:t>
+      </w:r>
+      <w:r>
+        <w:rPr>
+          <w:rFonts w:cs="Times New Roman"/>
+          <w:color w:val="000000"/>
+          <w:szCs w:val="24"/>
+          <w:lang w:val="uk-UA" w:eastAsia="en-US"/>
+        </w:rPr>
+        <w:t xml:space="preserve"> </w:t>
+      </w:r>
+      <m:oMath>
+        <m:sSub>
+          <m:sSubPr>
+            <m:ctrlPr>
+              <w:rPr>
+                <w:rFonts w:ascii="Cambria Math" w:hAnsi="Cambria Math" w:cs="Times New Roman"/>
+                <w:i/>
+                <w:color w:val="000000"/>
+                <w:szCs w:val="24"/>
+                <w:lang w:val="uk-UA" w:eastAsia="en-US"/>
+              </w:rPr>
+            </m:ctrlPr>
+          </m:sSubPr>
+          <m:e>
+            <m:r>
+              <w:rPr>
+                <w:rFonts w:ascii="Cambria Math" w:hAnsi="Cambria Math" w:cs="Times New Roman"/>
+                <w:color w:val="000000"/>
+                <w:szCs w:val="24"/>
+                <w:lang w:val="uk-UA" w:eastAsia="en-US"/>
+              </w:rPr>
+              <m:t>f</m:t>
+            </m:r>
+          </m:e>
+          <m:sub>
+            <m:r>
+              <w:rPr>
+                <w:rFonts w:ascii="Cambria Math" w:hAnsi="Cambria Math" w:cs="Times New Roman"/>
+                <w:color w:val="000000"/>
+                <w:szCs w:val="24"/>
+                <w:lang w:val="uk-UA" w:eastAsia="en-US"/>
+              </w:rPr>
+              <m:t>3</m:t>
+            </m:r>
+          </m:sub>
+        </m:sSub>
+        <m:d>
+          <m:dPr>
+            <m:ctrlPr>
+              <w:rPr>
+                <w:rFonts w:ascii="Cambria Math" w:hAnsi="Cambria Math" w:cs="Times New Roman"/>
+                <w:i/>
+                <w:color w:val="000000"/>
+                <w:szCs w:val="24"/>
+                <w:lang w:val="uk-UA" w:eastAsia="en-US"/>
+              </w:rPr>
+            </m:ctrlPr>
+          </m:dPr>
+          <m:e>
+            <m:r>
+              <w:rPr>
+                <w:rFonts w:ascii="Cambria Math" w:hAnsi="Cambria Math" w:cs="Times New Roman"/>
+                <w:color w:val="000000"/>
+                <w:szCs w:val="24"/>
+                <w:lang w:val="uk-UA" w:eastAsia="en-US"/>
+              </w:rPr>
+              <m:t>P</m:t>
+            </m:r>
+          </m:e>
+        </m:d>
+      </m:oMath>
+      <w:r>
+        <w:rPr>
+          <w:rFonts w:eastAsiaTheme="minorEastAsia" w:cs="Times New Roman"/>
+          <w:color w:val="000000"/>
+          <w:szCs w:val="24"/>
+          <w:lang w:val="uk-UA" w:eastAsia="en-US"/>
+        </w:rPr>
+        <w:t xml:space="preserve"> для забезпечення маршруту, де погіршення видимості буде найменшим.</w:t>
+      </w:r>
+    </w:p>
+    <w:p>
+      <w:pPr>
+        <w:pStyle w:val="BodyTextIndent"/>
+        <w:ind w:firstLine="567"/>
+        <w:jc w:val="both"/>
+        <w:rPr>
+          <w:rFonts w:cs="Times New Roman"/>
+          <w:color w:val="000000"/>
+          <w:szCs w:val="24"/>
+          <w:lang w:val="uk-UA" w:eastAsia="en-US"/>
+        </w:rPr>
+      </w:pPr>
+      <w:r>
+        <w:rPr>
+          <w:rFonts w:cs="Times New Roman"/>
+          <w:color w:val="000000"/>
+          <w:szCs w:val="24"/>
+          <w:lang w:val="uk-UA" w:eastAsia="en-US"/>
+        </w:rPr>
+        <w:t xml:space="preserve">Введемо обмеження для забезпечення </w:t>
+      </w:r>
+      <w:r>
+        <w:rPr>
+          <w:rFonts w:cs="Times New Roman"/>
+          <w:color w:val="000000"/>
+          <w:szCs w:val="24"/>
+          <w:lang w:val="uk-UA" w:eastAsia="en-US"/>
+        </w:rPr>
+        <w:t xml:space="preserve">розв’язку, який буде </w:t>
+      </w:r>
+      <w:r>
+        <w:rPr>
+          <w:rFonts w:cs="Times New Roman"/>
+          <w:color w:val="000000"/>
+          <w:szCs w:val="24"/>
+          <w:lang w:val="uk-UA" w:eastAsia="en-US"/>
+        </w:rPr>
+        <w:t xml:space="preserve">відповідати умовам виконання завдання. </w:t>
+      </w:r>
     </w:p>
     <w:p>
       <w:pPr>

</xml_diff>

<commit_message>
started work on restrictions
</commit_message>
<xml_diff>
--- a/knowledgebase/conference_papers/wip/Тези_Українець_ІТОНТ.docx
+++ b/knowledgebase/conference_papers/wip/Тези_Українець_ІТОНТ.docx
@@ -2046,15 +2046,7 @@
               <w:szCs w:val="24"/>
               <w:lang w:val="uk-UA" w:eastAsia="en-US"/>
             </w:rPr>
-            <m:t>)</m:t>
-          </m:r>
-          <m:r>
-            <w:rPr>
-              <w:rFonts w:ascii="Cambria Math" w:hAnsi="Cambria Math" w:cs="Times New Roman CYR"/>
-              <w:szCs w:val="24"/>
-              <w:lang w:val="uk-UA" w:eastAsia="en-US"/>
-            </w:rPr>
-            <m:t>∈</m:t>
+            <m:t>)∈</m:t>
           </m:r>
           <m:sSup>
             <m:sSupPr>
@@ -2281,25 +2273,7 @@
               <w:szCs w:val="24"/>
               <w:lang w:val="en-US" w:eastAsia="en-US"/>
             </w:rPr>
-            <m:t xml:space="preserve"> | i=0</m:t>
-          </m:r>
-          <m:r>
-            <w:rPr>
-              <w:rFonts w:ascii="Cambria Math" w:hAnsi="Cambria Math" w:cs="Times New Roman"/>
-              <w:color w:val="000000"/>
-              <w:szCs w:val="24"/>
-              <w:lang w:val="en-US" w:eastAsia="en-US"/>
-            </w:rPr>
-            <m:t>,…,n-1</m:t>
-          </m:r>
-          <m:r>
-            <w:rPr>
-              <w:rFonts w:ascii="Cambria Math" w:hAnsi="Cambria Math" w:cs="Times New Roman"/>
-              <w:color w:val="000000"/>
-              <w:szCs w:val="24"/>
-              <w:lang w:val="en-US" w:eastAsia="en-US"/>
-            </w:rPr>
-            <m:t>}</m:t>
+            <m:t xml:space="preserve"> | i=0,…,n-1}</m:t>
           </m:r>
         </m:oMath>
       </m:oMathPara>
@@ -4405,21 +4379,10 @@
               <w:szCs w:val="24"/>
               <w:lang w:val="uk-UA" w:eastAsia="en-US"/>
             </w:rPr>
-            <m:t>∈</m:t>
-          </m:r>
-          <m:r>
-            <w:rPr>
-              <w:rFonts w:ascii="Cambria Math" w:hAnsi="Cambria Math" w:cs="Times New Roman"/>
-              <w:color w:val="000000"/>
-              <w:szCs w:val="24"/>
-              <w:lang w:val="uk-UA" w:eastAsia="en-US"/>
-            </w:rPr>
-            <m:t>[0,1]</m:t>
+            <m:t>∈[0,1]</m:t>
           </m:r>
         </m:oMath>
       </m:oMathPara>
-      <w:bookmarkStart w:id="0" w:name="_GoBack"/>
-      <w:bookmarkEnd w:id="0"/>
     </w:p>
     <w:p>
       <w:pPr>
@@ -4589,6 +4552,1426 @@
         </w:rPr>
         <w:t xml:space="preserve">відповідати умовам виконання завдання. </w:t>
       </w:r>
+      <w:r>
+        <w:rPr>
+          <w:rFonts w:cs="Times New Roman"/>
+          <w:color w:val="000000"/>
+          <w:szCs w:val="24"/>
+          <w:lang w:val="uk-UA" w:eastAsia="en-US"/>
+        </w:rPr>
+        <w:t>Передусім, визначимо, що висота польоту протягом всього маршруту не має перевищувати допустиму максимальну висоту польоту для БПС:</w:t>
+      </w:r>
+    </w:p>
+    <w:p>
+      <w:pPr>
+        <w:pStyle w:val="BodyTextIndent"/>
+        <w:ind w:firstLine="567"/>
+        <w:jc w:val="both"/>
+        <w:rPr>
+          <w:rFonts w:eastAsiaTheme="minorEastAsia" w:cs="Times New Roman"/>
+          <w:color w:val="000000"/>
+          <w:szCs w:val="24"/>
+          <w:lang w:val="uk-UA" w:eastAsia="en-US"/>
+        </w:rPr>
+      </w:pPr>
+      <m:oMathPara>
+        <m:oMath>
+          <m:sSub>
+            <m:sSubPr>
+              <m:ctrlPr>
+                <w:rPr>
+                  <w:rFonts w:ascii="Cambria Math" w:hAnsi="Cambria Math" w:cs="Times New Roman"/>
+                  <w:i/>
+                  <w:color w:val="000000"/>
+                  <w:szCs w:val="24"/>
+                  <w:lang w:val="uk-UA" w:eastAsia="en-US"/>
+                </w:rPr>
+              </m:ctrlPr>
+            </m:sSubPr>
+            <m:e>
+              <m:r>
+                <w:rPr>
+                  <w:rFonts w:ascii="Cambria Math" w:hAnsi="Cambria Math" w:cs="Times New Roman"/>
+                  <w:color w:val="000000"/>
+                  <w:szCs w:val="24"/>
+                  <w:lang w:val="uk-UA" w:eastAsia="en-US"/>
+                </w:rPr>
+                <m:t>z</m:t>
+              </m:r>
+            </m:e>
+            <m:sub>
+              <m:r>
+                <w:rPr>
+                  <w:rFonts w:ascii="Cambria Math" w:hAnsi="Cambria Math" w:cs="Times New Roman"/>
+                  <w:color w:val="000000"/>
+                  <w:szCs w:val="24"/>
+                  <w:lang w:val="uk-UA" w:eastAsia="en-US"/>
+                </w:rPr>
+                <m:t>i</m:t>
+              </m:r>
+            </m:sub>
+          </m:sSub>
+          <m:r>
+            <w:rPr>
+              <w:rFonts w:ascii="Cambria Math" w:hAnsi="Cambria Math" w:cs="Times New Roman"/>
+              <w:color w:val="000000"/>
+              <w:szCs w:val="24"/>
+              <w:lang w:val="uk-UA" w:eastAsia="en-US"/>
+            </w:rPr>
+            <m:t xml:space="preserve">≤ </m:t>
+          </m:r>
+          <m:sSub>
+            <m:sSubPr>
+              <m:ctrlPr>
+                <w:rPr>
+                  <w:rFonts w:ascii="Cambria Math" w:hAnsi="Cambria Math" w:cs="Times New Roman"/>
+                  <w:i/>
+                  <w:color w:val="000000"/>
+                  <w:szCs w:val="24"/>
+                  <w:lang w:val="uk-UA" w:eastAsia="en-US"/>
+                </w:rPr>
+              </m:ctrlPr>
+            </m:sSubPr>
+            <m:e>
+              <m:r>
+                <w:rPr>
+                  <w:rFonts w:ascii="Cambria Math" w:hAnsi="Cambria Math" w:cs="Times New Roman"/>
+                  <w:color w:val="000000"/>
+                  <w:szCs w:val="24"/>
+                  <w:lang w:val="uk-UA" w:eastAsia="en-US"/>
+                </w:rPr>
+                <m:t>z</m:t>
+              </m:r>
+            </m:e>
+            <m:sub>
+              <m:r>
+                <w:rPr>
+                  <w:rFonts w:ascii="Cambria Math" w:hAnsi="Cambria Math" w:cs="Times New Roman"/>
+                  <w:color w:val="000000"/>
+                  <w:szCs w:val="24"/>
+                  <w:lang w:val="uk-UA" w:eastAsia="en-US"/>
+                </w:rPr>
+                <m:t>max</m:t>
+              </m:r>
+            </m:sub>
+          </m:sSub>
+          <m:r>
+            <w:rPr>
+              <w:rFonts w:ascii="Cambria Math" w:hAnsi="Cambria Math" w:cs="Times New Roman"/>
+              <w:color w:val="000000"/>
+              <w:szCs w:val="24"/>
+              <w:lang w:val="uk-UA" w:eastAsia="en-US"/>
+            </w:rPr>
+            <m:t xml:space="preserve">, </m:t>
+          </m:r>
+          <m:r>
+            <w:rPr>
+              <w:rFonts w:ascii="Cambria Math" w:hAnsi="Cambria Math" w:cs="Times New Roman"/>
+              <w:color w:val="000000"/>
+              <w:szCs w:val="24"/>
+              <w:lang w:val="uk-UA" w:eastAsia="en-US"/>
+            </w:rPr>
+            <m:t xml:space="preserve"> ∀</m:t>
+          </m:r>
+          <m:r>
+            <w:rPr>
+              <w:rFonts w:ascii="Cambria Math" w:hAnsi="Cambria Math" w:cs="Times New Roman"/>
+              <w:color w:val="000000"/>
+              <w:szCs w:val="24"/>
+              <w:lang w:val="uk-UA" w:eastAsia="en-US"/>
+            </w:rPr>
+            <m:t>i</m:t>
+          </m:r>
+        </m:oMath>
+      </m:oMathPara>
+    </w:p>
+    <w:p>
+      <w:pPr>
+        <w:pStyle w:val="BodyTextIndent"/>
+        <w:ind w:firstLine="567"/>
+        <w:jc w:val="both"/>
+        <w:rPr>
+          <w:rFonts w:eastAsiaTheme="minorEastAsia" w:cs="Times New Roman"/>
+          <w:color w:val="000000"/>
+          <w:szCs w:val="24"/>
+          <w:lang w:val="uk-UA" w:eastAsia="en-US"/>
+        </w:rPr>
+      </w:pPr>
+      <w:r>
+        <w:rPr>
+          <w:rFonts w:eastAsiaTheme="minorEastAsia" w:cs="Times New Roman"/>
+          <w:color w:val="000000"/>
+          <w:szCs w:val="24"/>
+          <w:lang w:val="uk-UA" w:eastAsia="en-US"/>
+        </w:rPr>
+        <w:t>Швидкість вітру</w:t>
+      </w:r>
+      <w:r>
+        <w:rPr>
+          <w:rFonts w:eastAsiaTheme="minorEastAsia" w:cs="Times New Roman"/>
+          <w:color w:val="000000"/>
+          <w:szCs w:val="24"/>
+          <w:lang w:val="uk-UA" w:eastAsia="en-US"/>
+        </w:rPr>
+        <w:t xml:space="preserve"> (</w:t>
+      </w:r>
+      <m:oMath>
+        <m:acc>
+          <m:accPr>
+            <m:chr m:val="⃗"/>
+            <m:ctrlPr>
+              <w:rPr>
+                <w:rFonts w:ascii="Cambria Math" w:eastAsiaTheme="minorEastAsia" w:hAnsi="Cambria Math" w:cs="Times New Roman"/>
+                <w:i/>
+                <w:color w:val="000000"/>
+                <w:szCs w:val="24"/>
+                <w:lang w:val="uk-UA" w:eastAsia="en-US"/>
+              </w:rPr>
+            </m:ctrlPr>
+          </m:accPr>
+          <m:e>
+            <m:r>
+              <w:rPr>
+                <w:rFonts w:ascii="Cambria Math" w:eastAsiaTheme="minorEastAsia" w:hAnsi="Cambria Math" w:cs="Times New Roman"/>
+                <w:color w:val="000000"/>
+                <w:szCs w:val="24"/>
+                <w:lang w:val="uk-UA" w:eastAsia="en-US"/>
+              </w:rPr>
+              <m:t>u</m:t>
+            </m:r>
+            <m:r>
+              <w:rPr>
+                <w:rFonts w:ascii="Cambria Math" w:eastAsiaTheme="minorEastAsia" w:hAnsi="Cambria Math" w:cs="Times New Roman"/>
+                <w:color w:val="000000"/>
+                <w:szCs w:val="24"/>
+                <w:lang w:val="uk-UA" w:eastAsia="en-US"/>
+              </w:rPr>
+              <m:t xml:space="preserve"> </m:t>
+            </m:r>
+          </m:e>
+        </m:acc>
+        <m:r>
+          <w:rPr>
+            <w:rFonts w:ascii="Cambria Math" w:eastAsiaTheme="minorEastAsia" w:hAnsi="Cambria Math" w:cs="Times New Roman"/>
+            <w:color w:val="000000"/>
+            <w:szCs w:val="24"/>
+            <w:lang w:val="uk-UA" w:eastAsia="en-US"/>
+          </w:rPr>
+          <m:t>(e)</m:t>
+        </m:r>
+      </m:oMath>
+      <w:r>
+        <w:rPr>
+          <w:rFonts w:eastAsiaTheme="minorEastAsia" w:cs="Times New Roman"/>
+          <w:color w:val="000000"/>
+          <w:szCs w:val="24"/>
+          <w:lang w:val="uk-UA" w:eastAsia="en-US"/>
+        </w:rPr>
+        <w:t>)</w:t>
+      </w:r>
+      <w:r>
+        <w:rPr>
+          <w:rFonts w:eastAsiaTheme="minorEastAsia" w:cs="Times New Roman"/>
+          <w:color w:val="000000"/>
+          <w:szCs w:val="24"/>
+          <w:lang w:val="uk-UA" w:eastAsia="en-US"/>
+        </w:rPr>
+        <w:t xml:space="preserve"> </w:t>
+      </w:r>
+      <w:r>
+        <w:rPr>
+          <w:rFonts w:eastAsiaTheme="minorEastAsia" w:cs="Times New Roman"/>
+          <w:color w:val="000000"/>
+          <w:szCs w:val="24"/>
+          <w:lang w:val="uk-UA" w:eastAsia="en-US"/>
+        </w:rPr>
+        <w:t>на кожному ребрі</w:t>
+      </w:r>
+      <w:r>
+        <w:rPr>
+          <w:rFonts w:eastAsiaTheme="minorEastAsia" w:cs="Times New Roman"/>
+          <w:color w:val="000000"/>
+          <w:szCs w:val="24"/>
+          <w:lang w:val="uk-UA" w:eastAsia="en-US"/>
+        </w:rPr>
+        <w:t xml:space="preserve"> має бути меншою за максимально допустиму швидкість </w:t>
+      </w:r>
+      <w:r>
+        <w:rPr>
+          <w:rFonts w:eastAsiaTheme="minorEastAsia" w:cs="Times New Roman"/>
+          <w:color w:val="000000"/>
+          <w:szCs w:val="24"/>
+          <w:lang w:val="uk-UA" w:eastAsia="en-US"/>
+        </w:rPr>
+        <w:t>БПС відносно повітряної маси</w:t>
+      </w:r>
+      <w:r>
+        <w:rPr>
+          <w:rFonts w:eastAsiaTheme="minorEastAsia" w:cs="Times New Roman"/>
+          <w:color w:val="000000"/>
+          <w:szCs w:val="24"/>
+          <w:lang w:val="uk-UA" w:eastAsia="en-US"/>
+        </w:rPr>
+        <w:t xml:space="preserve"> (</w:t>
+      </w:r>
+      <m:oMath>
+        <m:sSub>
+          <m:sSubPr>
+            <m:ctrlPr>
+              <w:rPr>
+                <w:rFonts w:ascii="Cambria Math" w:eastAsiaTheme="minorEastAsia" w:hAnsi="Cambria Math" w:cs="Times New Roman"/>
+                <w:i/>
+                <w:color w:val="000000"/>
+                <w:szCs w:val="24"/>
+                <w:lang w:val="uk-UA" w:eastAsia="en-US"/>
+              </w:rPr>
+            </m:ctrlPr>
+          </m:sSubPr>
+          <m:e>
+            <m:r>
+              <w:rPr>
+                <w:rFonts w:ascii="Cambria Math" w:eastAsiaTheme="minorEastAsia" w:hAnsi="Cambria Math" w:cs="Times New Roman"/>
+                <w:color w:val="000000"/>
+                <w:szCs w:val="24"/>
+                <w:lang w:val="uk-UA" w:eastAsia="en-US"/>
+              </w:rPr>
+              <m:t>v</m:t>
+            </m:r>
+          </m:e>
+          <m:sub>
+            <m:r>
+              <w:rPr>
+                <w:rFonts w:ascii="Cambria Math" w:eastAsiaTheme="minorEastAsia" w:hAnsi="Cambria Math" w:cs="Times New Roman"/>
+                <w:color w:val="000000"/>
+                <w:szCs w:val="24"/>
+                <w:lang w:val="uk-UA" w:eastAsia="en-US"/>
+              </w:rPr>
+              <m:t>max</m:t>
+            </m:r>
+          </m:sub>
+        </m:sSub>
+      </m:oMath>
+      <w:r>
+        <w:rPr>
+          <w:rFonts w:eastAsiaTheme="minorEastAsia" w:cs="Times New Roman"/>
+          <w:color w:val="000000"/>
+          <w:szCs w:val="24"/>
+          <w:lang w:val="uk-UA" w:eastAsia="en-US"/>
+        </w:rPr>
+        <w:t>)</w:t>
+      </w:r>
+      <w:r>
+        <w:rPr>
+          <w:rFonts w:eastAsiaTheme="minorEastAsia" w:cs="Times New Roman"/>
+          <w:color w:val="000000"/>
+          <w:szCs w:val="24"/>
+          <w:lang w:val="uk-UA" w:eastAsia="en-US"/>
+        </w:rPr>
+        <w:t>:</w:t>
+      </w:r>
+    </w:p>
+    <w:p>
+      <w:pPr>
+        <w:pStyle w:val="BodyTextIndent"/>
+        <w:ind w:firstLine="567"/>
+        <w:jc w:val="both"/>
+        <w:rPr>
+          <w:rFonts w:eastAsiaTheme="minorEastAsia" w:cs="Times New Roman"/>
+          <w:color w:val="000000"/>
+          <w:szCs w:val="24"/>
+          <w:lang w:val="uk-UA" w:eastAsia="en-US"/>
+        </w:rPr>
+      </w:pPr>
+      <m:oMathPara>
+        <m:oMath>
+          <m:d>
+            <m:dPr>
+              <m:begChr m:val="‖"/>
+              <m:endChr m:val="‖"/>
+              <m:ctrlPr>
+                <w:rPr>
+                  <w:rFonts w:ascii="Cambria Math" w:eastAsiaTheme="minorEastAsia" w:hAnsi="Cambria Math" w:cs="Times New Roman"/>
+                  <w:i/>
+                  <w:color w:val="000000"/>
+                  <w:szCs w:val="24"/>
+                  <w:lang w:val="uk-UA" w:eastAsia="en-US"/>
+                </w:rPr>
+              </m:ctrlPr>
+            </m:dPr>
+            <m:e>
+              <m:acc>
+                <m:accPr>
+                  <m:chr m:val="⃗"/>
+                  <m:ctrlPr>
+                    <w:rPr>
+                      <w:rFonts w:ascii="Cambria Math" w:eastAsiaTheme="minorEastAsia" w:hAnsi="Cambria Math" w:cs="Times New Roman"/>
+                      <w:i/>
+                      <w:color w:val="000000"/>
+                      <w:szCs w:val="24"/>
+                      <w:lang w:val="uk-UA" w:eastAsia="en-US"/>
+                    </w:rPr>
+                  </m:ctrlPr>
+                </m:accPr>
+                <m:e>
+                  <m:r>
+                    <w:rPr>
+                      <w:rFonts w:ascii="Cambria Math" w:eastAsiaTheme="minorEastAsia" w:hAnsi="Cambria Math" w:cs="Times New Roman"/>
+                      <w:color w:val="000000"/>
+                      <w:szCs w:val="24"/>
+                      <w:lang w:val="uk-UA" w:eastAsia="en-US"/>
+                    </w:rPr>
+                    <m:t>u</m:t>
+                  </m:r>
+                </m:e>
+              </m:acc>
+              <m:d>
+                <m:dPr>
+                  <m:ctrlPr>
+                    <w:rPr>
+                      <w:rFonts w:ascii="Cambria Math" w:eastAsiaTheme="minorEastAsia" w:hAnsi="Cambria Math" w:cs="Times New Roman"/>
+                      <w:i/>
+                      <w:color w:val="000000"/>
+                      <w:szCs w:val="24"/>
+                      <w:lang w:val="uk-UA" w:eastAsia="en-US"/>
+                    </w:rPr>
+                  </m:ctrlPr>
+                </m:dPr>
+                <m:e>
+                  <m:r>
+                    <w:rPr>
+                      <w:rFonts w:ascii="Cambria Math" w:eastAsiaTheme="minorEastAsia" w:hAnsi="Cambria Math" w:cs="Times New Roman"/>
+                      <w:color w:val="000000"/>
+                      <w:szCs w:val="24"/>
+                      <w:lang w:val="uk-UA" w:eastAsia="en-US"/>
+                    </w:rPr>
+                    <m:t>e</m:t>
+                  </m:r>
+                </m:e>
+              </m:d>
+            </m:e>
+          </m:d>
+          <m:r>
+            <w:rPr>
+              <w:rFonts w:ascii="Cambria Math" w:eastAsiaTheme="minorEastAsia" w:hAnsi="Cambria Math" w:cs="Times New Roman"/>
+              <w:color w:val="000000"/>
+              <w:szCs w:val="24"/>
+              <w:lang w:val="uk-UA" w:eastAsia="en-US"/>
+            </w:rPr>
+            <m:t xml:space="preserve">&lt; </m:t>
+          </m:r>
+          <m:sSub>
+            <m:sSubPr>
+              <m:ctrlPr>
+                <w:rPr>
+                  <w:rFonts w:ascii="Cambria Math" w:eastAsiaTheme="minorEastAsia" w:hAnsi="Cambria Math" w:cs="Times New Roman"/>
+                  <w:i/>
+                  <w:color w:val="000000"/>
+                  <w:szCs w:val="24"/>
+                  <w:lang w:val="uk-UA" w:eastAsia="en-US"/>
+                </w:rPr>
+              </m:ctrlPr>
+            </m:sSubPr>
+            <m:e>
+              <m:r>
+                <w:rPr>
+                  <w:rFonts w:ascii="Cambria Math" w:eastAsiaTheme="minorEastAsia" w:hAnsi="Cambria Math" w:cs="Times New Roman"/>
+                  <w:color w:val="000000"/>
+                  <w:szCs w:val="24"/>
+                  <w:lang w:val="uk-UA" w:eastAsia="en-US"/>
+                </w:rPr>
+                <m:t>v</m:t>
+              </m:r>
+            </m:e>
+            <m:sub>
+              <m:r>
+                <w:rPr>
+                  <w:rFonts w:ascii="Cambria Math" w:eastAsiaTheme="minorEastAsia" w:hAnsi="Cambria Math" w:cs="Times New Roman"/>
+                  <w:color w:val="000000"/>
+                  <w:szCs w:val="24"/>
+                  <w:lang w:val="uk-UA" w:eastAsia="en-US"/>
+                </w:rPr>
+                <m:t>max</m:t>
+              </m:r>
+            </m:sub>
+          </m:sSub>
+          <m:r>
+            <w:rPr>
+              <w:rFonts w:ascii="Cambria Math" w:eastAsiaTheme="minorEastAsia" w:hAnsi="Cambria Math" w:cs="Times New Roman"/>
+              <w:color w:val="000000"/>
+              <w:szCs w:val="24"/>
+              <w:lang w:val="uk-UA" w:eastAsia="en-US"/>
+            </w:rPr>
+            <m:t>,  ∀e∈E</m:t>
+          </m:r>
+          <m:d>
+            <m:dPr>
+              <m:ctrlPr>
+                <w:rPr>
+                  <w:rFonts w:ascii="Cambria Math" w:eastAsiaTheme="minorEastAsia" w:hAnsi="Cambria Math" w:cs="Times New Roman"/>
+                  <w:i/>
+                  <w:color w:val="000000"/>
+                  <w:szCs w:val="24"/>
+                  <w:lang w:val="uk-UA" w:eastAsia="en-US"/>
+                </w:rPr>
+              </m:ctrlPr>
+            </m:dPr>
+            <m:e>
+              <m:r>
+                <w:rPr>
+                  <w:rFonts w:ascii="Cambria Math" w:eastAsiaTheme="minorEastAsia" w:hAnsi="Cambria Math" w:cs="Times New Roman"/>
+                  <w:color w:val="000000"/>
+                  <w:szCs w:val="24"/>
+                  <w:lang w:val="uk-UA" w:eastAsia="en-US"/>
+                </w:rPr>
+                <m:t>P</m:t>
+              </m:r>
+            </m:e>
+          </m:d>
+        </m:oMath>
+      </m:oMathPara>
+    </w:p>
+    <w:p>
+      <w:pPr>
+        <w:pStyle w:val="BodyTextIndent"/>
+        <w:ind w:firstLine="567"/>
+        <w:jc w:val="both"/>
+        <w:rPr>
+          <w:rFonts w:eastAsiaTheme="minorEastAsia" w:cs="Times New Roman"/>
+          <w:color w:val="000000"/>
+          <w:szCs w:val="24"/>
+          <w:lang w:val="uk-UA" w:eastAsia="en-US"/>
+        </w:rPr>
+      </w:pPr>
+      <w:r>
+        <w:rPr>
+          <w:rFonts w:eastAsiaTheme="minorEastAsia" w:cs="Times New Roman"/>
+          <w:color w:val="000000"/>
+          <w:szCs w:val="24"/>
+          <w:lang w:val="uk-UA" w:eastAsia="en-US"/>
+        </w:rPr>
+        <w:t>Маршрут руху не повинен пролягати через зони, де політ заборонено</w:t>
+      </w:r>
+      <w:r>
+        <w:rPr>
+          <w:rFonts w:eastAsiaTheme="minorEastAsia" w:cs="Times New Roman"/>
+          <w:color w:val="000000"/>
+          <w:szCs w:val="24"/>
+          <w:lang w:val="uk-UA" w:eastAsia="en-US"/>
+        </w:rPr>
+        <w:t>:</w:t>
+      </w:r>
+    </w:p>
+    <w:p>
+      <w:pPr>
+        <w:pStyle w:val="BodyTextIndent"/>
+        <w:ind w:firstLine="567"/>
+        <w:jc w:val="both"/>
+        <w:rPr>
+          <w:rFonts w:eastAsiaTheme="minorEastAsia" w:cs="Times New Roman"/>
+          <w:color w:val="000000"/>
+          <w:szCs w:val="24"/>
+          <w:lang w:val="uk-UA" w:eastAsia="en-US"/>
+        </w:rPr>
+      </w:pPr>
+      <m:oMathPara>
+        <m:oMath>
+          <m:sSub>
+            <m:sSubPr>
+              <m:ctrlPr>
+                <w:rPr>
+                  <w:rFonts w:ascii="Cambria Math" w:eastAsiaTheme="minorEastAsia" w:hAnsi="Cambria Math" w:cs="Times New Roman"/>
+                  <w:i/>
+                  <w:color w:val="000000"/>
+                  <w:szCs w:val="24"/>
+                  <w:lang w:val="uk-UA" w:eastAsia="en-US"/>
+                </w:rPr>
+              </m:ctrlPr>
+            </m:sSubPr>
+            <m:e>
+              <m:r>
+                <w:rPr>
+                  <w:rFonts w:ascii="Cambria Math" w:eastAsiaTheme="minorEastAsia" w:hAnsi="Cambria Math" w:cs="Times New Roman"/>
+                  <w:color w:val="000000"/>
+                  <w:szCs w:val="24"/>
+                  <w:lang w:val="uk-UA" w:eastAsia="en-US"/>
+                </w:rPr>
+                <m:t>w</m:t>
+              </m:r>
+            </m:e>
+            <m:sub>
+              <m:r>
+                <w:rPr>
+                  <w:rFonts w:ascii="Cambria Math" w:eastAsiaTheme="minorEastAsia" w:hAnsi="Cambria Math" w:cs="Times New Roman"/>
+                  <w:color w:val="000000"/>
+                  <w:szCs w:val="24"/>
+                  <w:lang w:val="uk-UA" w:eastAsia="en-US"/>
+                </w:rPr>
+                <m:t>i</m:t>
+              </m:r>
+            </m:sub>
+          </m:sSub>
+          <m:r>
+            <w:rPr>
+              <w:rFonts w:ascii="Cambria Math" w:eastAsiaTheme="minorEastAsia" w:hAnsi="Cambria Math" w:cs="Times New Roman"/>
+              <w:color w:val="000000"/>
+              <w:szCs w:val="24"/>
+              <w:lang w:val="uk-UA" w:eastAsia="en-US"/>
+            </w:rPr>
+            <m:t>∉</m:t>
+          </m:r>
+          <m:r>
+            <w:rPr>
+              <w:rFonts w:ascii="Cambria Math" w:eastAsiaTheme="minorEastAsia" w:hAnsi="Cambria Math" w:cs="Times New Roman"/>
+              <w:color w:val="000000"/>
+              <w:szCs w:val="24"/>
+              <w:lang w:val="uk-UA" w:eastAsia="en-US"/>
+            </w:rPr>
+            <m:t>F,  ∀i</m:t>
+          </m:r>
+        </m:oMath>
+      </m:oMathPara>
+    </w:p>
+    <w:p>
+      <w:pPr>
+        <w:pStyle w:val="BodyTextIndent"/>
+        <w:ind w:firstLine="567"/>
+        <w:jc w:val="both"/>
+        <w:rPr>
+          <w:rFonts w:eastAsiaTheme="minorEastAsia" w:cs="Times New Roman"/>
+          <w:color w:val="000000"/>
+          <w:szCs w:val="24"/>
+          <w:lang w:val="uk-UA" w:eastAsia="en-US"/>
+        </w:rPr>
+      </w:pPr>
+      <w:r>
+        <w:rPr>
+          <w:rFonts w:eastAsiaTheme="minorEastAsia" w:cs="Times New Roman"/>
+          <w:color w:val="000000"/>
+          <w:szCs w:val="24"/>
+          <w:lang w:val="uk-UA" w:eastAsia="en-US"/>
+        </w:rPr>
+        <w:t>У БПС повинно бути достатньо енергії, щоб пролетіти запланований маршрут, тому:</w:t>
+      </w:r>
+    </w:p>
+    <w:p>
+      <w:pPr>
+        <w:pStyle w:val="BodyTextIndent"/>
+        <w:ind w:firstLine="567"/>
+        <w:jc w:val="both"/>
+        <w:rPr>
+          <w:rFonts w:eastAsiaTheme="minorEastAsia" w:cs="Times New Roman"/>
+          <w:color w:val="000000"/>
+          <w:szCs w:val="24"/>
+          <w:lang w:val="uk-UA" w:eastAsia="en-US"/>
+        </w:rPr>
+      </w:pPr>
+      <m:oMathPara>
+        <m:oMath>
+          <m:nary>
+            <m:naryPr>
+              <m:chr m:val="∑"/>
+              <m:limLoc m:val="undOvr"/>
+              <m:supHide m:val="1"/>
+              <m:ctrlPr>
+                <w:rPr>
+                  <w:rFonts w:ascii="Cambria Math" w:eastAsiaTheme="minorEastAsia" w:hAnsi="Cambria Math" w:cs="Times New Roman"/>
+                  <w:i/>
+                  <w:color w:val="000000"/>
+                  <w:szCs w:val="24"/>
+                  <w:lang w:val="uk-UA" w:eastAsia="en-US"/>
+                </w:rPr>
+              </m:ctrlPr>
+            </m:naryPr>
+            <m:sub>
+              <m:r>
+                <w:rPr>
+                  <w:rFonts w:ascii="Cambria Math" w:hAnsi="Cambria Math" w:cs="Times New Roman"/>
+                  <w:color w:val="000000"/>
+                  <w:szCs w:val="24"/>
+                  <w:lang w:val="uk-UA" w:eastAsia="en-US"/>
+                </w:rPr>
+                <m:t>e∈E</m:t>
+              </m:r>
+              <m:d>
+                <m:dPr>
+                  <m:ctrlPr>
+                    <w:rPr>
+                      <w:rFonts w:ascii="Cambria Math" w:hAnsi="Cambria Math" w:cs="Times New Roman"/>
+                      <w:i/>
+                      <w:color w:val="000000"/>
+                      <w:szCs w:val="24"/>
+                      <w:lang w:val="uk-UA" w:eastAsia="en-US"/>
+                    </w:rPr>
+                  </m:ctrlPr>
+                </m:dPr>
+                <m:e>
+                  <m:r>
+                    <w:rPr>
+                      <w:rFonts w:ascii="Cambria Math" w:hAnsi="Cambria Math" w:cs="Times New Roman"/>
+                      <w:color w:val="000000"/>
+                      <w:szCs w:val="24"/>
+                      <w:lang w:val="uk-UA" w:eastAsia="en-US"/>
+                    </w:rPr>
+                    <m:t>P</m:t>
+                  </m:r>
+                </m:e>
+              </m:d>
+            </m:sub>
+            <m:sup/>
+            <m:e>
+              <m:r>
+                <w:rPr>
+                  <w:rFonts w:ascii="Cambria Math" w:eastAsiaTheme="minorEastAsia" w:hAnsi="Cambria Math" w:cs="Times New Roman"/>
+                  <w:color w:val="000000"/>
+                  <w:szCs w:val="24"/>
+                  <w:lang w:val="uk-UA" w:eastAsia="en-US"/>
+                </w:rPr>
+                <m:t>ε</m:t>
+              </m:r>
+              <m:d>
+                <m:dPr>
+                  <m:ctrlPr>
+                    <w:rPr>
+                      <w:rFonts w:ascii="Cambria Math" w:eastAsiaTheme="minorEastAsia" w:hAnsi="Cambria Math" w:cs="Times New Roman"/>
+                      <w:i/>
+                      <w:color w:val="000000"/>
+                      <w:szCs w:val="24"/>
+                      <w:lang w:val="uk-UA" w:eastAsia="en-US"/>
+                    </w:rPr>
+                  </m:ctrlPr>
+                </m:dPr>
+                <m:e>
+                  <m:r>
+                    <w:rPr>
+                      <w:rFonts w:ascii="Cambria Math" w:eastAsiaTheme="minorEastAsia" w:hAnsi="Cambria Math" w:cs="Times New Roman"/>
+                      <w:color w:val="000000"/>
+                      <w:szCs w:val="24"/>
+                      <w:lang w:val="en-US" w:eastAsia="en-US"/>
+                    </w:rPr>
+                    <m:t>e</m:t>
+                  </m:r>
+                </m:e>
+              </m:d>
+              <m:r>
+                <w:rPr>
+                  <w:rFonts w:ascii="Cambria Math" w:eastAsiaTheme="minorEastAsia" w:hAnsi="Cambria Math" w:cs="Times New Roman"/>
+                  <w:color w:val="000000"/>
+                  <w:szCs w:val="24"/>
+                  <w:lang w:val="uk-UA" w:eastAsia="en-US"/>
+                </w:rPr>
+                <m:t xml:space="preserve">≤ </m:t>
+              </m:r>
+              <m:sSub>
+                <m:sSubPr>
+                  <m:ctrlPr>
+                    <w:rPr>
+                      <w:rFonts w:ascii="Cambria Math" w:eastAsiaTheme="minorEastAsia" w:hAnsi="Cambria Math" w:cs="Times New Roman"/>
+                      <w:i/>
+                      <w:color w:val="000000"/>
+                      <w:szCs w:val="24"/>
+                      <w:lang w:val="uk-UA" w:eastAsia="en-US"/>
+                    </w:rPr>
+                  </m:ctrlPr>
+                </m:sSubPr>
+                <m:e>
+                  <m:r>
+                    <w:rPr>
+                      <w:rFonts w:ascii="Cambria Math" w:eastAsiaTheme="minorEastAsia" w:hAnsi="Cambria Math" w:cs="Times New Roman"/>
+                      <w:color w:val="000000"/>
+                      <w:szCs w:val="24"/>
+                      <w:lang w:val="uk-UA" w:eastAsia="en-US"/>
+                    </w:rPr>
+                    <m:t>ε</m:t>
+                  </m:r>
+                </m:e>
+                <m:sub>
+                  <m:r>
+                    <w:rPr>
+                      <w:rFonts w:ascii="Cambria Math" w:eastAsiaTheme="minorEastAsia" w:hAnsi="Cambria Math" w:cs="Times New Roman"/>
+                      <w:color w:val="000000"/>
+                      <w:szCs w:val="24"/>
+                      <w:lang w:val="uk-UA" w:eastAsia="en-US"/>
+                    </w:rPr>
+                    <m:t>total</m:t>
+                  </m:r>
+                </m:sub>
+              </m:sSub>
+            </m:e>
+          </m:nary>
+        </m:oMath>
+      </m:oMathPara>
+    </w:p>
+    <w:p>
+      <w:pPr>
+        <w:pStyle w:val="BodyTextIndent"/>
+        <w:ind w:firstLine="567"/>
+        <w:jc w:val="both"/>
+        <w:rPr>
+          <w:rFonts w:eastAsiaTheme="minorEastAsia" w:cs="Times New Roman"/>
+          <w:color w:val="000000"/>
+          <w:szCs w:val="24"/>
+          <w:lang w:val="uk-UA" w:eastAsia="en-US"/>
+        </w:rPr>
+      </w:pPr>
+      <w:r>
+        <w:rPr>
+          <w:rFonts w:eastAsiaTheme="minorEastAsia" w:cs="Times New Roman"/>
+          <w:color w:val="000000"/>
+          <w:szCs w:val="24"/>
+          <w:lang w:val="uk-UA" w:eastAsia="en-US"/>
+        </w:rPr>
+        <w:t xml:space="preserve">Для того, щоб запобігти втраті БПС внаслідок непередбачуваних ситуацій під час польоту, слід формувати маршрут таким чином, щоб </w:t>
+      </w:r>
+      <w:r>
+        <w:rPr>
+          <w:rFonts w:eastAsiaTheme="minorEastAsia" w:cs="Times New Roman"/>
+          <w:color w:val="000000"/>
+          <w:szCs w:val="24"/>
+          <w:lang w:val="uk-UA" w:eastAsia="en-US"/>
+        </w:rPr>
+        <w:t>запасу енергії в кожній точці польоту було достатньо для виконання</w:t>
+      </w:r>
+      <w:r>
+        <w:rPr>
+          <w:rFonts w:eastAsiaTheme="minorEastAsia" w:cs="Times New Roman"/>
+          <w:color w:val="000000"/>
+          <w:szCs w:val="24"/>
+          <w:lang w:val="uk-UA" w:eastAsia="en-US"/>
+        </w:rPr>
+        <w:t xml:space="preserve"> аварійного</w:t>
+      </w:r>
+      <w:r>
+        <w:rPr>
+          <w:rFonts w:eastAsiaTheme="minorEastAsia" w:cs="Times New Roman"/>
+          <w:color w:val="000000"/>
+          <w:szCs w:val="24"/>
+          <w:lang w:val="uk-UA" w:eastAsia="en-US"/>
+        </w:rPr>
+        <w:t xml:space="preserve"> приземлення в сприятливій </w:t>
+      </w:r>
+      <w:r>
+        <w:rPr>
+          <w:rFonts w:eastAsiaTheme="minorEastAsia" w:cs="Times New Roman"/>
+          <w:color w:val="000000"/>
+          <w:szCs w:val="24"/>
+          <w:lang w:val="uk-UA" w:eastAsia="en-US"/>
+        </w:rPr>
+        <w:t>точці (</w:t>
+      </w:r>
+      <m:oMath>
+        <m:sSub>
+          <m:sSubPr>
+            <m:ctrlPr>
+              <w:rPr>
+                <w:rFonts w:ascii="Cambria Math" w:eastAsiaTheme="minorEastAsia" w:hAnsi="Cambria Math" w:cs="Times New Roman"/>
+                <w:i/>
+                <w:color w:val="000000"/>
+                <w:szCs w:val="24"/>
+                <w:lang w:val="uk-UA" w:eastAsia="en-US"/>
+              </w:rPr>
+            </m:ctrlPr>
+          </m:sSubPr>
+          <m:e>
+            <m:r>
+              <w:rPr>
+                <w:rFonts w:ascii="Cambria Math" w:eastAsiaTheme="minorEastAsia" w:hAnsi="Cambria Math" w:cs="Times New Roman"/>
+                <w:color w:val="000000"/>
+                <w:szCs w:val="24"/>
+                <w:lang w:val="uk-UA" w:eastAsia="en-US"/>
+              </w:rPr>
+              <m:t>L</m:t>
+            </m:r>
+          </m:e>
+          <m:sub>
+            <m:r>
+              <w:rPr>
+                <w:rFonts w:ascii="Cambria Math" w:eastAsiaTheme="minorEastAsia" w:hAnsi="Cambria Math" w:cs="Times New Roman"/>
+                <w:color w:val="000000"/>
+                <w:szCs w:val="24"/>
+                <w:lang w:val="uk-UA" w:eastAsia="en-US"/>
+              </w:rPr>
+              <m:t>i</m:t>
+            </m:r>
+          </m:sub>
+        </m:sSub>
+      </m:oMath>
+      <w:r>
+        <w:rPr>
+          <w:rFonts w:eastAsiaTheme="minorEastAsia" w:cs="Times New Roman"/>
+          <w:color w:val="000000"/>
+          <w:szCs w:val="24"/>
+          <w:lang w:val="uk-UA" w:eastAsia="en-US"/>
+        </w:rPr>
+        <w:t>):</w:t>
+      </w:r>
+    </w:p>
+    <w:p>
+      <w:pPr>
+        <w:pStyle w:val="BodyTextIndent"/>
+        <w:ind w:firstLine="567"/>
+        <w:jc w:val="both"/>
+        <w:rPr>
+          <w:rFonts w:eastAsiaTheme="minorEastAsia" w:cs="Times New Roman"/>
+          <w:color w:val="000000"/>
+          <w:szCs w:val="24"/>
+          <w:lang w:val="uk-UA" w:eastAsia="en-US"/>
+        </w:rPr>
+      </w:pPr>
+      <m:oMathPara>
+        <m:oMath>
+          <m:sSub>
+            <m:sSubPr>
+              <m:ctrlPr>
+                <w:rPr>
+                  <w:rFonts w:ascii="Cambria Math" w:eastAsiaTheme="minorEastAsia" w:hAnsi="Cambria Math" w:cs="Times New Roman"/>
+                  <w:i/>
+                  <w:color w:val="000000"/>
+                  <w:szCs w:val="24"/>
+                  <w:lang w:val="uk-UA" w:eastAsia="en-US"/>
+                </w:rPr>
+              </m:ctrlPr>
+            </m:sSubPr>
+            <m:e>
+              <m:r>
+                <w:rPr>
+                  <w:rFonts w:ascii="Cambria Math" w:eastAsiaTheme="minorEastAsia" w:hAnsi="Cambria Math" w:cs="Times New Roman"/>
+                  <w:color w:val="000000"/>
+                  <w:szCs w:val="24"/>
+                  <w:lang w:val="uk-UA" w:eastAsia="en-US"/>
+                </w:rPr>
+                <m:t>ε</m:t>
+              </m:r>
+            </m:e>
+            <m:sub>
+              <m:r>
+                <w:rPr>
+                  <w:rFonts w:ascii="Cambria Math" w:eastAsiaTheme="minorEastAsia" w:hAnsi="Cambria Math" w:cs="Times New Roman"/>
+                  <w:color w:val="000000"/>
+                  <w:szCs w:val="24"/>
+                  <w:lang w:val="uk-UA" w:eastAsia="en-US"/>
+                </w:rPr>
+                <m:t>total</m:t>
+              </m:r>
+            </m:sub>
+          </m:sSub>
+          <m:r>
+            <w:rPr>
+              <w:rFonts w:ascii="Cambria Math" w:eastAsiaTheme="minorEastAsia" w:hAnsi="Cambria Math" w:cs="Times New Roman"/>
+              <w:color w:val="000000"/>
+              <w:szCs w:val="24"/>
+              <w:lang w:val="uk-UA" w:eastAsia="en-US"/>
+            </w:rPr>
+            <m:t>-</m:t>
+          </m:r>
+          <m:nary>
+            <m:naryPr>
+              <m:chr m:val="∑"/>
+              <m:limLoc m:val="undOvr"/>
+              <m:supHide m:val="1"/>
+              <m:ctrlPr>
+                <w:rPr>
+                  <w:rFonts w:ascii="Cambria Math" w:eastAsiaTheme="minorEastAsia" w:hAnsi="Cambria Math" w:cs="Times New Roman"/>
+                  <w:i/>
+                  <w:color w:val="000000"/>
+                  <w:szCs w:val="24"/>
+                  <w:lang w:val="uk-UA" w:eastAsia="en-US"/>
+                </w:rPr>
+              </m:ctrlPr>
+            </m:naryPr>
+            <m:sub>
+              <m:r>
+                <w:rPr>
+                  <w:rFonts w:ascii="Cambria Math" w:hAnsi="Cambria Math" w:cs="Times New Roman"/>
+                  <w:color w:val="000000"/>
+                  <w:szCs w:val="24"/>
+                  <w:lang w:val="uk-UA" w:eastAsia="en-US"/>
+                </w:rPr>
+                <m:t>e∈E</m:t>
+              </m:r>
+              <m:d>
+                <m:dPr>
+                  <m:ctrlPr>
+                    <w:rPr>
+                      <w:rFonts w:ascii="Cambria Math" w:hAnsi="Cambria Math" w:cs="Times New Roman"/>
+                      <w:i/>
+                      <w:color w:val="000000"/>
+                      <w:szCs w:val="24"/>
+                      <w:lang w:val="uk-UA" w:eastAsia="en-US"/>
+                    </w:rPr>
+                  </m:ctrlPr>
+                </m:dPr>
+                <m:e>
+                  <m:sSub>
+                    <m:sSubPr>
+                      <m:ctrlPr>
+                        <w:rPr>
+                          <w:rFonts w:ascii="Cambria Math" w:hAnsi="Cambria Math" w:cs="Times New Roman"/>
+                          <w:i/>
+                          <w:color w:val="000000"/>
+                          <w:szCs w:val="24"/>
+                          <w:lang w:val="uk-UA" w:eastAsia="en-US"/>
+                        </w:rPr>
+                      </m:ctrlPr>
+                    </m:sSubPr>
+                    <m:e>
+                      <m:r>
+                        <w:rPr>
+                          <w:rFonts w:ascii="Cambria Math" w:hAnsi="Cambria Math" w:cs="Times New Roman"/>
+                          <w:color w:val="000000"/>
+                          <w:szCs w:val="24"/>
+                          <w:lang w:val="uk-UA" w:eastAsia="en-US"/>
+                        </w:rPr>
+                        <m:t>P</m:t>
+                      </m:r>
+                    </m:e>
+                    <m:sub>
+                      <m:r>
+                        <w:rPr>
+                          <w:rFonts w:ascii="Cambria Math" w:hAnsi="Cambria Math" w:cs="Times New Roman"/>
+                          <w:color w:val="000000"/>
+                          <w:szCs w:val="24"/>
+                          <w:lang w:val="uk-UA" w:eastAsia="en-US"/>
+                        </w:rPr>
+                        <m:t>0</m:t>
+                      </m:r>
+                    </m:sub>
+                  </m:sSub>
+                  <m:r>
+                    <w:rPr>
+                      <w:rFonts w:ascii="Cambria Math" w:hAnsi="Cambria Math" w:cs="Times New Roman"/>
+                      <w:color w:val="000000"/>
+                      <w:szCs w:val="24"/>
+                      <w:lang w:val="uk-UA" w:eastAsia="en-US"/>
+                    </w:rPr>
+                    <m:t>→</m:t>
+                  </m:r>
+                  <m:sSub>
+                    <m:sSubPr>
+                      <m:ctrlPr>
+                        <w:rPr>
+                          <w:rFonts w:ascii="Cambria Math" w:hAnsi="Cambria Math" w:cs="Times New Roman"/>
+                          <w:i/>
+                          <w:color w:val="000000"/>
+                          <w:szCs w:val="24"/>
+                          <w:lang w:val="uk-UA" w:eastAsia="en-US"/>
+                        </w:rPr>
+                      </m:ctrlPr>
+                    </m:sSubPr>
+                    <m:e>
+                      <m:r>
+                        <w:rPr>
+                          <w:rFonts w:ascii="Cambria Math" w:hAnsi="Cambria Math" w:cs="Times New Roman"/>
+                          <w:color w:val="000000"/>
+                          <w:szCs w:val="24"/>
+                          <w:lang w:val="uk-UA" w:eastAsia="en-US"/>
+                        </w:rPr>
+                        <m:t>w</m:t>
+                      </m:r>
+                    </m:e>
+                    <m:sub>
+                      <m:r>
+                        <w:rPr>
+                          <w:rFonts w:ascii="Cambria Math" w:hAnsi="Cambria Math" w:cs="Times New Roman"/>
+                          <w:color w:val="000000"/>
+                          <w:szCs w:val="24"/>
+                          <w:lang w:val="uk-UA" w:eastAsia="en-US"/>
+                        </w:rPr>
+                        <m:t>i</m:t>
+                      </m:r>
+                    </m:sub>
+                  </m:sSub>
+                </m:e>
+              </m:d>
+            </m:sub>
+            <m:sup/>
+            <m:e>
+              <m:r>
+                <w:rPr>
+                  <w:rFonts w:ascii="Cambria Math" w:eastAsiaTheme="minorEastAsia" w:hAnsi="Cambria Math" w:cs="Times New Roman"/>
+                  <w:color w:val="000000"/>
+                  <w:szCs w:val="24"/>
+                  <w:lang w:val="uk-UA" w:eastAsia="en-US"/>
+                </w:rPr>
+                <m:t>ε</m:t>
+              </m:r>
+              <m:d>
+                <m:dPr>
+                  <m:ctrlPr>
+                    <w:rPr>
+                      <w:rFonts w:ascii="Cambria Math" w:eastAsiaTheme="minorEastAsia" w:hAnsi="Cambria Math" w:cs="Times New Roman"/>
+                      <w:i/>
+                      <w:color w:val="000000"/>
+                      <w:szCs w:val="24"/>
+                      <w:lang w:val="uk-UA" w:eastAsia="en-US"/>
+                    </w:rPr>
+                  </m:ctrlPr>
+                </m:dPr>
+                <m:e>
+                  <m:r>
+                    <w:rPr>
+                      <w:rFonts w:ascii="Cambria Math" w:eastAsiaTheme="minorEastAsia" w:hAnsi="Cambria Math" w:cs="Times New Roman"/>
+                      <w:color w:val="000000"/>
+                      <w:szCs w:val="24"/>
+                      <w:lang w:val="en-US" w:eastAsia="en-US"/>
+                    </w:rPr>
+                    <m:t>e</m:t>
+                  </m:r>
+                </m:e>
+              </m:d>
+              <m:r>
+                <w:rPr>
+                  <w:rFonts w:ascii="Cambria Math" w:eastAsiaTheme="minorEastAsia" w:hAnsi="Cambria Math" w:cs="Times New Roman"/>
+                  <w:color w:val="000000"/>
+                  <w:szCs w:val="24"/>
+                  <w:lang w:val="uk-UA" w:eastAsia="en-US"/>
+                </w:rPr>
+                <m:t>≥</m:t>
+              </m:r>
+              <m:r>
+                <w:rPr>
+                  <w:rFonts w:ascii="Cambria Math" w:eastAsiaTheme="minorEastAsia" w:hAnsi="Cambria Math" w:cs="Times New Roman"/>
+                  <w:color w:val="000000"/>
+                  <w:szCs w:val="24"/>
+                  <w:lang w:val="uk-UA" w:eastAsia="en-US"/>
+                </w:rPr>
+                <m:t>ε</m:t>
+              </m:r>
+              <m:d>
+                <m:dPr>
+                  <m:ctrlPr>
+                    <w:rPr>
+                      <w:rFonts w:ascii="Cambria Math" w:eastAsiaTheme="minorEastAsia" w:hAnsi="Cambria Math" w:cs="Times New Roman"/>
+                      <w:i/>
+                      <w:color w:val="000000"/>
+                      <w:szCs w:val="24"/>
+                      <w:lang w:val="uk-UA" w:eastAsia="en-US"/>
+                    </w:rPr>
+                  </m:ctrlPr>
+                </m:dPr>
+                <m:e>
+                  <m:sSub>
+                    <m:sSubPr>
+                      <m:ctrlPr>
+                        <w:rPr>
+                          <w:rFonts w:ascii="Cambria Math" w:eastAsiaTheme="minorEastAsia" w:hAnsi="Cambria Math" w:cs="Times New Roman"/>
+                          <w:i/>
+                          <w:color w:val="000000"/>
+                          <w:szCs w:val="24"/>
+                          <w:lang w:val="en-US" w:eastAsia="en-US"/>
+                        </w:rPr>
+                      </m:ctrlPr>
+                    </m:sSubPr>
+                    <m:e>
+                      <m:r>
+                        <w:rPr>
+                          <w:rFonts w:ascii="Cambria Math" w:eastAsiaTheme="minorEastAsia" w:hAnsi="Cambria Math" w:cs="Times New Roman"/>
+                          <w:color w:val="000000"/>
+                          <w:szCs w:val="24"/>
+                          <w:lang w:val="en-US" w:eastAsia="en-US"/>
+                        </w:rPr>
+                        <m:t>w</m:t>
+                      </m:r>
+                    </m:e>
+                    <m:sub>
+                      <m:r>
+                        <w:rPr>
+                          <w:rFonts w:ascii="Cambria Math" w:eastAsiaTheme="minorEastAsia" w:hAnsi="Cambria Math" w:cs="Times New Roman"/>
+                          <w:color w:val="000000"/>
+                          <w:szCs w:val="24"/>
+                          <w:lang w:val="en-US" w:eastAsia="en-US"/>
+                        </w:rPr>
+                        <m:t>i</m:t>
+                      </m:r>
+                    </m:sub>
+                  </m:sSub>
+                  <m:r>
+                    <w:rPr>
+                      <w:rFonts w:ascii="Cambria Math" w:eastAsiaTheme="minorEastAsia" w:hAnsi="Cambria Math" w:cs="Times New Roman"/>
+                      <w:color w:val="000000"/>
+                      <w:szCs w:val="24"/>
+                      <w:lang w:val="en-US" w:eastAsia="en-US"/>
+                    </w:rPr>
+                    <m:t>→</m:t>
+                  </m:r>
+                  <m:sSub>
+                    <m:sSubPr>
+                      <m:ctrlPr>
+                        <w:rPr>
+                          <w:rFonts w:ascii="Cambria Math" w:eastAsiaTheme="minorEastAsia" w:hAnsi="Cambria Math" w:cs="Times New Roman"/>
+                          <w:i/>
+                          <w:color w:val="000000"/>
+                          <w:szCs w:val="24"/>
+                          <w:lang w:val="en-US" w:eastAsia="en-US"/>
+                        </w:rPr>
+                      </m:ctrlPr>
+                    </m:sSubPr>
+                    <m:e>
+                      <m:r>
+                        <w:rPr>
+                          <w:rFonts w:ascii="Cambria Math" w:eastAsiaTheme="minorEastAsia" w:hAnsi="Cambria Math" w:cs="Times New Roman"/>
+                          <w:color w:val="000000"/>
+                          <w:szCs w:val="24"/>
+                          <w:lang w:val="en-US" w:eastAsia="en-US"/>
+                        </w:rPr>
+                        <m:t>L</m:t>
+                      </m:r>
+                    </m:e>
+                    <m:sub>
+                      <m:r>
+                        <w:rPr>
+                          <w:rFonts w:ascii="Cambria Math" w:eastAsiaTheme="minorEastAsia" w:hAnsi="Cambria Math" w:cs="Times New Roman"/>
+                          <w:color w:val="000000"/>
+                          <w:szCs w:val="24"/>
+                          <w:lang w:val="en-US" w:eastAsia="en-US"/>
+                        </w:rPr>
+                        <m:t>i</m:t>
+                      </m:r>
+                    </m:sub>
+                  </m:sSub>
+                </m:e>
+              </m:d>
+              <m:r>
+                <w:rPr>
+                  <w:rFonts w:ascii="Cambria Math" w:eastAsiaTheme="minorEastAsia" w:hAnsi="Cambria Math" w:cs="Times New Roman"/>
+                  <w:color w:val="000000"/>
+                  <w:szCs w:val="24"/>
+                  <w:lang w:val="uk-UA" w:eastAsia="en-US"/>
+                </w:rPr>
+                <m:t>,   ∀i</m:t>
+              </m:r>
+            </m:e>
+          </m:nary>
+        </m:oMath>
+      </m:oMathPara>
+    </w:p>
+    <w:p>
+      <w:pPr>
+        <w:pStyle w:val="BodyTextIndent"/>
+        <w:ind w:firstLine="567"/>
+        <w:jc w:val="both"/>
+        <w:rPr>
+          <w:rFonts w:eastAsiaTheme="minorEastAsia" w:cs="Times New Roman"/>
+          <w:color w:val="000000"/>
+          <w:szCs w:val="24"/>
+          <w:lang w:val="uk-UA" w:eastAsia="en-US"/>
+        </w:rPr>
+      </w:pPr>
+      <w:r>
+        <w:rPr>
+          <w:rFonts w:eastAsiaTheme="minorEastAsia" w:cs="Times New Roman"/>
+          <w:color w:val="000000"/>
+          <w:szCs w:val="24"/>
+          <w:lang w:val="uk-UA" w:eastAsia="en-US"/>
+        </w:rPr>
+        <w:t>Слід врахо</w:t>
+      </w:r>
+      <w:r>
+        <w:rPr>
+          <w:rFonts w:eastAsiaTheme="minorEastAsia" w:cs="Times New Roman"/>
+          <w:color w:val="000000"/>
+          <w:szCs w:val="24"/>
+          <w:lang w:val="uk-UA" w:eastAsia="en-US"/>
+        </w:rPr>
+        <w:t>вувати можливості БПС для зміни положення в просторі, які визнача</w:t>
+      </w:r>
+      <w:r>
+        <w:rPr>
+          <w:rFonts w:eastAsiaTheme="minorEastAsia" w:cs="Times New Roman"/>
+          <w:color w:val="000000"/>
+          <w:szCs w:val="24"/>
+          <w:lang w:val="uk-UA" w:eastAsia="en-US"/>
+        </w:rPr>
+        <w:t>ються його кінематичною моделлю для забезпечення маршруту, який БПС здатен повторити фізично:</w:t>
+      </w:r>
+    </w:p>
+    <w:p>
+      <w:pPr>
+        <w:pStyle w:val="BodyTextIndent"/>
+        <w:ind w:firstLine="567"/>
+        <w:jc w:val="both"/>
+        <w:rPr>
+          <w:rFonts w:eastAsiaTheme="minorEastAsia" w:cs="Times New Roman"/>
+          <w:i/>
+          <w:color w:val="000000"/>
+          <w:szCs w:val="24"/>
+          <w:lang w:val="en-US" w:eastAsia="en-US"/>
+        </w:rPr>
+      </w:pPr>
+      <m:oMathPara>
+        <m:oMath>
+          <m:r>
+            <w:rPr>
+              <w:rFonts w:ascii="Cambria Math" w:eastAsiaTheme="minorEastAsia" w:hAnsi="Cambria Math" w:cs="Times New Roman"/>
+              <w:color w:val="000000"/>
+              <w:szCs w:val="24"/>
+              <w:lang w:val="uk-UA" w:eastAsia="en-US"/>
+            </w:rPr>
+            <m:t>ρ</m:t>
+          </m:r>
+          <m:d>
+            <m:dPr>
+              <m:ctrlPr>
+                <w:rPr>
+                  <w:rFonts w:ascii="Cambria Math" w:eastAsiaTheme="minorEastAsia" w:hAnsi="Cambria Math" w:cs="Times New Roman"/>
+                  <w:i/>
+                  <w:color w:val="000000"/>
+                  <w:szCs w:val="24"/>
+                  <w:lang w:val="uk-UA" w:eastAsia="en-US"/>
+                </w:rPr>
+              </m:ctrlPr>
+            </m:dPr>
+            <m:e>
+              <m:sSub>
+                <m:sSubPr>
+                  <m:ctrlPr>
+                    <w:rPr>
+                      <w:rFonts w:ascii="Cambria Math" w:eastAsiaTheme="minorEastAsia" w:hAnsi="Cambria Math" w:cs="Times New Roman"/>
+                      <w:i/>
+                      <w:color w:val="000000"/>
+                      <w:szCs w:val="24"/>
+                      <w:lang w:val="uk-UA" w:eastAsia="en-US"/>
+                    </w:rPr>
+                  </m:ctrlPr>
+                </m:sSubPr>
+                <m:e>
+                  <m:r>
+                    <w:rPr>
+                      <w:rFonts w:ascii="Cambria Math" w:eastAsiaTheme="minorEastAsia" w:hAnsi="Cambria Math" w:cs="Times New Roman"/>
+                      <w:color w:val="000000"/>
+                      <w:szCs w:val="24"/>
+                      <w:lang w:val="uk-UA" w:eastAsia="en-US"/>
+                    </w:rPr>
+                    <m:t>e</m:t>
+                  </m:r>
+                </m:e>
+                <m:sub>
+                  <m:r>
+                    <w:rPr>
+                      <w:rFonts w:ascii="Cambria Math" w:eastAsiaTheme="minorEastAsia" w:hAnsi="Cambria Math" w:cs="Times New Roman"/>
+                      <w:color w:val="000000"/>
+                      <w:szCs w:val="24"/>
+                      <w:lang w:val="uk-UA" w:eastAsia="en-US"/>
+                    </w:rPr>
+                    <m:t>i</m:t>
+                  </m:r>
+                </m:sub>
+              </m:sSub>
+              <m:r>
+                <w:rPr>
+                  <w:rFonts w:ascii="Cambria Math" w:eastAsiaTheme="minorEastAsia" w:hAnsi="Cambria Math" w:cs="Times New Roman"/>
+                  <w:color w:val="000000"/>
+                  <w:szCs w:val="24"/>
+                  <w:lang w:val="uk-UA" w:eastAsia="en-US"/>
+                </w:rPr>
+                <m:t>,</m:t>
+              </m:r>
+              <m:sSub>
+                <m:sSubPr>
+                  <m:ctrlPr>
+                    <w:rPr>
+                      <w:rFonts w:ascii="Cambria Math" w:eastAsiaTheme="minorEastAsia" w:hAnsi="Cambria Math" w:cs="Times New Roman"/>
+                      <w:i/>
+                      <w:color w:val="000000"/>
+                      <w:szCs w:val="24"/>
+                      <w:lang w:val="uk-UA" w:eastAsia="en-US"/>
+                    </w:rPr>
+                  </m:ctrlPr>
+                </m:sSubPr>
+                <m:e>
+                  <m:r>
+                    <w:rPr>
+                      <w:rFonts w:ascii="Cambria Math" w:eastAsiaTheme="minorEastAsia" w:hAnsi="Cambria Math" w:cs="Times New Roman"/>
+                      <w:color w:val="000000"/>
+                      <w:szCs w:val="24"/>
+                      <w:lang w:val="uk-UA" w:eastAsia="en-US"/>
+                    </w:rPr>
+                    <m:t>e</m:t>
+                  </m:r>
+                </m:e>
+                <m:sub>
+                  <m:r>
+                    <w:rPr>
+                      <w:rFonts w:ascii="Cambria Math" w:eastAsiaTheme="minorEastAsia" w:hAnsi="Cambria Math" w:cs="Times New Roman"/>
+                      <w:color w:val="000000"/>
+                      <w:szCs w:val="24"/>
+                      <w:lang w:val="uk-UA" w:eastAsia="en-US"/>
+                    </w:rPr>
+                    <m:t>i+1</m:t>
+                  </m:r>
+                </m:sub>
+              </m:sSub>
+            </m:e>
+          </m:d>
+          <m:r>
+            <w:rPr>
+              <w:rFonts w:ascii="Cambria Math" w:eastAsiaTheme="minorEastAsia" w:hAnsi="Cambria Math" w:cs="Times New Roman"/>
+              <w:color w:val="000000"/>
+              <w:szCs w:val="24"/>
+              <w:lang w:val="uk-UA" w:eastAsia="en-US"/>
+            </w:rPr>
+            <m:t>≥</m:t>
+          </m:r>
+          <m:sSub>
+            <m:sSubPr>
+              <m:ctrlPr>
+                <w:rPr>
+                  <w:rFonts w:ascii="Cambria Math" w:eastAsiaTheme="minorEastAsia" w:hAnsi="Cambria Math" w:cs="Times New Roman"/>
+                  <w:i/>
+                  <w:color w:val="000000"/>
+                  <w:szCs w:val="24"/>
+                  <w:lang w:val="uk-UA" w:eastAsia="en-US"/>
+                </w:rPr>
+              </m:ctrlPr>
+            </m:sSubPr>
+            <m:e>
+              <m:r>
+                <w:rPr>
+                  <w:rFonts w:ascii="Cambria Math" w:eastAsiaTheme="minorEastAsia" w:hAnsi="Cambria Math" w:cs="Times New Roman"/>
+                  <w:color w:val="000000"/>
+                  <w:szCs w:val="24"/>
+                  <w:lang w:val="uk-UA" w:eastAsia="en-US"/>
+                </w:rPr>
+                <m:t>r</m:t>
+              </m:r>
+            </m:e>
+            <m:sub>
+              <m:r>
+                <w:rPr>
+                  <w:rFonts w:ascii="Cambria Math" w:eastAsiaTheme="minorEastAsia" w:hAnsi="Cambria Math" w:cs="Times New Roman"/>
+                  <w:color w:val="000000"/>
+                  <w:szCs w:val="24"/>
+                  <w:lang w:val="uk-UA" w:eastAsia="en-US"/>
+                </w:rPr>
+                <m:t>min</m:t>
+              </m:r>
+            </m:sub>
+          </m:sSub>
+          <m:r>
+            <w:rPr>
+              <w:rFonts w:ascii="Cambria Math" w:eastAsiaTheme="minorEastAsia" w:hAnsi="Cambria Math" w:cs="Times New Roman"/>
+              <w:color w:val="000000"/>
+              <w:szCs w:val="24"/>
+              <w:lang w:val="en-US" w:eastAsia="en-US"/>
+            </w:rPr>
+            <m:t xml:space="preserve"> ∀i</m:t>
+          </m:r>
+        </m:oMath>
+      </m:oMathPara>
+    </w:p>
+    <w:p>
+      <w:pPr>
+        <w:pStyle w:val="BodyTextIndent"/>
+        <w:ind w:firstLine="567"/>
+        <w:jc w:val="both"/>
+        <w:rPr>
+          <w:rFonts w:eastAsiaTheme="minorEastAsia" w:cs="Times New Roman"/>
+          <w:color w:val="000000"/>
+          <w:szCs w:val="24"/>
+          <w:lang w:val="en-US" w:eastAsia="en-US"/>
+        </w:rPr>
+      </w:pPr>
+      <w:bookmarkStart w:id="0" w:name="_GoBack"/>
+      <w:bookmarkEnd w:id="0"/>
     </w:p>
     <w:p>
       <w:pPr>

</xml_diff>

<commit_message>
added paragraph about solution approach
</commit_message>
<xml_diff>
--- a/knowledgebase/conference_papers/wip/Тези_Українець_ІТОНТ.docx
+++ b/knowledgebase/conference_papers/wip/Тези_Українець_ІТОНТ.docx
@@ -3618,16 +3618,7 @@
             <w:szCs w:val="24"/>
             <w:lang w:val="uk-UA" w:eastAsia="en-US"/>
           </w:rPr>
-          <m:t>=1</m:t>
-        </m:r>
-        <m:r>
-          <w:rPr>
-            <w:rFonts w:ascii="Cambria Math" w:hAnsi="Cambria Math" w:cs="Times New Roman"/>
-            <w:color w:val="000000"/>
-            <w:szCs w:val="24"/>
-            <w:lang w:val="uk-UA" w:eastAsia="en-US"/>
-          </w:rPr>
-          <m:t xml:space="preserve">, </m:t>
+          <m:t xml:space="preserve">=1, </m:t>
         </m:r>
         <m:sSub>
           <m:sSubPr>
@@ -4726,25 +4717,7 @@
               <w:szCs w:val="24"/>
               <w:lang w:val="uk-UA" w:eastAsia="en-US"/>
             </w:rPr>
-            <m:t xml:space="preserve">, </m:t>
-          </m:r>
-          <m:r>
-            <w:rPr>
-              <w:rFonts w:ascii="Cambria Math" w:hAnsi="Cambria Math" w:cs="Times New Roman"/>
-              <w:color w:val="000000"/>
-              <w:szCs w:val="24"/>
-              <w:lang w:val="uk-UA" w:eastAsia="en-US"/>
-            </w:rPr>
-            <m:t xml:space="preserve"> ∀</m:t>
-          </m:r>
-          <m:r>
-            <w:rPr>
-              <w:rFonts w:ascii="Cambria Math" w:hAnsi="Cambria Math" w:cs="Times New Roman"/>
-              <w:color w:val="000000"/>
-              <w:szCs w:val="24"/>
-              <w:lang w:val="uk-UA" w:eastAsia="en-US"/>
-            </w:rPr>
-            <m:t>i</m:t>
+            <m:t>,  ∀i</m:t>
           </m:r>
         </m:oMath>
       </m:oMathPara>
@@ -4801,16 +4774,7 @@
                 <w:szCs w:val="24"/>
                 <w:lang w:val="uk-UA" w:eastAsia="en-US"/>
               </w:rPr>
-              <m:t>u</m:t>
-            </m:r>
-            <m:r>
-              <w:rPr>
-                <w:rFonts w:ascii="Cambria Math" w:eastAsiaTheme="minorEastAsia" w:hAnsi="Cambria Math" w:cs="Times New Roman"/>
-                <w:color w:val="000000"/>
-                <w:szCs w:val="24"/>
-                <w:lang w:val="uk-UA" w:eastAsia="en-US"/>
-              </w:rPr>
-              <m:t xml:space="preserve"> </m:t>
+              <m:t xml:space="preserve">u </m:t>
             </m:r>
           </m:e>
         </m:acc>
@@ -5181,16 +5145,7 @@
               <w:szCs w:val="24"/>
               <w:lang w:val="uk-UA" w:eastAsia="en-US"/>
             </w:rPr>
-            <m:t>∉</m:t>
-          </m:r>
-          <m:r>
-            <w:rPr>
-              <w:rFonts w:ascii="Cambria Math" w:eastAsiaTheme="minorEastAsia" w:hAnsi="Cambria Math" w:cs="Times New Roman"/>
-              <w:color w:val="000000"/>
-              <w:szCs w:val="24"/>
-              <w:lang w:val="uk-UA" w:eastAsia="en-US"/>
-            </w:rPr>
-            <m:t>F,  ∀i</m:t>
+            <m:t>∉F,  ∀i</m:t>
           </m:r>
         </m:oMath>
       </m:oMathPara>
@@ -5689,16 +5644,7 @@
                   <w:szCs w:val="24"/>
                   <w:lang w:val="uk-UA" w:eastAsia="en-US"/>
                 </w:rPr>
-                <m:t>≥</m:t>
-              </m:r>
-              <m:r>
-                <w:rPr>
-                  <w:rFonts w:ascii="Cambria Math" w:eastAsiaTheme="minorEastAsia" w:hAnsi="Cambria Math" w:cs="Times New Roman"/>
-                  <w:color w:val="000000"/>
-                  <w:szCs w:val="24"/>
-                  <w:lang w:val="uk-UA" w:eastAsia="en-US"/>
-                </w:rPr>
-                <m:t>ε</m:t>
+                <m:t>≥ε</m:t>
               </m:r>
               <m:d>
                 <m:dPr>
@@ -7588,7 +7534,278 @@
           <w:szCs w:val="24"/>
           <w:lang w:val="uk-UA" w:eastAsia="en-US"/>
         </w:rPr>
-        <w:t>Для її вирішення пропонується застосувати підхід …</w:t>
+        <w:t xml:space="preserve">Рішенням даної задачі має бути множина маршрутів </w:t>
+      </w:r>
+      <w:r>
+        <w:rPr>
+          <w:rFonts w:eastAsiaTheme="minorEastAsia" w:cs="Times New Roman"/>
+          <w:color w:val="000000"/>
+          <w:szCs w:val="24"/>
+          <w:lang w:val="uk-UA" w:eastAsia="en-US"/>
+        </w:rPr>
+        <w:t xml:space="preserve">з найменшим часом виконання польоту. Так як від точності локалізації під час польоту залежить точність та оперативність виконання завдання, то </w:t>
+      </w:r>
+      <w:r>
+        <w:rPr>
+          <w:rFonts w:eastAsiaTheme="minorEastAsia" w:cs="Times New Roman"/>
+          <w:color w:val="000000"/>
+          <w:szCs w:val="24"/>
+          <w:lang w:val="uk-UA" w:eastAsia="en-US"/>
+        </w:rPr>
+        <w:t>допускається погіршення основного критерію</w:t>
+      </w:r>
+      <w:r>
+        <w:rPr>
+          <w:rFonts w:eastAsiaTheme="minorEastAsia" w:cs="Times New Roman"/>
+          <w:color w:val="000000"/>
+          <w:szCs w:val="24"/>
+          <w:lang w:val="uk-UA" w:eastAsia="en-US"/>
+        </w:rPr>
+        <w:t xml:space="preserve"> </w:t>
+      </w:r>
+      <m:oMath>
+        <m:sSub>
+          <m:sSubPr>
+            <m:ctrlPr>
+              <w:rPr>
+                <w:rFonts w:ascii="Cambria Math" w:hAnsi="Cambria Math" w:cs="Times New Roman"/>
+                <w:i/>
+                <w:color w:val="000000"/>
+                <w:szCs w:val="24"/>
+                <w:lang w:val="uk-UA" w:eastAsia="en-US"/>
+              </w:rPr>
+            </m:ctrlPr>
+          </m:sSubPr>
+          <m:e>
+            <m:r>
+              <w:rPr>
+                <w:rFonts w:ascii="Cambria Math" w:hAnsi="Cambria Math" w:cs="Times New Roman"/>
+                <w:color w:val="000000"/>
+                <w:szCs w:val="24"/>
+                <w:lang w:val="uk-UA" w:eastAsia="en-US"/>
+              </w:rPr>
+              <m:t>f</m:t>
+            </m:r>
+          </m:e>
+          <m:sub>
+            <m:r>
+              <w:rPr>
+                <w:rFonts w:ascii="Cambria Math" w:hAnsi="Cambria Math" w:cs="Times New Roman"/>
+                <w:color w:val="000000"/>
+                <w:szCs w:val="24"/>
+                <w:lang w:val="uk-UA" w:eastAsia="en-US"/>
+              </w:rPr>
+              <m:t>1</m:t>
+            </m:r>
+          </m:sub>
+        </m:sSub>
+        <m:d>
+          <m:dPr>
+            <m:ctrlPr>
+              <w:rPr>
+                <w:rFonts w:ascii="Cambria Math" w:hAnsi="Cambria Math" w:cs="Times New Roman"/>
+                <w:i/>
+                <w:color w:val="000000"/>
+                <w:szCs w:val="24"/>
+                <w:lang w:val="uk-UA" w:eastAsia="en-US"/>
+              </w:rPr>
+            </m:ctrlPr>
+          </m:dPr>
+          <m:e>
+            <m:r>
+              <w:rPr>
+                <w:rFonts w:ascii="Cambria Math" w:hAnsi="Cambria Math" w:cs="Times New Roman"/>
+                <w:color w:val="000000"/>
+                <w:szCs w:val="24"/>
+                <w:lang w:val="uk-UA" w:eastAsia="en-US"/>
+              </w:rPr>
+              <m:t>P</m:t>
+            </m:r>
+          </m:e>
+        </m:d>
+      </m:oMath>
+      <w:r>
+        <w:rPr>
+          <w:rFonts w:eastAsiaTheme="minorEastAsia" w:cs="Times New Roman"/>
+          <w:color w:val="000000"/>
+          <w:szCs w:val="24"/>
+          <w:lang w:val="uk-UA" w:eastAsia="en-US"/>
+        </w:rPr>
+        <w:t xml:space="preserve"> для виграшу в двох інших критеріях </w:t>
+      </w:r>
+      <m:oMath>
+        <m:sSub>
+          <m:sSubPr>
+            <m:ctrlPr>
+              <w:rPr>
+                <w:rFonts w:ascii="Cambria Math" w:hAnsi="Cambria Math" w:cs="Times New Roman"/>
+                <w:i/>
+                <w:color w:val="000000"/>
+                <w:szCs w:val="24"/>
+                <w:lang w:val="uk-UA" w:eastAsia="en-US"/>
+              </w:rPr>
+            </m:ctrlPr>
+          </m:sSubPr>
+          <m:e>
+            <m:r>
+              <w:rPr>
+                <w:rFonts w:ascii="Cambria Math" w:hAnsi="Cambria Math" w:cs="Times New Roman"/>
+                <w:color w:val="000000"/>
+                <w:szCs w:val="24"/>
+                <w:lang w:val="uk-UA" w:eastAsia="en-US"/>
+              </w:rPr>
+              <m:t>f</m:t>
+            </m:r>
+          </m:e>
+          <m:sub>
+            <m:r>
+              <w:rPr>
+                <w:rFonts w:ascii="Cambria Math" w:hAnsi="Cambria Math" w:cs="Times New Roman"/>
+                <w:color w:val="000000"/>
+                <w:szCs w:val="24"/>
+                <w:lang w:val="uk-UA" w:eastAsia="en-US"/>
+              </w:rPr>
+              <m:t>2</m:t>
+            </m:r>
+          </m:sub>
+        </m:sSub>
+        <m:d>
+          <m:dPr>
+            <m:ctrlPr>
+              <w:rPr>
+                <w:rFonts w:ascii="Cambria Math" w:hAnsi="Cambria Math" w:cs="Times New Roman"/>
+                <w:i/>
+                <w:color w:val="000000"/>
+                <w:szCs w:val="24"/>
+                <w:lang w:val="uk-UA" w:eastAsia="en-US"/>
+              </w:rPr>
+            </m:ctrlPr>
+          </m:dPr>
+          <m:e>
+            <m:r>
+              <w:rPr>
+                <w:rFonts w:ascii="Cambria Math" w:hAnsi="Cambria Math" w:cs="Times New Roman"/>
+                <w:color w:val="000000"/>
+                <w:szCs w:val="24"/>
+                <w:lang w:val="uk-UA" w:eastAsia="en-US"/>
+              </w:rPr>
+              <m:t>P</m:t>
+            </m:r>
+          </m:e>
+        </m:d>
+        <m:r>
+          <w:rPr>
+            <w:rFonts w:ascii="Cambria Math" w:hAnsi="Cambria Math" w:cs="Times New Roman"/>
+            <w:color w:val="000000"/>
+            <w:szCs w:val="24"/>
+            <w:lang w:val="uk-UA" w:eastAsia="en-US"/>
+          </w:rPr>
+          <m:t xml:space="preserve">, </m:t>
+        </m:r>
+        <m:sSub>
+          <m:sSubPr>
+            <m:ctrlPr>
+              <w:rPr>
+                <w:rFonts w:ascii="Cambria Math" w:hAnsi="Cambria Math" w:cs="Times New Roman"/>
+                <w:i/>
+                <w:color w:val="000000"/>
+                <w:szCs w:val="24"/>
+                <w:lang w:val="uk-UA" w:eastAsia="en-US"/>
+              </w:rPr>
+            </m:ctrlPr>
+          </m:sSubPr>
+          <m:e>
+            <m:r>
+              <w:rPr>
+                <w:rFonts w:ascii="Cambria Math" w:hAnsi="Cambria Math" w:cs="Times New Roman"/>
+                <w:color w:val="000000"/>
+                <w:szCs w:val="24"/>
+                <w:lang w:val="uk-UA" w:eastAsia="en-US"/>
+              </w:rPr>
+              <m:t>f</m:t>
+            </m:r>
+          </m:e>
+          <m:sub>
+            <m:r>
+              <w:rPr>
+                <w:rFonts w:ascii="Cambria Math" w:hAnsi="Cambria Math" w:cs="Times New Roman"/>
+                <w:color w:val="000000"/>
+                <w:szCs w:val="24"/>
+                <w:lang w:val="uk-UA" w:eastAsia="en-US"/>
+              </w:rPr>
+              <m:t>3</m:t>
+            </m:r>
+          </m:sub>
+        </m:sSub>
+        <m:d>
+          <m:dPr>
+            <m:ctrlPr>
+              <w:rPr>
+                <w:rFonts w:ascii="Cambria Math" w:hAnsi="Cambria Math" w:cs="Times New Roman"/>
+                <w:i/>
+                <w:color w:val="000000"/>
+                <w:szCs w:val="24"/>
+                <w:lang w:val="uk-UA" w:eastAsia="en-US"/>
+              </w:rPr>
+            </m:ctrlPr>
+          </m:dPr>
+          <m:e>
+            <m:r>
+              <w:rPr>
+                <w:rFonts w:ascii="Cambria Math" w:hAnsi="Cambria Math" w:cs="Times New Roman"/>
+                <w:color w:val="000000"/>
+                <w:szCs w:val="24"/>
+                <w:lang w:val="uk-UA" w:eastAsia="en-US"/>
+              </w:rPr>
+              <m:t>P</m:t>
+            </m:r>
+          </m:e>
+        </m:d>
+      </m:oMath>
+      <w:r>
+        <w:rPr>
+          <w:rFonts w:eastAsiaTheme="minorEastAsia" w:cs="Times New Roman"/>
+          <w:color w:val="000000"/>
+          <w:szCs w:val="24"/>
+          <w:lang w:val="uk-UA" w:eastAsia="en-US"/>
+        </w:rPr>
+        <w:t xml:space="preserve">. Таким </w:t>
+      </w:r>
+      <w:r>
+        <w:rPr>
+          <w:rFonts w:eastAsiaTheme="minorEastAsia" w:cs="Times New Roman"/>
+          <w:color w:val="000000"/>
+          <w:szCs w:val="24"/>
+          <w:lang w:val="uk-UA" w:eastAsia="en-US"/>
+        </w:rPr>
+        <w:t xml:space="preserve">чином, </w:t>
+      </w:r>
+      <w:r>
+        <w:rPr>
+          <w:rFonts w:eastAsiaTheme="minorEastAsia" w:cs="Times New Roman"/>
+          <w:color w:val="000000"/>
+          <w:szCs w:val="24"/>
+          <w:lang w:val="uk-UA" w:eastAsia="en-US"/>
+        </w:rPr>
+        <w:t xml:space="preserve">підхід до вирішення </w:t>
+      </w:r>
+      <w:r>
+        <w:rPr>
+          <w:rFonts w:eastAsiaTheme="minorEastAsia" w:cs="Times New Roman"/>
+          <w:color w:val="000000"/>
+          <w:szCs w:val="24"/>
+          <w:lang w:val="uk-UA" w:eastAsia="en-US"/>
+        </w:rPr>
+        <w:t xml:space="preserve">повинен забезпечувати множину Парето-оптимальних </w:t>
+      </w:r>
+      <w:r>
+        <w:rPr>
+          <w:rFonts w:eastAsiaTheme="minorEastAsia" w:cs="Times New Roman"/>
+          <w:color w:val="000000"/>
+          <w:szCs w:val="24"/>
+          <w:lang w:val="uk-UA" w:eastAsia="en-US"/>
+        </w:rPr>
+        <w:t xml:space="preserve">рішень з яких буде обиратися найбільш підходящий в контексті виконання завдання. </w:t>
       </w:r>
       <w:bookmarkStart w:id="0" w:name="_GoBack"/>
       <w:bookmarkEnd w:id="0"/>

</xml_diff>

<commit_message>
added some text about solution direction
</commit_message>
<xml_diff>
--- a/knowledgebase/conference_papers/wip/Тези_Українець_ІТОНТ.docx
+++ b/knowledgebase/conference_papers/wip/Тези_Українець_ІТОНТ.docx
@@ -7807,8 +7807,142 @@
         </w:rPr>
         <w:t xml:space="preserve">рішень з яких буде обиратися найбільш підходящий в контексті виконання завдання. </w:t>
       </w:r>
+    </w:p>
+    <w:p>
+      <w:pPr>
+        <w:pStyle w:val="BodyTextIndent"/>
+        <w:ind w:firstLine="567"/>
+        <w:jc w:val="both"/>
+        <w:rPr>
+          <w:rFonts w:eastAsiaTheme="minorEastAsia" w:cs="Times New Roman"/>
+          <w:color w:val="000000"/>
+          <w:szCs w:val="24"/>
+          <w:lang w:val="uk-UA" w:eastAsia="en-US"/>
+        </w:rPr>
+      </w:pPr>
+      <w:r>
+        <w:rPr>
+          <w:rFonts w:eastAsiaTheme="minorEastAsia" w:cs="Times New Roman"/>
+          <w:color w:val="000000"/>
+          <w:szCs w:val="24"/>
+          <w:lang w:val="uk-UA" w:eastAsia="en-US"/>
+        </w:rPr>
+        <w:t xml:space="preserve">Першим кроком для вирішення поставленої задачі має бути формування </w:t>
+      </w:r>
+      <w:r>
+        <w:rPr>
+          <w:rFonts w:eastAsiaTheme="minorEastAsia" w:cs="Times New Roman"/>
+          <w:color w:val="000000"/>
+          <w:szCs w:val="24"/>
+          <w:lang w:val="uk-UA" w:eastAsia="en-US"/>
+        </w:rPr>
+        <w:t xml:space="preserve">мапи вартості для </w:t>
+      </w:r>
+      <w:r>
+        <w:rPr>
+          <w:rFonts w:eastAsiaTheme="minorEastAsia" w:cs="Times New Roman"/>
+          <w:color w:val="000000"/>
+          <w:szCs w:val="24"/>
+          <w:lang w:val="uk-UA" w:eastAsia="en-US"/>
+        </w:rPr>
+        <w:t>конкретної місцевості на основі визначеного набору даних</w:t>
+      </w:r>
       <w:bookmarkStart w:id="0" w:name="_GoBack"/>
       <w:bookmarkEnd w:id="0"/>
+      <w:r>
+        <w:rPr>
+          <w:rFonts w:eastAsiaTheme="minorEastAsia" w:cs="Times New Roman"/>
+          <w:color w:val="000000"/>
+          <w:szCs w:val="24"/>
+          <w:lang w:val="uk-UA" w:eastAsia="en-US"/>
+        </w:rPr>
+        <w:t>.</w:t>
+      </w:r>
+      <w:r>
+        <w:rPr>
+          <w:rFonts w:eastAsiaTheme="minorEastAsia" w:cs="Times New Roman"/>
+          <w:color w:val="000000"/>
+          <w:szCs w:val="24"/>
+          <w:lang w:val="uk-UA" w:eastAsia="en-US"/>
+        </w:rPr>
+        <w:t xml:space="preserve"> </w:t>
+      </w:r>
+      <w:r>
+        <w:rPr>
+          <w:rFonts w:eastAsiaTheme="minorEastAsia" w:cs="Times New Roman"/>
+          <w:color w:val="000000"/>
+          <w:szCs w:val="24"/>
+          <w:lang w:val="uk-UA" w:eastAsia="en-US"/>
+        </w:rPr>
+        <w:t>Мапа вартості являє</w:t>
+      </w:r>
+      <w:r>
+        <w:rPr>
+          <w:rFonts w:eastAsiaTheme="minorEastAsia" w:cs="Times New Roman"/>
+          <w:color w:val="000000"/>
+          <w:szCs w:val="24"/>
+          <w:lang w:val="uk-UA" w:eastAsia="en-US"/>
+        </w:rPr>
+        <w:t xml:space="preserve"> багатошарову структуру розділено поділену сіткою, яка формує окремі комірки</w:t>
+      </w:r>
+      <w:r>
+        <w:rPr>
+          <w:rFonts w:eastAsiaTheme="minorEastAsia" w:cs="Times New Roman"/>
+          <w:color w:val="000000"/>
+          <w:szCs w:val="24"/>
+          <w:lang w:val="uk-UA" w:eastAsia="en-US"/>
+        </w:rPr>
+        <w:t>. Кожна комірка містить дані про місцевість, яку вона обмежує</w:t>
+      </w:r>
+      <w:r>
+        <w:rPr>
+          <w:rFonts w:eastAsiaTheme="minorEastAsia" w:cs="Times New Roman"/>
+          <w:color w:val="000000"/>
+          <w:szCs w:val="24"/>
+          <w:lang w:val="uk-UA" w:eastAsia="en-US"/>
+        </w:rPr>
+        <w:t>.</w:t>
+      </w:r>
+    </w:p>
+    <w:p>
+      <w:pPr>
+        <w:pStyle w:val="BodyTextIndent"/>
+        <w:ind w:firstLine="567"/>
+        <w:jc w:val="both"/>
+        <w:rPr>
+          <w:rFonts w:eastAsiaTheme="minorEastAsia" w:cs="Times New Roman"/>
+          <w:color w:val="000000"/>
+          <w:szCs w:val="24"/>
+          <w:lang w:val="uk-UA" w:eastAsia="en-US"/>
+        </w:rPr>
+      </w:pPr>
+      <w:r>
+        <w:rPr>
+          <w:rFonts w:eastAsiaTheme="minorEastAsia" w:cs="Times New Roman"/>
+          <w:color w:val="000000"/>
+          <w:szCs w:val="24"/>
+          <w:lang w:val="uk-UA" w:eastAsia="en-US"/>
+        </w:rPr>
+        <w:t>Наступним кроком для вирішення є пошук множини Парето-оптимальних рішень</w:t>
+      </w:r>
+      <w:r>
+        <w:rPr>
+          <w:rFonts w:eastAsiaTheme="minorEastAsia" w:cs="Times New Roman"/>
+          <w:color w:val="000000"/>
+          <w:szCs w:val="24"/>
+          <w:lang w:val="uk-UA" w:eastAsia="en-US"/>
+        </w:rPr>
+        <w:t xml:space="preserve"> на основі сформованої мапи вартості</w:t>
+      </w:r>
+      <w:r>
+        <w:rPr>
+          <w:rFonts w:eastAsiaTheme="minorEastAsia" w:cs="Times New Roman"/>
+          <w:color w:val="000000"/>
+          <w:szCs w:val="24"/>
+          <w:lang w:val="uk-UA" w:eastAsia="en-US"/>
+        </w:rPr>
+        <w:t xml:space="preserve"> </w:t>
+      </w:r>
     </w:p>
     <w:p>
       <w:pPr>

</xml_diff>

<commit_message>
added more specifics to solution direction
</commit_message>
<xml_diff>
--- a/knowledgebase/conference_papers/wip/Тези_Українець_ІТОНТ.docx
+++ b/knowledgebase/conference_papers/wip/Тези_Українець_ІТОНТ.docx
@@ -382,6 +382,7 @@
           <w:lang w:val="en-GB"/>
         </w:rPr>
       </w:pPr>
+      <w:proofErr w:type="spellStart"/>
       <w:r>
         <w:rPr>
           <w:rFonts w:ascii="Times New Roman CYR" w:hAnsi="Times New Roman CYR" w:cs="Times New Roman CYR"/>
@@ -392,7 +393,46 @@
           <w:szCs w:val="24"/>
           <w:lang w:val="en-GB"/>
         </w:rPr>
-        <w:t>Kovbasiuk S., Ukrainets M.</w:t>
+        <w:t>Kovbasiuk</w:t>
+      </w:r>
+      <w:proofErr w:type="spellEnd"/>
+      <w:r>
+        <w:rPr>
+          <w:rFonts w:ascii="Times New Roman CYR" w:hAnsi="Times New Roman CYR" w:cs="Times New Roman CYR"/>
+          <w:b/>
+          <w:bCs/>
+          <w:color w:val="000000"/>
+          <w:sz w:val="24"/>
+          <w:szCs w:val="24"/>
+          <w:lang w:val="en-GB"/>
+        </w:rPr>
+        <w:t xml:space="preserve"> S., </w:t>
+      </w:r>
+      <w:proofErr w:type="spellStart"/>
+      <w:r>
+        <w:rPr>
+          <w:rFonts w:ascii="Times New Roman CYR" w:hAnsi="Times New Roman CYR" w:cs="Times New Roman CYR"/>
+          <w:b/>
+          <w:bCs/>
+          <w:color w:val="000000"/>
+          <w:sz w:val="24"/>
+          <w:szCs w:val="24"/>
+          <w:lang w:val="en-GB"/>
+        </w:rPr>
+        <w:t>Ukrainets</w:t>
+      </w:r>
+      <w:proofErr w:type="spellEnd"/>
+      <w:r>
+        <w:rPr>
+          <w:rFonts w:ascii="Times New Roman CYR" w:hAnsi="Times New Roman CYR" w:cs="Times New Roman CYR"/>
+          <w:b/>
+          <w:bCs/>
+          <w:color w:val="000000"/>
+          <w:sz w:val="24"/>
+          <w:szCs w:val="24"/>
+          <w:lang w:val="en-GB"/>
+        </w:rPr>
+        <w:t xml:space="preserve"> M.</w:t>
       </w:r>
     </w:p>
     <w:p>
@@ -568,7 +608,25 @@
           <w:szCs w:val="24"/>
           <w:lang w:val="uk-UA" w:eastAsia="en-US"/>
         </w:rPr>
-        <w:t xml:space="preserve"> (БПС) у складі безпілотних авіаційних комплексів (БпАК)</w:t>
+        <w:t xml:space="preserve"> (БПС) у складі безпілотних авіаційних комплексів (</w:t>
+      </w:r>
+      <w:proofErr w:type="spellStart"/>
+      <w:r>
+        <w:rPr>
+          <w:rFonts w:ascii="Times New Roman CYR" w:hAnsi="Times New Roman CYR" w:cs="Times New Roman CYR"/>
+          <w:szCs w:val="24"/>
+          <w:lang w:val="uk-UA" w:eastAsia="en-US"/>
+        </w:rPr>
+        <w:t>БпАК</w:t>
+      </w:r>
+      <w:proofErr w:type="spellEnd"/>
+      <w:r>
+        <w:rPr>
+          <w:rFonts w:ascii="Times New Roman CYR" w:hAnsi="Times New Roman CYR" w:cs="Times New Roman CYR"/>
+          <w:szCs w:val="24"/>
+          <w:lang w:val="uk-UA" w:eastAsia="en-US"/>
+        </w:rPr>
+        <w:t>)</w:t>
       </w:r>
       <w:r>
         <w:rPr>
@@ -782,7 +840,25 @@
           <w:szCs w:val="24"/>
           <w:lang w:val="uk-UA" w:eastAsia="en-US"/>
         </w:rPr>
-        <w:t xml:space="preserve"> вирішує два підзавдання: </w:t>
+        <w:t xml:space="preserve"> вирішує два </w:t>
+      </w:r>
+      <w:proofErr w:type="spellStart"/>
+      <w:r>
+        <w:rPr>
+          <w:rFonts w:ascii="Times New Roman CYR" w:hAnsi="Times New Roman CYR" w:cs="Times New Roman CYR"/>
+          <w:szCs w:val="24"/>
+          <w:lang w:val="uk-UA" w:eastAsia="en-US"/>
+        </w:rPr>
+        <w:t>підзавдання</w:t>
+      </w:r>
+      <w:proofErr w:type="spellEnd"/>
+      <w:r>
+        <w:rPr>
+          <w:rFonts w:ascii="Times New Roman CYR" w:hAnsi="Times New Roman CYR" w:cs="Times New Roman CYR"/>
+          <w:szCs w:val="24"/>
+          <w:lang w:val="uk-UA" w:eastAsia="en-US"/>
+        </w:rPr>
+        <w:t xml:space="preserve">: </w:t>
       </w:r>
       <w:r>
         <w:rPr>
@@ -822,7 +898,25 @@
           <w:szCs w:val="24"/>
           <w:lang w:val="uk-UA" w:eastAsia="en-US"/>
         </w:rPr>
-        <w:t>Одним з найбільш поширених підходів до планування маршруту руху БПС в складі БпАК є ручна побудова маршруту</w:t>
+        <w:t xml:space="preserve">Одним з найбільш поширених підходів до планування маршруту руху БПС в складі </w:t>
+      </w:r>
+      <w:proofErr w:type="spellStart"/>
+      <w:r>
+        <w:rPr>
+          <w:rFonts w:ascii="Times New Roman CYR" w:hAnsi="Times New Roman CYR" w:cs="Times New Roman CYR"/>
+          <w:szCs w:val="24"/>
+          <w:lang w:val="uk-UA" w:eastAsia="en-US"/>
+        </w:rPr>
+        <w:t>БпАК</w:t>
+      </w:r>
+      <w:proofErr w:type="spellEnd"/>
+      <w:r>
+        <w:rPr>
+          <w:rFonts w:ascii="Times New Roman CYR" w:hAnsi="Times New Roman CYR" w:cs="Times New Roman CYR"/>
+          <w:szCs w:val="24"/>
+          <w:lang w:val="uk-UA" w:eastAsia="en-US"/>
+        </w:rPr>
+        <w:t xml:space="preserve"> є ручна побудова маршруту</w:t>
       </w:r>
       <w:r>
         <w:rPr>
@@ -1064,7 +1158,25 @@
           <w:szCs w:val="24"/>
           <w:lang w:val="uk-UA" w:eastAsia="en-US"/>
         </w:rPr>
-        <w:t>пошуку оптимального маршруту БПС в складі БпАК на основі різнорідних даних</w:t>
+        <w:t xml:space="preserve">пошуку оптимального маршруту БПС в складі </w:t>
+      </w:r>
+      <w:proofErr w:type="spellStart"/>
+      <w:r>
+        <w:rPr>
+          <w:rFonts w:ascii="Times New Roman CYR" w:hAnsi="Times New Roman CYR" w:cs="Times New Roman CYR"/>
+          <w:szCs w:val="24"/>
+          <w:lang w:val="uk-UA" w:eastAsia="en-US"/>
+        </w:rPr>
+        <w:t>БпАК</w:t>
+      </w:r>
+      <w:proofErr w:type="spellEnd"/>
+      <w:r>
+        <w:rPr>
+          <w:rFonts w:ascii="Times New Roman CYR" w:hAnsi="Times New Roman CYR" w:cs="Times New Roman CYR"/>
+          <w:szCs w:val="24"/>
+          <w:lang w:val="uk-UA" w:eastAsia="en-US"/>
+        </w:rPr>
+        <w:t xml:space="preserve"> на основі різнорідних даних</w:t>
       </w:r>
       <w:r>
         <w:rPr>
@@ -1126,7 +1238,25 @@
           <w:szCs w:val="24"/>
           <w:lang w:val="uk-UA" w:eastAsia="en-US"/>
         </w:rPr>
-        <w:t xml:space="preserve"> Виконання завдання покладеного на БПС в складі БпАК </w:t>
+        <w:t xml:space="preserve"> Виконання завдання покладеного на БПС в складі </w:t>
+      </w:r>
+      <w:proofErr w:type="spellStart"/>
+      <w:r>
+        <w:rPr>
+          <w:rFonts w:ascii="Times New Roman CYR" w:hAnsi="Times New Roman CYR" w:cs="Times New Roman CYR"/>
+          <w:szCs w:val="24"/>
+          <w:lang w:val="uk-UA" w:eastAsia="en-US"/>
+        </w:rPr>
+        <w:t>БпАК</w:t>
+      </w:r>
+      <w:proofErr w:type="spellEnd"/>
+      <w:r>
+        <w:rPr>
+          <w:rFonts w:ascii="Times New Roman CYR" w:hAnsi="Times New Roman CYR" w:cs="Times New Roman CYR"/>
+          <w:szCs w:val="24"/>
+          <w:lang w:val="uk-UA" w:eastAsia="en-US"/>
+        </w:rPr>
+        <w:t xml:space="preserve"> </w:t>
       </w:r>
       <w:r>
         <w:rPr>
@@ -1198,7 +1328,25 @@
           <w:szCs w:val="24"/>
           <w:lang w:val="uk-UA" w:eastAsia="en-US"/>
         </w:rPr>
-        <w:t xml:space="preserve">застосовується гібридний підхід, який поєднує візуальну навігацію на основі геоприв’язаних супутникових знімків та </w:t>
+        <w:t xml:space="preserve">застосовується гібридний підхід, який поєднує візуальну навігацію на основі </w:t>
+      </w:r>
+      <w:proofErr w:type="spellStart"/>
+      <w:r>
+        <w:rPr>
+          <w:rFonts w:ascii="Times New Roman CYR" w:hAnsi="Times New Roman CYR" w:cs="Times New Roman CYR"/>
+          <w:szCs w:val="24"/>
+          <w:lang w:val="uk-UA" w:eastAsia="en-US"/>
+        </w:rPr>
+        <w:t>геоприв’язаних</w:t>
+      </w:r>
+      <w:proofErr w:type="spellEnd"/>
+      <w:r>
+        <w:rPr>
+          <w:rFonts w:ascii="Times New Roman CYR" w:hAnsi="Times New Roman CYR" w:cs="Times New Roman CYR"/>
+          <w:szCs w:val="24"/>
+          <w:lang w:val="uk-UA" w:eastAsia="en-US"/>
+        </w:rPr>
+        <w:t xml:space="preserve"> супутникових знімків та </w:t>
       </w:r>
       <w:r>
         <w:rPr>
@@ -1453,7 +1601,25 @@
           <w:szCs w:val="24"/>
           <w:lang w:val="uk-UA" w:eastAsia="en-US"/>
         </w:rPr>
-        <w:t xml:space="preserve">: геоприв’язаний супутниковий знімок, карта висот, карта вітру, </w:t>
+        <w:t xml:space="preserve">: </w:t>
+      </w:r>
+      <w:proofErr w:type="spellStart"/>
+      <w:r>
+        <w:rPr>
+          <w:rFonts w:ascii="Times New Roman CYR" w:hAnsi="Times New Roman CYR" w:cs="Times New Roman CYR"/>
+          <w:szCs w:val="24"/>
+          <w:lang w:val="uk-UA" w:eastAsia="en-US"/>
+        </w:rPr>
+        <w:t>геоприв’язаний</w:t>
+      </w:r>
+      <w:proofErr w:type="spellEnd"/>
+      <w:r>
+        <w:rPr>
+          <w:rFonts w:ascii="Times New Roman CYR" w:hAnsi="Times New Roman CYR" w:cs="Times New Roman CYR"/>
+          <w:szCs w:val="24"/>
+          <w:lang w:val="uk-UA" w:eastAsia="en-US"/>
+        </w:rPr>
+        <w:t xml:space="preserve"> супутниковий знімок, карта висот, карта вітру, </w:t>
       </w:r>
       <w:r>
         <w:rPr>
@@ -1937,7 +2103,25 @@
           <w:szCs w:val="24"/>
           <w:lang w:val="uk-UA" w:eastAsia="en-US"/>
         </w:rPr>
-        <w:t>Множина ребер маршруту:</w:t>
+        <w:t xml:space="preserve">Множина </w:t>
+      </w:r>
+      <w:proofErr w:type="spellStart"/>
+      <w:r>
+        <w:rPr>
+          <w:rFonts w:eastAsiaTheme="minorEastAsia" w:cs="Times New Roman"/>
+          <w:szCs w:val="24"/>
+          <w:lang w:val="uk-UA" w:eastAsia="en-US"/>
+        </w:rPr>
+        <w:t>ребер</w:t>
+      </w:r>
+      <w:proofErr w:type="spellEnd"/>
+      <w:r>
+        <w:rPr>
+          <w:rFonts w:eastAsiaTheme="minorEastAsia" w:cs="Times New Roman"/>
+          <w:szCs w:val="24"/>
+          <w:lang w:val="uk-UA" w:eastAsia="en-US"/>
+        </w:rPr>
+        <w:t xml:space="preserve"> маршруту:</w:t>
       </w:r>
     </w:p>
     <w:p>
@@ -2131,7 +2315,27 @@
           <w:szCs w:val="24"/>
           <w:lang w:val="uk-UA" w:eastAsia="en-US"/>
         </w:rPr>
-        <w:t>у важливість тривалості польоту, запишемо функцію для часу польоту:</w:t>
+        <w:t xml:space="preserve">у важливість тривалості польоту, </w:t>
+      </w:r>
+      <w:proofErr w:type="spellStart"/>
+      <w:r>
+        <w:rPr>
+          <w:rFonts w:eastAsiaTheme="minorEastAsia" w:cs="Times New Roman"/>
+          <w:color w:val="000000"/>
+          <w:szCs w:val="24"/>
+          <w:lang w:val="uk-UA" w:eastAsia="en-US"/>
+        </w:rPr>
+        <w:t>запишемо</w:t>
+      </w:r>
+      <w:proofErr w:type="spellEnd"/>
+      <w:r>
+        <w:rPr>
+          <w:rFonts w:eastAsiaTheme="minorEastAsia" w:cs="Times New Roman"/>
+          <w:color w:val="000000"/>
+          <w:szCs w:val="24"/>
+          <w:lang w:val="uk-UA" w:eastAsia="en-US"/>
+        </w:rPr>
+        <w:t xml:space="preserve"> функцію для часу польоту:</w:t>
       </w:r>
     </w:p>
     <w:p>
@@ -3989,14 +4193,25 @@
         </w:rPr>
         <w:t xml:space="preserve">, </w:t>
       </w:r>
-      <w:r>
-        <w:rPr>
-          <w:rFonts w:eastAsiaTheme="minorEastAsia" w:cs="Times New Roman"/>
-          <w:color w:val="000000"/>
-          <w:szCs w:val="24"/>
-          <w:lang w:val="uk-UA" w:eastAsia="en-US"/>
-        </w:rPr>
-        <w:t>запишемо функцію для видимості</w:t>
+      <w:proofErr w:type="spellStart"/>
+      <w:r>
+        <w:rPr>
+          <w:rFonts w:eastAsiaTheme="minorEastAsia" w:cs="Times New Roman"/>
+          <w:color w:val="000000"/>
+          <w:szCs w:val="24"/>
+          <w:lang w:val="uk-UA" w:eastAsia="en-US"/>
+        </w:rPr>
+        <w:t>запишемо</w:t>
+      </w:r>
+      <w:proofErr w:type="spellEnd"/>
+      <w:r>
+        <w:rPr>
+          <w:rFonts w:eastAsiaTheme="minorEastAsia" w:cs="Times New Roman"/>
+          <w:color w:val="000000"/>
+          <w:szCs w:val="24"/>
+          <w:lang w:val="uk-UA" w:eastAsia="en-US"/>
+        </w:rPr>
+        <w:t xml:space="preserve"> функцію для видимості</w:t>
       </w:r>
       <w:r>
         <w:rPr>
@@ -7796,7 +8011,27 @@
           <w:szCs w:val="24"/>
           <w:lang w:val="uk-UA" w:eastAsia="en-US"/>
         </w:rPr>
-        <w:t xml:space="preserve">повинен забезпечувати множину Парето-оптимальних </w:t>
+        <w:t xml:space="preserve">повинен забезпечувати множину </w:t>
+      </w:r>
+      <w:proofErr w:type="spellStart"/>
+      <w:r>
+        <w:rPr>
+          <w:rFonts w:eastAsiaTheme="minorEastAsia" w:cs="Times New Roman"/>
+          <w:color w:val="000000"/>
+          <w:szCs w:val="24"/>
+          <w:lang w:val="uk-UA" w:eastAsia="en-US"/>
+        </w:rPr>
+        <w:t>Парето</w:t>
+      </w:r>
+      <w:proofErr w:type="spellEnd"/>
+      <w:r>
+        <w:rPr>
+          <w:rFonts w:eastAsiaTheme="minorEastAsia" w:cs="Times New Roman"/>
+          <w:color w:val="000000"/>
+          <w:szCs w:val="24"/>
+          <w:lang w:val="uk-UA" w:eastAsia="en-US"/>
+        </w:rPr>
+        <w:t xml:space="preserve">-оптимальних </w:t>
       </w:r>
       <w:r>
         <w:rPr>
@@ -7845,18 +8080,7 @@
           <w:szCs w:val="24"/>
           <w:lang w:val="uk-UA" w:eastAsia="en-US"/>
         </w:rPr>
-        <w:t>конкретної місцевості на основі визначеного набору даних</w:t>
-      </w:r>
-      <w:bookmarkStart w:id="0" w:name="_GoBack"/>
-      <w:bookmarkEnd w:id="0"/>
-      <w:r>
-        <w:rPr>
-          <w:rFonts w:eastAsiaTheme="minorEastAsia" w:cs="Times New Roman"/>
-          <w:color w:val="000000"/>
-          <w:szCs w:val="24"/>
-          <w:lang w:val="uk-UA" w:eastAsia="en-US"/>
-        </w:rPr>
-        <w:t>.</w:t>
+        <w:t>конкретної місцевості на основі визначеного набору даних.</w:t>
       </w:r>
       <w:r>
         <w:rPr>
@@ -7883,16 +8107,61 @@
           <w:szCs w:val="24"/>
           <w:lang w:val="uk-UA" w:eastAsia="en-US"/>
         </w:rPr>
-        <w:t xml:space="preserve"> багатошарову структуру розділено поділену сіткою, яка формує окремі комірки</w:t>
-      </w:r>
-      <w:r>
-        <w:rPr>
-          <w:rFonts w:eastAsiaTheme="minorEastAsia" w:cs="Times New Roman"/>
-          <w:color w:val="000000"/>
-          <w:szCs w:val="24"/>
-          <w:lang w:val="uk-UA" w:eastAsia="en-US"/>
-        </w:rPr>
-        <w:t>. Кожна комірка містить дані про місцевість, яку вона обмежує</w:t>
+        <w:t xml:space="preserve"> багатошарову структуру поділену сіткою, яка формує окремі комірки</w:t>
+      </w:r>
+      <w:r>
+        <w:rPr>
+          <w:rFonts w:eastAsiaTheme="minorEastAsia" w:cs="Times New Roman"/>
+          <w:color w:val="000000"/>
+          <w:szCs w:val="24"/>
+          <w:lang w:val="uk-UA" w:eastAsia="en-US"/>
+        </w:rPr>
+        <w:t xml:space="preserve"> (вузли)</w:t>
+      </w:r>
+      <w:r>
+        <w:rPr>
+          <w:rFonts w:eastAsiaTheme="minorEastAsia" w:cs="Times New Roman"/>
+          <w:color w:val="000000"/>
+          <w:szCs w:val="24"/>
+          <w:lang w:val="uk-UA" w:eastAsia="en-US"/>
+        </w:rPr>
+        <w:t>. Кожній</w:t>
+      </w:r>
+      <w:r>
+        <w:rPr>
+          <w:rFonts w:eastAsiaTheme="minorEastAsia" w:cs="Times New Roman"/>
+          <w:color w:val="000000"/>
+          <w:szCs w:val="24"/>
+          <w:lang w:val="uk-UA" w:eastAsia="en-US"/>
+        </w:rPr>
+        <w:t xml:space="preserve"> ком</w:t>
+      </w:r>
+      <w:r>
+        <w:rPr>
+          <w:rFonts w:eastAsiaTheme="minorEastAsia" w:cs="Times New Roman"/>
+          <w:color w:val="000000"/>
+          <w:szCs w:val="24"/>
+          <w:lang w:val="uk-UA" w:eastAsia="en-US"/>
+        </w:rPr>
+        <w:t>ірці відповідає вектор</w:t>
+      </w:r>
+      <w:r>
+        <w:rPr>
+          <w:rFonts w:eastAsiaTheme="minorEastAsia" w:cs="Times New Roman"/>
+          <w:color w:val="000000"/>
+          <w:szCs w:val="24"/>
+          <w:lang w:val="uk-UA" w:eastAsia="en-US"/>
+        </w:rPr>
+        <w:t>, як</w:t>
+      </w:r>
+      <w:r>
+        <w:rPr>
+          <w:rFonts w:eastAsiaTheme="minorEastAsia" w:cs="Times New Roman"/>
+          <w:color w:val="000000"/>
+          <w:szCs w:val="24"/>
+          <w:lang w:val="uk-UA" w:eastAsia="en-US"/>
+        </w:rPr>
+        <w:t>ий описує умови на даній місцевості</w:t>
       </w:r>
       <w:r>
         <w:rPr>
@@ -7923,7 +8192,39 @@
           <w:szCs w:val="24"/>
           <w:lang w:val="uk-UA" w:eastAsia="en-US"/>
         </w:rPr>
-        <w:t>Наступним кроком для вирішення є пошук множини Парето-оптимальних рішень</w:t>
+        <w:t xml:space="preserve">Наступним кроком для вирішення є пошук </w:t>
+      </w:r>
+      <w:r>
+        <w:rPr>
+          <w:rFonts w:eastAsiaTheme="minorEastAsia" w:cs="Times New Roman"/>
+          <w:color w:val="000000"/>
+          <w:szCs w:val="24"/>
+          <w:highlight w:val="yellow"/>
+          <w:lang w:val="uk-UA" w:eastAsia="en-US"/>
+        </w:rPr>
+        <w:t xml:space="preserve">множини </w:t>
+      </w:r>
+      <w:proofErr w:type="spellStart"/>
+      <w:r>
+        <w:rPr>
+          <w:rFonts w:eastAsiaTheme="minorEastAsia" w:cs="Times New Roman"/>
+          <w:color w:val="000000"/>
+          <w:szCs w:val="24"/>
+          <w:highlight w:val="yellow"/>
+          <w:lang w:val="uk-UA" w:eastAsia="en-US"/>
+        </w:rPr>
+        <w:t>Парето</w:t>
+      </w:r>
+      <w:proofErr w:type="spellEnd"/>
+      <w:r>
+        <w:rPr>
+          <w:rFonts w:eastAsiaTheme="minorEastAsia" w:cs="Times New Roman"/>
+          <w:color w:val="000000"/>
+          <w:szCs w:val="24"/>
+          <w:highlight w:val="yellow"/>
+          <w:lang w:val="uk-UA" w:eastAsia="en-US"/>
+        </w:rPr>
+        <w:t>-оптимальних рішень</w:t>
       </w:r>
       <w:r>
         <w:rPr>
@@ -7933,6 +8234,680 @@
           <w:lang w:val="uk-UA" w:eastAsia="en-US"/>
         </w:rPr>
         <w:t xml:space="preserve"> на основі сформованої мапи вартості</w:t>
+      </w:r>
+      <w:r>
+        <w:rPr>
+          <w:rFonts w:eastAsiaTheme="minorEastAsia" w:cs="Times New Roman"/>
+          <w:color w:val="000000"/>
+          <w:szCs w:val="24"/>
+          <w:lang w:val="uk-UA" w:eastAsia="en-US"/>
+        </w:rPr>
+        <w:t>.</w:t>
+      </w:r>
+      <w:r>
+        <w:rPr>
+          <w:rFonts w:eastAsiaTheme="minorEastAsia" w:cs="Times New Roman"/>
+          <w:color w:val="000000"/>
+          <w:szCs w:val="24"/>
+          <w:lang w:val="en-US" w:eastAsia="en-US"/>
+        </w:rPr>
+        <w:t xml:space="preserve"> </w:t>
+      </w:r>
+      <w:r>
+        <w:rPr>
+          <w:rFonts w:eastAsiaTheme="minorEastAsia" w:cs="Times New Roman"/>
+          <w:color w:val="000000"/>
+          <w:szCs w:val="24"/>
+          <w:lang w:val="uk-UA" w:eastAsia="en-US"/>
+        </w:rPr>
+        <w:t>Так як задача має чітк</w:t>
+      </w:r>
+      <w:r>
+        <w:rPr>
+          <w:rFonts w:eastAsiaTheme="minorEastAsia" w:cs="Times New Roman"/>
+          <w:color w:val="000000"/>
+          <w:szCs w:val="24"/>
+          <w:lang w:val="uk-UA" w:eastAsia="en-US"/>
+        </w:rPr>
+        <w:t xml:space="preserve">і критерії для оптимізації та </w:t>
+      </w:r>
+      <w:r>
+        <w:rPr>
+          <w:rFonts w:eastAsiaTheme="minorEastAsia" w:cs="Times New Roman"/>
+          <w:color w:val="000000"/>
+          <w:szCs w:val="24"/>
+          <w:lang w:val="uk-UA" w:eastAsia="en-US"/>
+        </w:rPr>
+        <w:t>визнач</w:t>
+      </w:r>
+      <w:r>
+        <w:rPr>
+          <w:rFonts w:eastAsiaTheme="minorEastAsia" w:cs="Times New Roman"/>
+          <w:color w:val="000000"/>
+          <w:szCs w:val="24"/>
+          <w:lang w:val="uk-UA" w:eastAsia="en-US"/>
+        </w:rPr>
+        <w:t xml:space="preserve">ена в </w:t>
+      </w:r>
+      <w:proofErr w:type="spellStart"/>
+      <w:r>
+        <w:rPr>
+          <w:rFonts w:eastAsiaTheme="minorEastAsia" w:cs="Times New Roman"/>
+          <w:color w:val="000000"/>
+          <w:szCs w:val="24"/>
+          <w:lang w:val="uk-UA" w:eastAsia="en-US"/>
+        </w:rPr>
+        <w:t>дискретизованому</w:t>
+      </w:r>
+      <w:proofErr w:type="spellEnd"/>
+      <w:r>
+        <w:rPr>
+          <w:rFonts w:eastAsiaTheme="minorEastAsia" w:cs="Times New Roman"/>
+          <w:color w:val="000000"/>
+          <w:szCs w:val="24"/>
+          <w:lang w:val="uk-UA" w:eastAsia="en-US"/>
+        </w:rPr>
+        <w:t xml:space="preserve"> просторі, для її рішення недоцільно застосовувати </w:t>
+      </w:r>
+      <w:proofErr w:type="spellStart"/>
+      <w:r>
+        <w:rPr>
+          <w:rFonts w:eastAsiaTheme="minorEastAsia" w:cs="Times New Roman"/>
+          <w:color w:val="000000"/>
+          <w:szCs w:val="24"/>
+          <w:lang w:val="en-US" w:eastAsia="en-US"/>
+        </w:rPr>
+        <w:t>методи</w:t>
+      </w:r>
+      <w:proofErr w:type="spellEnd"/>
+      <w:r>
+        <w:rPr>
+          <w:rFonts w:eastAsiaTheme="minorEastAsia" w:cs="Times New Roman"/>
+          <w:color w:val="000000"/>
+          <w:szCs w:val="24"/>
+          <w:lang w:val="en-US" w:eastAsia="en-US"/>
+        </w:rPr>
+        <w:t xml:space="preserve">, </w:t>
+      </w:r>
+      <w:proofErr w:type="spellStart"/>
+      <w:r>
+        <w:rPr>
+          <w:rFonts w:eastAsiaTheme="minorEastAsia" w:cs="Times New Roman"/>
+          <w:color w:val="000000"/>
+          <w:szCs w:val="24"/>
+          <w:lang w:val="en-US" w:eastAsia="en-US"/>
+        </w:rPr>
+        <w:t>засновані</w:t>
+      </w:r>
+      <w:proofErr w:type="spellEnd"/>
+      <w:r>
+        <w:rPr>
+          <w:rFonts w:eastAsiaTheme="minorEastAsia" w:cs="Times New Roman"/>
+          <w:color w:val="000000"/>
+          <w:szCs w:val="24"/>
+          <w:lang w:val="en-US" w:eastAsia="en-US"/>
+        </w:rPr>
+        <w:t xml:space="preserve"> </w:t>
+      </w:r>
+      <w:proofErr w:type="spellStart"/>
+      <w:r>
+        <w:rPr>
+          <w:rFonts w:eastAsiaTheme="minorEastAsia" w:cs="Times New Roman"/>
+          <w:color w:val="000000"/>
+          <w:szCs w:val="24"/>
+          <w:lang w:val="en-US" w:eastAsia="en-US"/>
+        </w:rPr>
+        <w:t>на</w:t>
+      </w:r>
+      <w:proofErr w:type="spellEnd"/>
+      <w:r>
+        <w:rPr>
+          <w:rFonts w:eastAsiaTheme="minorEastAsia" w:cs="Times New Roman"/>
+          <w:color w:val="000000"/>
+          <w:szCs w:val="24"/>
+          <w:lang w:val="en-US" w:eastAsia="en-US"/>
+        </w:rPr>
+        <w:t xml:space="preserve"> </w:t>
+      </w:r>
+      <w:proofErr w:type="spellStart"/>
+      <w:r>
+        <w:rPr>
+          <w:rFonts w:eastAsiaTheme="minorEastAsia" w:cs="Times New Roman"/>
+          <w:color w:val="000000"/>
+          <w:szCs w:val="24"/>
+          <w:lang w:val="en-US" w:eastAsia="en-US"/>
+        </w:rPr>
+        <w:t>вибірці</w:t>
+      </w:r>
+      <w:proofErr w:type="spellEnd"/>
+      <w:r>
+        <w:rPr>
+          <w:rFonts w:eastAsiaTheme="minorEastAsia" w:cs="Times New Roman"/>
+          <w:color w:val="000000"/>
+          <w:szCs w:val="24"/>
+          <w:lang w:val="en-US" w:eastAsia="en-US"/>
+        </w:rPr>
+        <w:t xml:space="preserve"> (sampling based)</w:t>
+      </w:r>
+      <w:r>
+        <w:rPr>
+          <w:rFonts w:eastAsiaTheme="minorEastAsia" w:cs="Times New Roman"/>
+          <w:color w:val="000000"/>
+          <w:szCs w:val="24"/>
+          <w:lang w:val="uk-UA" w:eastAsia="en-US"/>
+        </w:rPr>
+        <w:t xml:space="preserve"> </w:t>
+      </w:r>
+      <w:r>
+        <w:rPr>
+          <w:rFonts w:eastAsiaTheme="minorEastAsia" w:cs="Times New Roman"/>
+          <w:color w:val="000000"/>
+          <w:szCs w:val="24"/>
+          <w:lang w:val="en-US" w:eastAsia="en-US"/>
+        </w:rPr>
+        <w:t>[</w:t>
+      </w:r>
+      <w:r>
+        <w:rPr>
+          <w:rFonts w:eastAsiaTheme="minorEastAsia" w:cs="Times New Roman"/>
+          <w:color w:val="000000"/>
+          <w:szCs w:val="24"/>
+          <w:lang w:val="uk-UA" w:eastAsia="en-US"/>
+        </w:rPr>
+        <w:t xml:space="preserve">посилання на тези про </w:t>
+      </w:r>
+      <w:r>
+        <w:rPr>
+          <w:rFonts w:eastAsiaTheme="minorEastAsia" w:cs="Times New Roman"/>
+          <w:color w:val="000000"/>
+          <w:szCs w:val="24"/>
+          <w:lang w:val="en-US" w:eastAsia="en-US"/>
+        </w:rPr>
+        <w:t>RRT*]</w:t>
+      </w:r>
+      <w:r>
+        <w:rPr>
+          <w:rFonts w:eastAsiaTheme="minorEastAsia" w:cs="Times New Roman"/>
+          <w:color w:val="000000"/>
+          <w:szCs w:val="24"/>
+          <w:lang w:val="en-US" w:eastAsia="en-US"/>
+        </w:rPr>
+        <w:t xml:space="preserve">. </w:t>
+      </w:r>
+      <w:r>
+        <w:rPr>
+          <w:rFonts w:eastAsiaTheme="minorEastAsia" w:cs="Times New Roman"/>
+          <w:color w:val="000000"/>
+          <w:szCs w:val="24"/>
+          <w:lang w:val="uk-UA" w:eastAsia="en-US"/>
+        </w:rPr>
+        <w:t xml:space="preserve">Дані методи припускають, що простір є безперервним </w:t>
+      </w:r>
+      <w:r>
+        <w:rPr>
+          <w:rFonts w:eastAsiaTheme="minorEastAsia" w:cs="Times New Roman"/>
+          <w:color w:val="000000"/>
+          <w:szCs w:val="24"/>
+          <w:lang w:val="uk-UA" w:eastAsia="en-US"/>
+        </w:rPr>
+        <w:t xml:space="preserve">та виконують пошук наближеного до оптимального рішення. </w:t>
+      </w:r>
+      <w:r>
+        <w:rPr>
+          <w:rFonts w:eastAsiaTheme="minorEastAsia" w:cs="Times New Roman"/>
+          <w:color w:val="000000"/>
+          <w:szCs w:val="24"/>
+          <w:lang w:val="uk-UA" w:eastAsia="en-US"/>
+        </w:rPr>
+        <w:t xml:space="preserve">Крім того, через свою стохастичну природу, кожен пошук даватиме </w:t>
+      </w:r>
+      <w:r>
+        <w:rPr>
+          <w:rFonts w:eastAsiaTheme="minorEastAsia" w:cs="Times New Roman"/>
+          <w:color w:val="000000"/>
+          <w:szCs w:val="24"/>
+          <w:lang w:val="uk-UA" w:eastAsia="en-US"/>
+        </w:rPr>
+        <w:t xml:space="preserve">інше рішення. </w:t>
+      </w:r>
+      <w:r>
+        <w:rPr>
+          <w:rFonts w:eastAsiaTheme="minorEastAsia" w:cs="Times New Roman"/>
+          <w:color w:val="000000"/>
+          <w:szCs w:val="24"/>
+          <w:lang w:val="uk-UA" w:eastAsia="en-US"/>
+        </w:rPr>
+        <w:t xml:space="preserve">Також такі методи непридатні для </w:t>
+      </w:r>
+      <w:r>
+        <w:rPr>
+          <w:rFonts w:eastAsiaTheme="minorEastAsia" w:cs="Times New Roman"/>
+          <w:color w:val="000000"/>
+          <w:szCs w:val="24"/>
+          <w:lang w:val="uk-UA" w:eastAsia="en-US"/>
+        </w:rPr>
+        <w:t>багатоцільової оптимізації.</w:t>
+      </w:r>
+      <w:r>
+        <w:rPr>
+          <w:rFonts w:eastAsiaTheme="minorEastAsia" w:cs="Times New Roman"/>
+          <w:color w:val="000000"/>
+          <w:szCs w:val="24"/>
+          <w:lang w:val="uk-UA" w:eastAsia="en-US"/>
+        </w:rPr>
+        <w:t xml:space="preserve"> Для </w:t>
+      </w:r>
+      <w:r>
+        <w:rPr>
+          <w:rFonts w:eastAsiaTheme="minorEastAsia" w:cs="Times New Roman"/>
+          <w:color w:val="000000"/>
+          <w:szCs w:val="24"/>
+          <w:lang w:val="uk-UA" w:eastAsia="en-US"/>
+        </w:rPr>
+        <w:t>вирішення задачі</w:t>
+      </w:r>
+      <w:bookmarkStart w:id="0" w:name="_GoBack"/>
+      <w:bookmarkEnd w:id="0"/>
+      <w:r>
+        <w:rPr>
+          <w:rFonts w:eastAsiaTheme="minorEastAsia" w:cs="Times New Roman"/>
+          <w:color w:val="000000"/>
+          <w:szCs w:val="24"/>
+          <w:lang w:val="uk-UA" w:eastAsia="en-US"/>
+        </w:rPr>
+        <w:t xml:space="preserve"> доцільно застосувати алгоритм на основі </w:t>
+      </w:r>
+      <w:r>
+        <w:rPr>
+          <w:rFonts w:eastAsiaTheme="minorEastAsia" w:cs="Times New Roman"/>
+          <w:color w:val="000000"/>
+          <w:szCs w:val="24"/>
+          <w:lang w:val="en-US" w:eastAsia="en-US"/>
+        </w:rPr>
+        <w:t>Multi Objective A* (MOA*)</w:t>
+      </w:r>
+      <w:r>
+        <w:rPr>
+          <w:rFonts w:eastAsiaTheme="minorEastAsia" w:cs="Times New Roman"/>
+          <w:color w:val="000000"/>
+          <w:szCs w:val="24"/>
+          <w:lang w:val="en-US" w:eastAsia="en-US"/>
+        </w:rPr>
+        <w:t>.</w:t>
+      </w:r>
+      <w:r>
+        <w:rPr>
+          <w:rFonts w:eastAsiaTheme="minorEastAsia" w:cs="Times New Roman"/>
+          <w:color w:val="000000"/>
+          <w:szCs w:val="24"/>
+          <w:lang w:val="uk-UA" w:eastAsia="en-US"/>
+        </w:rPr>
+        <w:t xml:space="preserve"> </w:t>
+      </w:r>
+      <w:r>
+        <w:rPr>
+          <w:rFonts w:eastAsiaTheme="minorEastAsia" w:cs="Times New Roman"/>
+          <w:color w:val="000000"/>
+          <w:szCs w:val="24"/>
+          <w:lang w:val="uk-UA" w:eastAsia="en-US"/>
+        </w:rPr>
+        <w:t xml:space="preserve">Отримавши множину </w:t>
+      </w:r>
+      <w:proofErr w:type="spellStart"/>
+      <w:r>
+        <w:rPr>
+          <w:rFonts w:eastAsiaTheme="minorEastAsia" w:cs="Times New Roman"/>
+          <w:color w:val="000000"/>
+          <w:szCs w:val="24"/>
+          <w:lang w:val="uk-UA" w:eastAsia="en-US"/>
+        </w:rPr>
+        <w:t>Парето</w:t>
+      </w:r>
+      <w:proofErr w:type="spellEnd"/>
+      <w:r>
+        <w:rPr>
+          <w:rFonts w:eastAsiaTheme="minorEastAsia" w:cs="Times New Roman"/>
+          <w:color w:val="000000"/>
+          <w:szCs w:val="24"/>
+          <w:lang w:val="uk-UA" w:eastAsia="en-US"/>
+        </w:rPr>
+        <w:t>-оптимальних рішень відповідальна особа матиме можливість обрати один із множини маршрутів, виходячи з потреб і контексту виконання завдання</w:t>
+      </w:r>
+      <w:r>
+        <w:rPr>
+          <w:rFonts w:eastAsiaTheme="minorEastAsia" w:cs="Times New Roman"/>
+          <w:color w:val="000000"/>
+          <w:szCs w:val="24"/>
+          <w:lang w:val="uk-UA" w:eastAsia="en-US"/>
+        </w:rPr>
+        <w:t>, зваживши можливі поступки по критеріям</w:t>
+      </w:r>
+      <w:r>
+        <w:rPr>
+          <w:rFonts w:eastAsiaTheme="minorEastAsia" w:cs="Times New Roman"/>
+          <w:color w:val="000000"/>
+          <w:szCs w:val="24"/>
+          <w:lang w:val="uk-UA" w:eastAsia="en-US"/>
+        </w:rPr>
+        <w:t>.</w:t>
+      </w:r>
+      <w:r>
+        <w:rPr>
+          <w:rFonts w:eastAsiaTheme="minorEastAsia" w:cs="Times New Roman"/>
+          <w:color w:val="000000"/>
+          <w:szCs w:val="24"/>
+          <w:lang w:val="uk-UA" w:eastAsia="en-US"/>
+        </w:rPr>
+        <w:t xml:space="preserve"> Існує ймовірність отримання множини з великою кількістю варіантів маршруту</w:t>
+      </w:r>
+      <w:r>
+        <w:rPr>
+          <w:rFonts w:eastAsiaTheme="minorEastAsia" w:cs="Times New Roman"/>
+          <w:color w:val="000000"/>
+          <w:szCs w:val="24"/>
+          <w:lang w:val="uk-UA" w:eastAsia="en-US"/>
+        </w:rPr>
+        <w:t xml:space="preserve">, в такому разі слід визначити допустимі межі відхилень по кожному критерію та відфільтрувати маршрути, які не входять в ці межі. </w:t>
+      </w:r>
+      <w:r>
+        <w:rPr>
+          <w:rFonts w:eastAsiaTheme="minorEastAsia" w:cs="Times New Roman"/>
+          <w:color w:val="000000"/>
+          <w:szCs w:val="24"/>
+          <w:lang w:val="uk-UA" w:eastAsia="en-US"/>
+        </w:rPr>
+        <w:t xml:space="preserve">Для </w:t>
+      </w:r>
+      <w:r>
+        <w:rPr>
+          <w:rFonts w:eastAsiaTheme="minorEastAsia" w:cs="Times New Roman"/>
+          <w:color w:val="000000"/>
+          <w:szCs w:val="24"/>
+          <w:lang w:val="uk-UA" w:eastAsia="en-US"/>
+        </w:rPr>
+        <w:t>мінімізації ризику вибору маршруту з непідходящими</w:t>
+      </w:r>
+      <w:r>
+        <w:rPr>
+          <w:rFonts w:eastAsiaTheme="minorEastAsia" w:cs="Times New Roman"/>
+          <w:color w:val="000000"/>
+          <w:szCs w:val="24"/>
+          <w:lang w:val="uk-UA" w:eastAsia="en-US"/>
+        </w:rPr>
+        <w:t xml:space="preserve"> </w:t>
+      </w:r>
+      <w:r>
+        <w:rPr>
+          <w:rFonts w:eastAsiaTheme="minorEastAsia" w:cs="Times New Roman"/>
+          <w:color w:val="000000"/>
+          <w:szCs w:val="24"/>
+          <w:lang w:val="uk-UA" w:eastAsia="en-US"/>
+        </w:rPr>
+        <w:t>характеристиками</w:t>
+      </w:r>
+      <w:r>
+        <w:rPr>
+          <w:rFonts w:eastAsiaTheme="minorEastAsia" w:cs="Times New Roman"/>
+          <w:color w:val="000000"/>
+          <w:szCs w:val="24"/>
+          <w:lang w:val="uk-UA" w:eastAsia="en-US"/>
+        </w:rPr>
+        <w:t xml:space="preserve"> відповідальною особою</w:t>
+      </w:r>
+      <w:r>
+        <w:rPr>
+          <w:rFonts w:eastAsiaTheme="minorEastAsia" w:cs="Times New Roman"/>
+          <w:color w:val="000000"/>
+          <w:szCs w:val="24"/>
+          <w:lang w:val="uk-UA" w:eastAsia="en-US"/>
+        </w:rPr>
+        <w:t xml:space="preserve"> </w:t>
+      </w:r>
+      <w:r>
+        <w:rPr>
+          <w:rFonts w:eastAsiaTheme="minorEastAsia" w:cs="Times New Roman"/>
+          <w:color w:val="000000"/>
+          <w:szCs w:val="24"/>
+          <w:lang w:val="uk-UA" w:eastAsia="en-US"/>
+        </w:rPr>
+        <w:t>доцільно реалізувати механізм</w:t>
+      </w:r>
+      <w:r>
+        <w:rPr>
+          <w:rFonts w:eastAsiaTheme="minorEastAsia" w:cs="Times New Roman"/>
+          <w:color w:val="000000"/>
+          <w:szCs w:val="24"/>
+          <w:lang w:val="uk-UA" w:eastAsia="en-US"/>
+        </w:rPr>
+        <w:t xml:space="preserve"> підкріплення</w:t>
+      </w:r>
+      <w:r>
+        <w:rPr>
+          <w:rFonts w:eastAsiaTheme="minorEastAsia" w:cs="Times New Roman"/>
+          <w:color w:val="000000"/>
+          <w:szCs w:val="24"/>
+          <w:lang w:val="uk-UA" w:eastAsia="en-US"/>
+        </w:rPr>
+        <w:t xml:space="preserve"> </w:t>
+      </w:r>
+      <w:r>
+        <w:rPr>
+          <w:rFonts w:eastAsiaTheme="minorEastAsia" w:cs="Times New Roman"/>
+          <w:color w:val="000000"/>
+          <w:szCs w:val="24"/>
+          <w:lang w:val="uk-UA" w:eastAsia="en-US"/>
+        </w:rPr>
+        <w:t>прийняття рі</w:t>
+      </w:r>
+      <w:r>
+        <w:rPr>
+          <w:rFonts w:eastAsiaTheme="minorEastAsia" w:cs="Times New Roman"/>
+          <w:color w:val="000000"/>
+          <w:szCs w:val="24"/>
+          <w:lang w:val="uk-UA" w:eastAsia="en-US"/>
+        </w:rPr>
+        <w:t xml:space="preserve">шень, який визначатиме найбільш підходящий маршрут з огляду на умови </w:t>
+      </w:r>
+      <w:r>
+        <w:rPr>
+          <w:rFonts w:eastAsiaTheme="minorEastAsia" w:cs="Times New Roman"/>
+          <w:color w:val="000000"/>
+          <w:szCs w:val="24"/>
+          <w:lang w:val="uk-UA" w:eastAsia="en-US"/>
+        </w:rPr>
+        <w:lastRenderedPageBreak/>
+        <w:t xml:space="preserve">виконання завдання. Це виступатиме як одне з джерел інформації для </w:t>
+      </w:r>
+      <w:r>
+        <w:rPr>
+          <w:rFonts w:eastAsiaTheme="minorEastAsia" w:cs="Times New Roman"/>
+          <w:color w:val="000000"/>
+          <w:szCs w:val="24"/>
+          <w:lang w:val="uk-UA" w:eastAsia="en-US"/>
+        </w:rPr>
+        <w:t xml:space="preserve">остаточного прийняття рішення. </w:t>
+      </w:r>
+      <w:r>
+        <w:rPr>
+          <w:rFonts w:eastAsiaTheme="minorEastAsia" w:cs="Times New Roman"/>
+          <w:color w:val="000000"/>
+          <w:szCs w:val="24"/>
+          <w:lang w:val="uk-UA" w:eastAsia="en-US"/>
+        </w:rPr>
+        <w:t xml:space="preserve"> </w:t>
+      </w:r>
+    </w:p>
+    <w:p>
+      <w:pPr>
+        <w:pStyle w:val="BodyTextIndent"/>
+        <w:ind w:firstLine="567"/>
+        <w:jc w:val="both"/>
+        <w:rPr>
+          <w:rFonts w:eastAsiaTheme="minorEastAsia" w:cs="Times New Roman"/>
+          <w:color w:val="000000"/>
+          <w:szCs w:val="24"/>
+          <w:lang w:val="uk-UA" w:eastAsia="en-US"/>
+        </w:rPr>
+      </w:pPr>
+    </w:p>
+    <w:p>
+      <w:pPr>
+        <w:pStyle w:val="BodyTextIndent"/>
+        <w:ind w:firstLine="567"/>
+        <w:jc w:val="both"/>
+        <w:rPr>
+          <w:rFonts w:eastAsiaTheme="minorEastAsia" w:cs="Times New Roman"/>
+          <w:color w:val="000000"/>
+          <w:szCs w:val="24"/>
+          <w:lang w:val="uk-UA" w:eastAsia="en-US"/>
+        </w:rPr>
+      </w:pPr>
+    </w:p>
+    <w:p>
+      <w:pPr>
+        <w:pStyle w:val="BodyTextIndent"/>
+        <w:ind w:firstLine="567"/>
+        <w:jc w:val="both"/>
+        <w:rPr>
+          <w:rFonts w:eastAsiaTheme="minorEastAsia" w:cs="Times New Roman"/>
+          <w:color w:val="000000"/>
+          <w:szCs w:val="24"/>
+          <w:lang w:val="uk-UA" w:eastAsia="en-US"/>
+        </w:rPr>
+      </w:pPr>
+      <w:r>
+        <w:rPr>
+          <w:rFonts w:eastAsiaTheme="minorEastAsia" w:cs="Times New Roman"/>
+          <w:color w:val="000000"/>
+          <w:szCs w:val="24"/>
+          <w:lang w:val="uk-UA" w:eastAsia="en-US"/>
+        </w:rPr>
+        <w:t xml:space="preserve">Мета: створення </w:t>
+      </w:r>
+      <w:r>
+        <w:rPr>
+          <w:rFonts w:eastAsiaTheme="minorEastAsia" w:cs="Times New Roman"/>
+          <w:color w:val="000000"/>
+          <w:szCs w:val="24"/>
+          <w:lang w:val="uk-UA" w:eastAsia="en-US"/>
+        </w:rPr>
+        <w:t>сприятливого для навігації</w:t>
+      </w:r>
+      <w:r>
+        <w:rPr>
+          <w:rFonts w:eastAsiaTheme="minorEastAsia" w:cs="Times New Roman"/>
+          <w:color w:val="000000"/>
+          <w:szCs w:val="24"/>
+          <w:lang w:val="uk-UA" w:eastAsia="en-US"/>
+        </w:rPr>
+        <w:t xml:space="preserve"> маршруту для оперативного викона</w:t>
+      </w:r>
+      <w:r>
+        <w:rPr>
+          <w:rFonts w:eastAsiaTheme="minorEastAsia" w:cs="Times New Roman"/>
+          <w:color w:val="000000"/>
+          <w:szCs w:val="24"/>
+          <w:lang w:val="uk-UA" w:eastAsia="en-US"/>
+        </w:rPr>
+        <w:t>ння завдання покладеного на БПС.</w:t>
+      </w:r>
+    </w:p>
+    <w:p>
+      <w:pPr>
+        <w:pStyle w:val="BodyTextIndent"/>
+        <w:ind w:firstLine="567"/>
+        <w:jc w:val="both"/>
+        <w:rPr>
+          <w:rFonts w:eastAsiaTheme="minorEastAsia" w:cs="Times New Roman"/>
+          <w:color w:val="000000"/>
+          <w:szCs w:val="24"/>
+          <w:lang w:val="uk-UA" w:eastAsia="en-US"/>
+        </w:rPr>
+      </w:pPr>
+      <w:r>
+        <w:rPr>
+          <w:rFonts w:eastAsiaTheme="minorEastAsia" w:cs="Times New Roman"/>
+          <w:color w:val="000000"/>
+          <w:szCs w:val="24"/>
+          <w:lang w:val="uk-UA" w:eastAsia="en-US"/>
+        </w:rPr>
+        <w:t xml:space="preserve">Задача: оптимізація характеристик (час польоту, </w:t>
+      </w:r>
+      <w:r>
+        <w:rPr>
+          <w:rFonts w:eastAsiaTheme="minorEastAsia" w:cs="Times New Roman"/>
+          <w:color w:val="000000"/>
+          <w:szCs w:val="24"/>
+          <w:lang w:val="uk-UA" w:eastAsia="en-US"/>
+        </w:rPr>
+        <w:t>насиченість візуальними ознаками, погіршення видимості</w:t>
+      </w:r>
+      <w:r>
+        <w:rPr>
+          <w:rFonts w:eastAsiaTheme="minorEastAsia" w:cs="Times New Roman"/>
+          <w:color w:val="000000"/>
+          <w:szCs w:val="24"/>
+          <w:lang w:val="uk-UA" w:eastAsia="en-US"/>
+        </w:rPr>
+        <w:t>) маршруту</w:t>
+      </w:r>
+      <w:r>
+        <w:rPr>
+          <w:rFonts w:eastAsiaTheme="minorEastAsia" w:cs="Times New Roman"/>
+          <w:color w:val="000000"/>
+          <w:szCs w:val="24"/>
+          <w:lang w:val="uk-UA" w:eastAsia="en-US"/>
+        </w:rPr>
+        <w:t xml:space="preserve"> – треба перевірити адекватність, відповідність фізичним процесам.</w:t>
+      </w:r>
+    </w:p>
+    <w:p>
+      <w:pPr>
+        <w:pStyle w:val="BodyTextIndent"/>
+        <w:ind w:firstLine="567"/>
+        <w:jc w:val="both"/>
+        <w:rPr>
+          <w:rFonts w:eastAsiaTheme="minorEastAsia" w:cs="Times New Roman"/>
+          <w:color w:val="000000"/>
+          <w:szCs w:val="24"/>
+          <w:lang w:val="uk-UA" w:eastAsia="en-US"/>
+        </w:rPr>
+      </w:pPr>
+      <w:r>
+        <w:rPr>
+          <w:rFonts w:eastAsiaTheme="minorEastAsia" w:cs="Times New Roman"/>
+          <w:color w:val="000000"/>
+          <w:szCs w:val="24"/>
+          <w:lang w:val="uk-UA" w:eastAsia="en-US"/>
+        </w:rPr>
+        <w:t xml:space="preserve">Методи: МГК, МПП, </w:t>
+      </w:r>
+      <w:r>
+        <w:rPr>
+          <w:rFonts w:eastAsiaTheme="minorEastAsia" w:cs="Times New Roman"/>
+          <w:color w:val="000000"/>
+          <w:szCs w:val="24"/>
+          <w:lang w:val="en-US" w:eastAsia="en-US"/>
+        </w:rPr>
+        <w:t>MOA* -</w:t>
+      </w:r>
+      <w:r>
+        <w:rPr>
+          <w:rFonts w:eastAsiaTheme="minorEastAsia" w:cs="Times New Roman"/>
+          <w:color w:val="000000"/>
+          <w:szCs w:val="24"/>
+          <w:lang w:val="uk-UA" w:eastAsia="en-US"/>
+        </w:rPr>
+        <w:t xml:space="preserve"> треба обрати </w:t>
+      </w:r>
+      <w:r>
+        <w:rPr>
+          <w:rFonts w:eastAsiaTheme="minorEastAsia" w:cs="Times New Roman"/>
+          <w:color w:val="000000"/>
+          <w:szCs w:val="24"/>
+          <w:lang w:val="uk-UA" w:eastAsia="en-US"/>
+        </w:rPr>
+        <w:t>підходящий.</w:t>
       </w:r>
       <w:r>
         <w:rPr>

</xml_diff>

<commit_message>
started to work with satellite image in notebook
</commit_message>
<xml_diff>
--- a/knowledgebase/conference_papers/wip/Тези_Українець_ІТОНТ.docx
+++ b/knowledgebase/conference_papers/wip/Тези_Українець_ІТОНТ.docx
@@ -1585,23 +1585,55 @@
           <w:szCs w:val="24"/>
           <w:lang w:val="uk-UA" w:eastAsia="en-US"/>
         </w:rPr>
-        <w:t>Про місцевість вико</w:t>
-      </w:r>
-      <w:r>
-        <w:rPr>
-          <w:rFonts w:ascii="Times New Roman CYR" w:hAnsi="Times New Roman CYR" w:cs="Times New Roman CYR"/>
-          <w:szCs w:val="24"/>
-          <w:lang w:val="uk-UA" w:eastAsia="en-US"/>
-        </w:rPr>
-        <w:t>нання завдань слід мати наступний набір даних</w:t>
-      </w:r>
-      <w:r>
-        <w:rPr>
-          <w:rFonts w:ascii="Times New Roman CYR" w:hAnsi="Times New Roman CYR" w:cs="Times New Roman CYR"/>
-          <w:szCs w:val="24"/>
-          <w:lang w:val="uk-UA" w:eastAsia="en-US"/>
-        </w:rPr>
-        <w:t xml:space="preserve">: </w:t>
+        <w:t>С</w:t>
+      </w:r>
+      <w:r>
+        <w:rPr>
+          <w:rFonts w:ascii="Times New Roman CYR" w:hAnsi="Times New Roman CYR" w:cs="Times New Roman CYR"/>
+          <w:szCs w:val="24"/>
+          <w:lang w:val="uk-UA" w:eastAsia="en-US"/>
+        </w:rPr>
+        <w:t>лід мати наступний набір даних</w:t>
+      </w:r>
+      <w:r>
+        <w:rPr>
+          <w:rFonts w:ascii="Times New Roman CYR" w:hAnsi="Times New Roman CYR" w:cs="Times New Roman CYR"/>
+          <w:szCs w:val="24"/>
+          <w:lang w:val="uk-UA" w:eastAsia="en-US"/>
+        </w:rPr>
+        <w:t xml:space="preserve"> п</w:t>
+      </w:r>
+      <w:r>
+        <w:rPr>
+          <w:rFonts w:ascii="Times New Roman CYR" w:hAnsi="Times New Roman CYR" w:cs="Times New Roman CYR"/>
+          <w:szCs w:val="24"/>
+          <w:lang w:val="uk-UA" w:eastAsia="en-US"/>
+        </w:rPr>
+        <w:t>ро місцевість</w:t>
+      </w:r>
+      <w:r>
+        <w:rPr>
+          <w:rFonts w:ascii="Times New Roman CYR" w:hAnsi="Times New Roman CYR" w:cs="Times New Roman CYR"/>
+          <w:szCs w:val="24"/>
+          <w:lang w:val="uk-UA" w:eastAsia="en-US"/>
+        </w:rPr>
+        <w:t xml:space="preserve"> для виконання завдань</w:t>
+      </w:r>
+      <w:r>
+        <w:rPr>
+          <w:rFonts w:ascii="Times New Roman CYR" w:hAnsi="Times New Roman CYR" w:cs="Times New Roman CYR"/>
+          <w:szCs w:val="24"/>
+          <w:lang w:val="uk-UA" w:eastAsia="en-US"/>
+        </w:rPr>
+        <w:t>:</w:t>
+      </w:r>
+      <w:r>
+        <w:rPr>
+          <w:rFonts w:ascii="Times New Roman CYR" w:hAnsi="Times New Roman CYR" w:cs="Times New Roman CYR"/>
+          <w:szCs w:val="24"/>
+          <w:lang w:val="uk-UA" w:eastAsia="en-US"/>
+        </w:rPr>
+        <w:t xml:space="preserve"> </w:t>
       </w:r>
       <w:proofErr w:type="spellStart"/>
       <w:r>
@@ -8506,8 +8538,6 @@
         </w:rPr>
         <w:t>вирішення задачі</w:t>
       </w:r>
-      <w:bookmarkStart w:id="0" w:name="_GoBack"/>
-      <w:bookmarkEnd w:id="0"/>
       <w:r>
         <w:rPr>
           <w:rFonts w:eastAsiaTheme="minorEastAsia" w:cs="Times New Roman"/>
@@ -8643,16 +8673,7 @@
           <w:szCs w:val="24"/>
           <w:lang w:val="uk-UA" w:eastAsia="en-US"/>
         </w:rPr>
-        <w:t>характеристиками</w:t>
-      </w:r>
-      <w:r>
-        <w:rPr>
-          <w:rFonts w:eastAsiaTheme="minorEastAsia" w:cs="Times New Roman"/>
-          <w:color w:val="000000"/>
-          <w:szCs w:val="24"/>
-          <w:lang w:val="uk-UA" w:eastAsia="en-US"/>
-        </w:rPr>
-        <w:t xml:space="preserve"> відповідальною особою</w:t>
+        <w:t>характеристиками відповідальною особою</w:t>
       </w:r>
       <w:r>
         <w:rPr>
@@ -8762,195 +8783,8 @@
           <w:lang w:val="uk-UA" w:eastAsia="en-US"/>
         </w:rPr>
       </w:pPr>
-    </w:p>
-    <w:p>
-      <w:pPr>
-        <w:pStyle w:val="BodyTextIndent"/>
-        <w:ind w:firstLine="567"/>
-        <w:jc w:val="both"/>
-        <w:rPr>
-          <w:rFonts w:eastAsiaTheme="minorEastAsia" w:cs="Times New Roman"/>
-          <w:color w:val="000000"/>
-          <w:szCs w:val="24"/>
-          <w:lang w:val="uk-UA" w:eastAsia="en-US"/>
-        </w:rPr>
-      </w:pPr>
-      <w:r>
-        <w:rPr>
-          <w:rFonts w:eastAsiaTheme="minorEastAsia" w:cs="Times New Roman"/>
-          <w:color w:val="000000"/>
-          <w:szCs w:val="24"/>
-          <w:lang w:val="uk-UA" w:eastAsia="en-US"/>
-        </w:rPr>
-        <w:t xml:space="preserve">Мета: створення </w:t>
-      </w:r>
-      <w:r>
-        <w:rPr>
-          <w:rFonts w:eastAsiaTheme="minorEastAsia" w:cs="Times New Roman"/>
-          <w:color w:val="000000"/>
-          <w:szCs w:val="24"/>
-          <w:lang w:val="uk-UA" w:eastAsia="en-US"/>
-        </w:rPr>
-        <w:t>сприятливого для навігації</w:t>
-      </w:r>
-      <w:r>
-        <w:rPr>
-          <w:rFonts w:eastAsiaTheme="minorEastAsia" w:cs="Times New Roman"/>
-          <w:color w:val="000000"/>
-          <w:szCs w:val="24"/>
-          <w:lang w:val="uk-UA" w:eastAsia="en-US"/>
-        </w:rPr>
-        <w:t xml:space="preserve"> маршруту для оперативного викона</w:t>
-      </w:r>
-      <w:r>
-        <w:rPr>
-          <w:rFonts w:eastAsiaTheme="minorEastAsia" w:cs="Times New Roman"/>
-          <w:color w:val="000000"/>
-          <w:szCs w:val="24"/>
-          <w:lang w:val="uk-UA" w:eastAsia="en-US"/>
-        </w:rPr>
-        <w:t>ння завдання покладеного на БПС.</w:t>
-      </w:r>
-    </w:p>
-    <w:p>
-      <w:pPr>
-        <w:pStyle w:val="BodyTextIndent"/>
-        <w:ind w:firstLine="567"/>
-        <w:jc w:val="both"/>
-        <w:rPr>
-          <w:rFonts w:eastAsiaTheme="minorEastAsia" w:cs="Times New Roman"/>
-          <w:color w:val="000000"/>
-          <w:szCs w:val="24"/>
-          <w:lang w:val="uk-UA" w:eastAsia="en-US"/>
-        </w:rPr>
-      </w:pPr>
-      <w:r>
-        <w:rPr>
-          <w:rFonts w:eastAsiaTheme="minorEastAsia" w:cs="Times New Roman"/>
-          <w:color w:val="000000"/>
-          <w:szCs w:val="24"/>
-          <w:lang w:val="uk-UA" w:eastAsia="en-US"/>
-        </w:rPr>
-        <w:t xml:space="preserve">Задача: оптимізація характеристик (час польоту, </w:t>
-      </w:r>
-      <w:r>
-        <w:rPr>
-          <w:rFonts w:eastAsiaTheme="minorEastAsia" w:cs="Times New Roman"/>
-          <w:color w:val="000000"/>
-          <w:szCs w:val="24"/>
-          <w:lang w:val="uk-UA" w:eastAsia="en-US"/>
-        </w:rPr>
-        <w:t>насиченість візуальними ознаками, погіршення видимості</w:t>
-      </w:r>
-      <w:r>
-        <w:rPr>
-          <w:rFonts w:eastAsiaTheme="minorEastAsia" w:cs="Times New Roman"/>
-          <w:color w:val="000000"/>
-          <w:szCs w:val="24"/>
-          <w:lang w:val="uk-UA" w:eastAsia="en-US"/>
-        </w:rPr>
-        <w:t>) маршруту</w:t>
-      </w:r>
-      <w:r>
-        <w:rPr>
-          <w:rFonts w:eastAsiaTheme="minorEastAsia" w:cs="Times New Roman"/>
-          <w:color w:val="000000"/>
-          <w:szCs w:val="24"/>
-          <w:lang w:val="uk-UA" w:eastAsia="en-US"/>
-        </w:rPr>
-        <w:t xml:space="preserve"> – треба перевірити адекватність, відповідність фізичним процесам.</w:t>
-      </w:r>
-    </w:p>
-    <w:p>
-      <w:pPr>
-        <w:pStyle w:val="BodyTextIndent"/>
-        <w:ind w:firstLine="567"/>
-        <w:jc w:val="both"/>
-        <w:rPr>
-          <w:rFonts w:eastAsiaTheme="minorEastAsia" w:cs="Times New Roman"/>
-          <w:color w:val="000000"/>
-          <w:szCs w:val="24"/>
-          <w:lang w:val="uk-UA" w:eastAsia="en-US"/>
-        </w:rPr>
-      </w:pPr>
-      <w:r>
-        <w:rPr>
-          <w:rFonts w:eastAsiaTheme="minorEastAsia" w:cs="Times New Roman"/>
-          <w:color w:val="000000"/>
-          <w:szCs w:val="24"/>
-          <w:lang w:val="uk-UA" w:eastAsia="en-US"/>
-        </w:rPr>
-        <w:t xml:space="preserve">Методи: МГК, МПП, </w:t>
-      </w:r>
-      <w:r>
-        <w:rPr>
-          <w:rFonts w:eastAsiaTheme="minorEastAsia" w:cs="Times New Roman"/>
-          <w:color w:val="000000"/>
-          <w:szCs w:val="24"/>
-          <w:lang w:val="en-US" w:eastAsia="en-US"/>
-        </w:rPr>
-        <w:t>MOA* -</w:t>
-      </w:r>
-      <w:r>
-        <w:rPr>
-          <w:rFonts w:eastAsiaTheme="minorEastAsia" w:cs="Times New Roman"/>
-          <w:color w:val="000000"/>
-          <w:szCs w:val="24"/>
-          <w:lang w:val="uk-UA" w:eastAsia="en-US"/>
-        </w:rPr>
-        <w:t xml:space="preserve"> треба обрати </w:t>
-      </w:r>
-      <w:r>
-        <w:rPr>
-          <w:rFonts w:eastAsiaTheme="minorEastAsia" w:cs="Times New Roman"/>
-          <w:color w:val="000000"/>
-          <w:szCs w:val="24"/>
-          <w:lang w:val="uk-UA" w:eastAsia="en-US"/>
-        </w:rPr>
-        <w:t>підходящий.</w:t>
-      </w:r>
-      <w:r>
-        <w:rPr>
-          <w:rFonts w:eastAsiaTheme="minorEastAsia" w:cs="Times New Roman"/>
-          <w:color w:val="000000"/>
-          <w:szCs w:val="24"/>
-          <w:lang w:val="uk-UA" w:eastAsia="en-US"/>
-        </w:rPr>
-        <w:t xml:space="preserve"> </w:t>
-      </w:r>
-    </w:p>
-    <w:p>
-      <w:pPr>
-        <w:pStyle w:val="BodyTextIndent"/>
-        <w:ind w:firstLine="567"/>
-        <w:jc w:val="both"/>
-        <w:rPr>
-          <w:rFonts w:ascii="Times New Roman CYR" w:hAnsi="Times New Roman CYR" w:cs="Times New Roman CYR"/>
-          <w:color w:val="000000"/>
-          <w:szCs w:val="24"/>
-          <w:lang w:val="en-US" w:eastAsia="en-US"/>
-        </w:rPr>
-      </w:pPr>
-      <w:r>
-        <w:rPr>
-          <w:rFonts w:ascii="Times New Roman CYR" w:hAnsi="Times New Roman CYR" w:cs="Times New Roman CYR"/>
-          <w:b/>
-          <w:bCs/>
-          <w:color w:val="000000"/>
-          <w:szCs w:val="24"/>
-          <w:lang w:val="uk-UA" w:eastAsia="en-US"/>
-        </w:rPr>
-        <w:t>Висновок</w:t>
-      </w:r>
-      <w:r>
-        <w:rPr>
-          <w:rFonts w:ascii="Times New Roman CYR" w:hAnsi="Times New Roman CYR" w:cs="Times New Roman CYR"/>
-          <w:color w:val="000000"/>
-          <w:szCs w:val="24"/>
-          <w:lang w:val="uk-UA" w:eastAsia="en-US"/>
-        </w:rPr>
-        <w:t xml:space="preserve">. </w:t>
-      </w:r>
+      <w:bookmarkStart w:id="0" w:name="_GoBack"/>
+      <w:bookmarkEnd w:id="0"/>
     </w:p>
     <w:p>
       <w:pPr>

</xml_diff>